<commit_message>
Added all TSPlib examples to library
</commit_message>
<xml_diff>
--- a/docs/report/Travel Salesman with Genetic Algorithms, using CUDA optimizations.docx
+++ b/docs/report/Travel Salesman with Genetic Algorithms, using CUDA optimizations.docx
@@ -343,15 +343,7 @@
       </w:r>
       <w:r>
         <w:tab/>
-        <w:t xml:space="preserve">Experimental results and analysis: Each figure should be self-explanatory with </w:t>
-      </w:r>
-      <w:proofErr w:type="spellStart"/>
-      <w:r>
-        <w:t>x,y</w:t>
-      </w:r>
-      <w:proofErr w:type="spellEnd"/>
-      <w:r>
-        <w:t xml:space="preserve"> coordinates, metrics, parameters, variables, constraints. Each figure, table, chart should be followed by analysis and significance of the results.  Just showing some charts and reciting numbers does not provide any insights on what you have learned from these results. Provide an in</w:t>
+        <w:t>Experimental results and analysis: Each figure should be self-explanatory with x,y coordinates, metrics, parameters, variables, constraints. Each figure, table, chart should be followed by analysis and significance of the results.  Just showing some charts and reciting numbers does not provide any insights on what you have learned from these results. Provide an in</w:t>
       </w:r>
       <w:r>
         <w:t xml:space="preserve"> </w:t>
@@ -425,369 +417,94 @@
     </w:p>
     <w:p>
       <w:pPr>
-        <w:pStyle w:val="Text"/>
-      </w:pPr>
-      <w:r>
-        <w:t xml:space="preserve">When you open </w:t>
-      </w:r>
-      <w:r>
-        <w:t>trans_jour.docx</w:t>
-      </w:r>
-      <w:r>
-        <w:t xml:space="preserve">, select “Page Layout” from the “View” menu in the menu bar (View | Page Layout), </w:t>
-      </w:r>
-      <w:r>
-        <w:t>(these instructions assume MS 6.0. Some versions may have alternate ways to access the same functionalities noted here)</w:t>
-      </w:r>
-      <w:r>
-        <w:t xml:space="preserve">. </w:t>
-      </w:r>
-      <w:r>
-        <w:t xml:space="preserve">Then, type over sections of </w:t>
-      </w:r>
-      <w:r>
-        <w:t>trans_jour.docx</w:t>
-      </w:r>
-      <w:r>
-        <w:t xml:space="preserve"> or cut and paste from another document and use markup styles. The pull-down style menu is at the left of the Formatting Toolbar at the top of your </w:t>
-      </w:r>
-      <w:r>
-        <w:rPr>
-          <w:i/>
-          <w:iCs/>
-        </w:rPr>
-        <w:t>Word</w:t>
-      </w:r>
-      <w:r>
-        <w:t xml:space="preserve"> window (for example, the style at this point in the document is “Text”). Highlight a section that you want to designate with a certain style, </w:t>
-      </w:r>
-      <w:r>
-        <w:t>and then</w:t>
-      </w:r>
-      <w:r>
-        <w:t xml:space="preserve"> select the appropriate name on the style menu. The style will adjust your fonts and line spacing. </w:t>
-      </w:r>
-      <w:r>
-        <w:rPr>
-          <w:bCs/>
-        </w:rPr>
-        <w:t>Do not change the font sizes or line spacing to squeeze more text into a limited number of pages.</w:t>
-      </w:r>
-      <w:r>
-        <w:rPr>
-          <w:b/>
-          <w:bCs/>
-        </w:rPr>
-        <w:t xml:space="preserve"> </w:t>
-      </w:r>
-      <w:r>
-        <w:t xml:space="preserve">Use italics for emphasis; do not underline. </w:t>
-      </w:r>
-    </w:p>
-    <w:p>
-      <w:pPr>
-        <w:pStyle w:val="Text"/>
-      </w:pPr>
-      <w:r>
-        <w:t xml:space="preserve">To insert images in </w:t>
-      </w:r>
-      <w:r>
-        <w:rPr>
-          <w:i/>
-          <w:iCs/>
-        </w:rPr>
-        <w:t>Word,</w:t>
-      </w:r>
-      <w:r>
-        <w:t xml:space="preserve"> position the cursor at the insertion point and either use Insert | Picture | From File or copy the image to the Windows clipboard and then Edit | Paste Special | Picture (with “float over text” unchecked). </w:t>
-      </w:r>
-    </w:p>
-    <w:p>
-      <w:pPr>
-        <w:pStyle w:val="Text"/>
-      </w:pPr>
-      <w:r>
-        <w:t xml:space="preserve">IEEE will do the final formatting of your paper. If your paper is intended for a conference, please observe the conference page limits. </w:t>
-      </w:r>
-    </w:p>
-    <w:p>
-      <w:pPr>
         <w:pStyle w:val="Heading2"/>
-      </w:pPr>
+        <w:numPr>
+          <w:ilvl w:val="0"/>
+          <w:numId w:val="0"/>
+        </w:numPr>
+        <w:rPr>
+          <w:i w:val="0"/>
+          <w:iCs w:val="0"/>
+        </w:rPr>
+      </w:pPr>
+      <w:r>
+        <w:rPr>
+          <w:i w:val="0"/>
+          <w:iCs w:val="0"/>
+        </w:rPr>
+        <w:t>Recent work on GPU-accelerated solutions for the Traveling Salesman Problem shows that parallelism can significantly reduce execution time when the algorithm exposes many independent operations. Chen et al. implemented a CUDA-based genetic algorithm in which chromosomes were mapped to GPU threads, allowing initialization, mutation, selection, and portions of crossover to be performed in parallel [1]. Their work found that even a genetic algorithm with frequent interactions between individuals could benefit from CUDA execution, although the speedup was limited because their implementation used only one CUDA block, which prevented full utilization of the GPU. BinJubier et al. extended this direction with a coarse-grained parallel genetic algorithm, dividing the population into subpopulations processed concurrently on the GPU [2]. Their results on TSPLIB instances showed substantial runtime improvements over a sequential genetic algorithm, with speedups reaching approximately 75.81x depending on the dataset, population size, and hardware configuration.</w:t>
+      </w:r>
+    </w:p>
+    <w:p>
+      <w:pPr>
+        <w:pStyle w:val="Heading2"/>
+        <w:numPr>
+          <w:ilvl w:val="0"/>
+          <w:numId w:val="0"/>
+        </w:numPr>
+        <w:rPr>
+          <w:i w:val="0"/>
+          <w:iCs w:val="0"/>
+        </w:rPr>
+      </w:pPr>
+    </w:p>
+    <w:p>
+      <w:pPr>
+        <w:pStyle w:val="Heading2"/>
+        <w:numPr>
+          <w:ilvl w:val="0"/>
+          <w:numId w:val="0"/>
+        </w:numPr>
+        <w:rPr>
+          <w:i w:val="0"/>
+          <w:iCs w:val="0"/>
+        </w:rPr>
+      </w:pPr>
+      <w:r>
+        <w:rPr>
+          <w:i w:val="0"/>
+          <w:iCs w:val="0"/>
+        </w:rPr>
+        <w:t>The main optimization strategies across the genetic algorithm papers are population-level parallelism, careful management of genetic operators, and GPU-aware memory decisions. Chen et al. used per-thread random seeds, avoided storing a large distance table by computing Euclidean distances from coordinates, and used 2-opt as a mutation operator to improve convergence [1]. BinJubier et al. focused on a coarse-grained design with parallel fitness evaluation, reduction-based best-solution selection, and CUDA block-size tuning, showing that GPU configuration can strongly affect runtime [2]. Together, these papers suggest that a GPU implementation should not simply port CPU code directly, but should restructure the algorithm around independent work units such as chromosomes, fitness calculations, and candidate tour modifications.</w:t>
+      </w:r>
+    </w:p>
+    <w:p>
+      <w:pPr>
+        <w:pStyle w:val="Heading2"/>
+        <w:numPr>
+          <w:ilvl w:val="0"/>
+          <w:numId w:val="0"/>
+        </w:numPr>
+        <w:rPr>
+          <w:i w:val="0"/>
+          <w:iCs w:val="0"/>
+        </w:rPr>
+      </w:pPr>
+    </w:p>
+    <w:p>
+      <w:pPr>
+        <w:pStyle w:val="Heading2"/>
+        <w:numPr>
+          <w:ilvl w:val="0"/>
+          <w:numId w:val="0"/>
+        </w:numPr>
+      </w:pPr>
+      <w:r>
+        <w:rPr>
+          <w:i w:val="0"/>
+          <w:iCs w:val="0"/>
+        </w:rPr>
+        <w:t xml:space="preserve">A complementary line of work focuses on GPU acceleration of local-search refinement rather than genetic algorithms. Qiao et al. presented scalable GPU implementations of complete 4-opt, 5-opt, 6-opt, and hybrid variable λ-opt search across one or more GPUs [3]. Their approach assigns independent k-opt edge-combination checks to CUDA threads and supports multiple non-interacting tour improvements within a single iteration. The reported results show very large acceleration over serial local search, including complete 4-opt search on mu1979.tsp running in 135.1 seconds on one GPU compared with more than 48 hours serially [3]. This demonstrates that higher-order local search becomes practical only when its large number of independent candidate moves can be </w:t>
+      </w:r>
+      <w:r>
+        <w:rPr>
+          <w:i w:val="0"/>
+          <w:iCs w:val="0"/>
+        </w:rPr>
+        <w:t>evaluated in parallel, making it especially relevant for GPU-based TSP optimization.</w:t>
+      </w:r>
       <w:r>
         <w:t>Abbreviations and Acronyms</w:t>
-      </w:r>
-    </w:p>
-    <w:p>
-      <w:pPr>
-        <w:pStyle w:val="Text"/>
-        <w:ind w:firstLine="144"/>
-      </w:pPr>
-      <w:r>
-        <w:t>Define abbreviations and acronyms the first time they are used in the text, even after they have already been defined in the abstract. Abbreviations such as IEEE, SI, ac, and dc do not have to be defined. Abbreviations that incorporate periods should not have spaces: write “C.N.R.S.,” not “C. N. R. S.” Do not use abbreviations in the title unless they are unavoidable (for example, “IEEE” in the title of this article).</w:t>
-      </w:r>
-    </w:p>
-    <w:p>
-      <w:pPr>
-        <w:pStyle w:val="Text"/>
-      </w:pPr>
-    </w:p>
-    <w:p>
-      <w:pPr>
-        <w:pStyle w:val="Heading2"/>
-      </w:pPr>
-      <w:r>
-        <w:t>Other Recommendations</w:t>
-      </w:r>
-    </w:p>
-    <w:p>
-      <w:pPr>
-        <w:pStyle w:val="Text"/>
-      </w:pPr>
-      <w:r>
-        <w:t>Use one space after periods and colons. Hyphenate complex modifiers: “zero-field-cooled magnetization.” Avoid dangling participles, such as, “Using (1), the potential was calculated.” [It is not clear who or what used (1).] Write instead, “The potential was calculated by using (1),” or “Using (1), we calculated the potential.”</w:t>
-      </w:r>
-    </w:p>
-    <w:p>
-      <w:pPr>
-        <w:pStyle w:val="Text"/>
-      </w:pPr>
-      <w:r>
-        <w:t>Use a zero before decimal points: “0.25,” not “.25.” Use “cm</w:t>
-      </w:r>
-      <w:r>
-        <w:rPr>
-          <w:vertAlign w:val="superscript"/>
-        </w:rPr>
-        <w:t>3</w:t>
-      </w:r>
-      <w:r>
-        <w:t xml:space="preserve">,” not “cc.” Indicate sample dimensions as “0.1 cm </w:t>
-      </w:r>
-      <w:r>
-        <w:sym w:font="Symbol" w:char="F0B4"/>
-      </w:r>
-      <w:r>
-        <w:t xml:space="preserve"> 0.2 cm,” not “0.1 </w:t>
-      </w:r>
-      <w:r>
-        <w:sym w:font="Symbol" w:char="F0B4"/>
-      </w:r>
-      <w:r>
-        <w:t xml:space="preserve"> 0.2 cm</w:t>
-      </w:r>
-      <w:r>
-        <w:rPr>
-          <w:vertAlign w:val="superscript"/>
-        </w:rPr>
-        <w:t>2</w:t>
-      </w:r>
-      <w:r>
-        <w:t xml:space="preserve">.” The abbreviation for “seconds” is “s,” not “sec.” </w:t>
-      </w:r>
-      <w:r>
-        <w:t xml:space="preserve">Use </w:t>
-      </w:r>
-      <w:r>
-        <w:t>“Wb/m</w:t>
-      </w:r>
-      <w:r>
-        <w:rPr>
-          <w:vertAlign w:val="superscript"/>
-        </w:rPr>
-        <w:t>2</w:t>
-      </w:r>
-      <w:r>
-        <w:t>” or “</w:t>
-      </w:r>
-      <w:proofErr w:type="spellStart"/>
-      <w:r>
-        <w:t>webers</w:t>
-      </w:r>
-      <w:proofErr w:type="spellEnd"/>
-      <w:r>
-        <w:t xml:space="preserve"> per square meter,” not “</w:t>
-      </w:r>
-      <w:proofErr w:type="spellStart"/>
-      <w:r>
-        <w:t>webers</w:t>
-      </w:r>
-      <w:proofErr w:type="spellEnd"/>
-      <w:r>
-        <w:t>/m</w:t>
-      </w:r>
-      <w:r>
-        <w:rPr>
-          <w:vertAlign w:val="superscript"/>
-        </w:rPr>
-        <w:t>2</w:t>
-      </w:r>
-      <w:r>
-        <w:t>.” When expressing a range of values, write “7 to 9” or “7-9,” not “7~9.”</w:t>
-      </w:r>
-    </w:p>
-    <w:p>
-      <w:pPr>
-        <w:pStyle w:val="Text"/>
-      </w:pPr>
-      <w:r>
-        <w:t>A parenthetical statement at the end of a sentence is punctuated outside of the closing parenthesis (like this). (A parenthetical sentence is punctuated within the parentheses.) In American English, periods and commas are within quotation marks, like “this period.” Other punctuation is “outside”! Avoid contractions; for example, write “do not” instead of “don’t.” The serial comma is preferred: “A, B, and C” instead of “A, B and C.”</w:t>
-      </w:r>
-    </w:p>
-    <w:p>
-      <w:pPr>
-        <w:pStyle w:val="Text"/>
-      </w:pPr>
-      <w:r>
-        <w:t xml:space="preserve">If you wish, you may write in the first person singular or plural and use the active voice (“I observed that ...” or “We observed that ...” instead of “It was observed that ...”). </w:t>
-      </w:r>
-      <w:r>
-        <w:t>Remember to check spelling. If your native language is not English, please get a native English-speaking colleague to carefully proofread your paper.</w:t>
-      </w:r>
-    </w:p>
-    <w:p>
-      <w:pPr>
-        <w:pStyle w:val="Heading1"/>
-      </w:pPr>
-      <w:r>
-        <w:t>Methodology</w:t>
-      </w:r>
-    </w:p>
-    <w:p>
-      <w:pPr>
-        <w:pStyle w:val="Text"/>
-      </w:pPr>
-      <w:r>
-        <w:t xml:space="preserve">If you are using </w:t>
-      </w:r>
-      <w:r>
-        <w:rPr>
-          <w:i/>
-          <w:iCs/>
-        </w:rPr>
-        <w:t>Word,</w:t>
-      </w:r>
-      <w:r>
-        <w:t xml:space="preserve"> use either the Microsoft Equation Editor or the </w:t>
-      </w:r>
-      <w:proofErr w:type="spellStart"/>
-      <w:r>
-        <w:rPr>
-          <w:i/>
-          <w:iCs/>
-        </w:rPr>
-        <w:t>MathType</w:t>
-      </w:r>
-      <w:proofErr w:type="spellEnd"/>
-      <w:r>
-        <w:t xml:space="preserve"> add-on (http://www.mathtype.com) for equations in your paper (Insert | Object | Create New | Microsoft Equation </w:t>
-      </w:r>
-      <w:r>
-        <w:rPr>
-          <w:i/>
-          <w:iCs/>
-        </w:rPr>
-        <w:t>or</w:t>
-      </w:r>
-      <w:r>
-        <w:t xml:space="preserve"> </w:t>
-      </w:r>
-      <w:proofErr w:type="spellStart"/>
-      <w:r>
-        <w:t>MathType</w:t>
-      </w:r>
-      <w:proofErr w:type="spellEnd"/>
-      <w:r>
-        <w:t xml:space="preserve"> Equation). “Float over text” should </w:t>
-      </w:r>
-      <w:r>
-        <w:rPr>
-          <w:i/>
-          <w:iCs/>
-        </w:rPr>
-        <w:t>not</w:t>
-      </w:r>
-      <w:r>
-        <w:t xml:space="preserve"> be selected. </w:t>
-      </w:r>
-    </w:p>
-    <w:p>
-      <w:pPr>
-        <w:pStyle w:val="Heading2"/>
-      </w:pPr>
-      <w:r>
-        <w:t>Equations</w:t>
-      </w:r>
-    </w:p>
-    <w:p>
-      <w:pPr>
-        <w:pStyle w:val="Text"/>
-      </w:pPr>
-      <w:r>
-        <w:t>Number equations consecutively with equation numbers in parentheses flush with the right margin, as in (1). First use the equation editor to create the equation. Then select the “Equation” markup style. Press the tab key and write the equation number in parentheses. To make your equations more compact, you may use the solidus ( / ), the exp function, or appropriate exponents. Use parentheses to avoid ambiguities in denominators. Punctuate equations when they are part of a sentence, as in</w:t>
-      </w:r>
-    </w:p>
-    <w:p>
-      <w:pPr>
-        <w:pStyle w:val="Text"/>
-      </w:pPr>
-    </w:p>
-    <w:p>
-      <w:pPr>
-        <w:pStyle w:val="Equation"/>
-      </w:pPr>
-      <w:r>
-        <w:rPr>
-          <w:position w:val="-50"/>
-        </w:rPr>
-        <w:object w:dxaOrig="4940" w:dyaOrig="1120" w14:anchorId="06FD0DB9">
-          <v:shapetype id="_x0000_t75" coordsize="21600,21600" o:spt="75" o:preferrelative="t" path="m@4@5l@4@11@9@11@9@5xe" filled="f" stroked="f">
-            <v:stroke joinstyle="miter"/>
-            <v:formulas>
-              <v:f eqn="if lineDrawn pixelLineWidth 0"/>
-              <v:f eqn="sum @0 1 0"/>
-              <v:f eqn="sum 0 0 @1"/>
-              <v:f eqn="prod @2 1 2"/>
-              <v:f eqn="prod @3 21600 pixelWidth"/>
-              <v:f eqn="prod @3 21600 pixelHeight"/>
-              <v:f eqn="sum @0 0 1"/>
-              <v:f eqn="prod @6 1 2"/>
-              <v:f eqn="prod @7 21600 pixelWidth"/>
-              <v:f eqn="sum @8 21600 0"/>
-              <v:f eqn="prod @7 21600 pixelHeight"/>
-              <v:f eqn="sum @10 21600 0"/>
-            </v:formulas>
-            <v:path o:extrusionok="f" gradientshapeok="t" o:connecttype="rect"/>
-            <o:lock v:ext="edit" aspectratio="t"/>
-          </v:shapetype>
-          <v:shape id="_x0000_i1025" type="#_x0000_t75" style="width:225.75pt;height:45.75pt" o:ole="" fillcolor="window">
-            <v:imagedata r:id="rId9" o:title=""/>
-          </v:shape>
-          <o:OLEObject Type="Embed" ProgID="Equation.3" ShapeID="_x0000_i1025" DrawAspect="Content" ObjectID="_1839071957" r:id="rId10"/>
-        </w:object>
-      </w:r>
-      <w:r>
-        <w:tab/>
-        <w:t>(1)</w:t>
-      </w:r>
-    </w:p>
-    <w:p/>
-    <w:p>
-      <w:pPr>
-        <w:pStyle w:val="Text"/>
-      </w:pPr>
-      <w:r>
-        <w:t>Be sure that the symbols in your equation have been defined before the equation appears or immediately following. Italicize symbols (</w:t>
-      </w:r>
-      <w:r>
-        <w:rPr>
-          <w:i/>
-          <w:iCs/>
-        </w:rPr>
-        <w:t>T</w:t>
-      </w:r>
-      <w:r>
-        <w:t xml:space="preserve"> might refer to temperature, but T is the unit tesla). Refer to “(1),” not “Eq. (1)” or “equation (1),” except at the beginning of a sentence: “Equation (1) is ... .”</w:t>
       </w:r>
     </w:p>
     <w:p>
@@ -977,15 +694,7 @@
           </w:tcPr>
           <w:p>
             <w:r>
-              <w:t xml:space="preserve">University of Arizona </w:t>
-            </w:r>
-            <w:proofErr w:type="spellStart"/>
-            <w:r>
-              <w:t>Ocelote</w:t>
-            </w:r>
-            <w:proofErr w:type="spellEnd"/>
-            <w:r>
-              <w:t xml:space="preserve"> HPC cluster</w:t>
+              <w:t>University of Arizona Ocelote HPC cluster</w:t>
             </w:r>
           </w:p>
         </w:tc>
@@ -1179,13 +888,8 @@
             <w:hideMark/>
           </w:tcPr>
           <w:p>
-            <w:proofErr w:type="spellStart"/>
             <w:r>
-              <w:t>CMake</w:t>
-            </w:r>
-            <w:proofErr w:type="spellEnd"/>
-            <w:r>
-              <w:t xml:space="preserve"> 3.28.3</w:t>
+              <w:t>CMake 3.28.3</w:t>
             </w:r>
           </w:p>
         </w:tc>
@@ -1433,19 +1137,7 @@
         <w:t>2</w:t>
       </w:r>
       <w:r>
-        <w:t xml:space="preserve">).” An exception is when English units are used as identifiers in trade, such as “3½-in disk drive.” Avoid combining SI and CGS units, such as current in amperes and magnetic field in </w:t>
-      </w:r>
-      <w:proofErr w:type="spellStart"/>
-      <w:r>
-        <w:t>oersteds</w:t>
-      </w:r>
-      <w:proofErr w:type="spellEnd"/>
-      <w:r>
-        <w:t xml:space="preserve">. This often </w:t>
-      </w:r>
-      <w:r>
-        <w:lastRenderedPageBreak/>
-        <w:t>leads to confusion because equations do not balance dimensionally. If you must use mixed units, clearly state the units for each quantity in an equation.</w:t>
+        <w:t>).” An exception is when English units are used as identifiers in trade, such as “3½-in disk drive.” Avoid combining SI and CGS units, such as current in amperes and magnetic field in oersteds. This often leads to confusion because equations do not balance dimensionally. If you must use mixed units, clearly state the units for each quantity in an equation.</w:t>
       </w:r>
     </w:p>
     <w:p>
@@ -1523,31 +1215,7 @@
         <w:t>0</w:t>
       </w:r>
       <w:r>
-        <w:t xml:space="preserve"> is zero, not a lowercase letter “o.” The term for residual magnetization is “remanence”; the adjective is “remanent”; do not write “</w:t>
-      </w:r>
-      <w:proofErr w:type="spellStart"/>
-      <w:r>
-        <w:t>remnance</w:t>
-      </w:r>
-      <w:proofErr w:type="spellEnd"/>
-      <w:r>
-        <w:t xml:space="preserve">” or “remnant.” Use the word “micrometer” instead of “micron.” A graph within a graph is an “inset,” not an “insert.” The word “alternatively” is preferred to the word “alternately” (unless “issue” as a euphemism for “problem.” When compositions are not specified, separate chemical symbols by </w:t>
-      </w:r>
-      <w:proofErr w:type="spellStart"/>
-      <w:r>
-        <w:t>en</w:t>
-      </w:r>
-      <w:proofErr w:type="spellEnd"/>
-      <w:r>
-        <w:t>-dashes; for example, “</w:t>
-      </w:r>
-      <w:proofErr w:type="spellStart"/>
-      <w:r>
-        <w:t>NiMn</w:t>
-      </w:r>
-      <w:proofErr w:type="spellEnd"/>
-      <w:r>
-        <w:t>” indicates the intermetallic compound Ni</w:t>
+        <w:t xml:space="preserve"> is zero, not a lowercase letter “o.” The term for residual magnetization is “remanence”; the adjective is “remanent”; do not write “remnance” or “remnant.” Use the word “micrometer” instead of “micron.” A graph within a graph is an “inset,” not an “insert.” The word “alternatively” is preferred to the word “alternately” (unless “issue” as a euphemism for “problem.” When compositions are not specified, separate chemical symbols by en-dashes; for example, “NiMn” indicates the intermetallic compound Ni</w:t>
       </w:r>
       <w:r>
         <w:rPr>
@@ -1599,7 +1267,11 @@
         <w:pStyle w:val="Text"/>
       </w:pPr>
       <w:r>
-        <w:t>Prefixes such as “non,” “sub,” “micro,” “multi,” and “ultra” are not independent words; they should be joined to the words they modify, usually without a hyphen. There is no period after the “et” in the Latin abbreviation “</w:t>
+        <w:t xml:space="preserve">Prefixes such as “non,” “sub,” “micro,” “multi,” and “ultra” are not independent words; they should be joined to the words </w:t>
+      </w:r>
+      <w:r>
+        <w:lastRenderedPageBreak/>
+        <w:t>they modify, usually without a hyphen. There is no period after the “et” in the Latin abbreviation “</w:t>
       </w:r>
       <w:r>
         <w:rPr>
@@ -1617,20 +1289,12 @@
         <w:pStyle w:val="Text"/>
       </w:pPr>
       <w:r>
-        <w:t xml:space="preserve">A general IEEE </w:t>
-      </w:r>
-      <w:proofErr w:type="spellStart"/>
-      <w:r>
-        <w:t>style</w:t>
-      </w:r>
-      <w:r>
-        <w:t>guide</w:t>
-      </w:r>
-      <w:proofErr w:type="spellEnd"/>
-      <w:r>
-        <w:t xml:space="preserve"> is available at </w:t>
-      </w:r>
-      <w:hyperlink r:id="rId11" w:tgtFrame="_blank" w:history="1">
+        <w:t>A general IEEE style</w:t>
+      </w:r>
+      <w:r>
+        <w:t xml:space="preserve">guide is available at </w:t>
+      </w:r>
+      <w:hyperlink r:id="rId9" w:tgtFrame="_blank" w:history="1">
         <w:r>
           <w:rPr>
             <w:rStyle w:val="Hyperlink"/>
@@ -2036,36 +1700,20 @@
           <w:rFonts w:ascii="Times" w:hAnsi="Times" w:cs="Verdana"/>
           <w:color w:val="000000"/>
         </w:rPr>
-        <w:t xml:space="preserve">. If a multipart figure is made up of multiple figure types (one part is </w:t>
-      </w:r>
-      <w:proofErr w:type="spellStart"/>
+        <w:t>. If a multipart figure is made up of multiple figure types (one part is lineart, and another is grayscale or color) the figure should meet the stricter guidelin</w:t>
+      </w:r>
       <w:r>
         <w:rPr>
           <w:rFonts w:ascii="Times" w:hAnsi="Times" w:cs="Verdana"/>
           <w:color w:val="000000"/>
         </w:rPr>
-        <w:t>lineart</w:t>
-      </w:r>
-      <w:proofErr w:type="spellEnd"/>
+        <w:t>es</w:t>
+      </w:r>
       <w:r>
         <w:rPr>
           <w:rFonts w:ascii="Times" w:hAnsi="Times" w:cs="Verdana"/>
           <w:color w:val="000000"/>
         </w:rPr>
-        <w:t>, and another is grayscale or color) the figure should meet the stricter guidelin</w:t>
-      </w:r>
-      <w:r>
-        <w:rPr>
-          <w:rFonts w:ascii="Times" w:hAnsi="Times" w:cs="Verdana"/>
-          <w:color w:val="000000"/>
-        </w:rPr>
-        <w:t>es</w:t>
-      </w:r>
-      <w:r>
-        <w:rPr>
-          <w:rFonts w:ascii="Times" w:hAnsi="Times" w:cs="Verdana"/>
-          <w:color w:val="000000"/>
-        </w:rPr>
         <w:t>.</w:t>
       </w:r>
     </w:p>
@@ -2150,7 +1798,16 @@
           <w:sz w:val="20"/>
           <w:szCs w:val="20"/>
         </w:rPr>
-        <w:t xml:space="preserve">Most charts, graphs, and tables are one column wide (3.5 inches / 88 millimeters / 21 picas) or page wide (7.16 inches / 181 millimeters / 43 picas). The maximum depth a graphic can be is 8.5 inches (216 millimeters / 54 picas). When choosing the depth of a graphic, please allow space for a caption. Figures can be sized between column and page widths if the author chooses, however it is recommended that figures are not sized less than column width unless when necessary. </w:t>
+        <w:t xml:space="preserve">Most charts, graphs, and tables are one column wide (3.5 inches / 88 millimeters / 21 picas) or page wide (7.16 inches / 181 millimeters / 43 picas). The maximum depth a graphic can </w:t>
+      </w:r>
+      <w:r>
+        <w:rPr>
+          <w:rStyle w:val="BodyText2"/>
+          <w:rFonts w:ascii="Times" w:hAnsi="Times"/>
+          <w:sz w:val="20"/>
+          <w:szCs w:val="20"/>
+        </w:rPr>
+        <w:t xml:space="preserve">be is 8.5 inches (216 millimeters / 54 picas). When choosing the depth of a graphic, please allow space for a caption. Figures can be sized between column and page widths if the author chooses, however it is recommended that figures are not sized less than column width unless when necessary. </w:t>
       </w:r>
     </w:p>
     <w:p>
@@ -2360,7 +2017,6 @@
         </w:rPr>
       </w:pPr>
       <w:r>
-        <w:lastRenderedPageBreak/>
         <w:t>Resolution</w:t>
       </w:r>
       <w:r>
@@ -2587,47 +2243,7 @@
           <w:sz w:val="20"/>
           <w:szCs w:val="20"/>
         </w:rPr>
-        <w:t xml:space="preserve">All color figures should be generated in RGB or CMYK color space. Grayscale images should be submitted in Grayscale color space. Line art may be provided in grayscale OR bitmap </w:t>
-      </w:r>
-      <w:proofErr w:type="spellStart"/>
-      <w:r>
-        <w:rPr>
-          <w:rStyle w:val="BodyText2"/>
-          <w:rFonts w:ascii="Times" w:hAnsi="Times"/>
-          <w:sz w:val="20"/>
-          <w:szCs w:val="20"/>
-        </w:rPr>
-        <w:t>colorspace</w:t>
-      </w:r>
-      <w:proofErr w:type="spellEnd"/>
-      <w:r>
-        <w:rPr>
-          <w:rStyle w:val="BodyText2"/>
-          <w:rFonts w:ascii="Times" w:hAnsi="Times"/>
-          <w:sz w:val="20"/>
-          <w:szCs w:val="20"/>
-        </w:rPr>
-        <w:t xml:space="preserve">. Note that “bitmap </w:t>
-      </w:r>
-      <w:proofErr w:type="spellStart"/>
-      <w:r>
-        <w:rPr>
-          <w:rStyle w:val="BodyText2"/>
-          <w:rFonts w:ascii="Times" w:hAnsi="Times"/>
-          <w:sz w:val="20"/>
-          <w:szCs w:val="20"/>
-        </w:rPr>
-        <w:t>colorspace</w:t>
-      </w:r>
-      <w:proofErr w:type="spellEnd"/>
-      <w:r>
-        <w:rPr>
-          <w:rStyle w:val="BodyText2"/>
-          <w:rFonts w:ascii="Times" w:hAnsi="Times"/>
-          <w:sz w:val="20"/>
-          <w:szCs w:val="20"/>
-        </w:rPr>
-        <w:t xml:space="preserve">” and “bitmap file format” are not the same thing. When bitmap color space is selected, </w:t>
+        <w:t xml:space="preserve">All color figures should be generated in RGB or CMYK color space. Grayscale images should be submitted in Grayscale color space. Line art may be provided in grayscale OR bitmap colorspace. Note that “bitmap colorspace” and “bitmap file format” are not the same thing. When bitmap color space is selected, </w:t>
       </w:r>
       <w:r>
         <w:rPr>
@@ -2801,7 +2417,11 @@
         </w:rPr>
       </w:pPr>
       <w:r>
-        <w:t xml:space="preserve">Figure axis labels are often a source of confusion. Use words rather than symbols. As an example, write the quantity “Magnetization,” or “Magnetization </w:t>
+        <w:t xml:space="preserve">Figure axis labels are often a source of confusion. Use words rather than symbols. As an example, write the quantity </w:t>
+      </w:r>
+      <w:r>
+        <w:lastRenderedPageBreak/>
+        <w:t xml:space="preserve">“Magnetization,” or “Magnetization </w:t>
       </w:r>
       <w:r>
         <w:rPr>
@@ -2828,10 +2448,29 @@
           <w:position w:val="-2"/>
         </w:rPr>
         <w:object w:dxaOrig="100" w:dyaOrig="120" w14:anchorId="13B76468">
+          <v:shapetype id="_x0000_t75" coordsize="21600,21600" o:spt="75" o:preferrelative="t" path="m@4@5l@4@11@9@11@9@5xe" filled="f" stroked="f">
+            <v:stroke joinstyle="miter"/>
+            <v:formulas>
+              <v:f eqn="if lineDrawn pixelLineWidth 0"/>
+              <v:f eqn="sum @0 1 0"/>
+              <v:f eqn="sum 0 0 @1"/>
+              <v:f eqn="prod @2 1 2"/>
+              <v:f eqn="prod @3 21600 pixelWidth"/>
+              <v:f eqn="prod @3 21600 pixelHeight"/>
+              <v:f eqn="sum @0 0 1"/>
+              <v:f eqn="prod @6 1 2"/>
+              <v:f eqn="prod @7 21600 pixelWidth"/>
+              <v:f eqn="sum @8 21600 0"/>
+              <v:f eqn="prod @7 21600 pixelHeight"/>
+              <v:f eqn="sum @10 21600 0"/>
+            </v:formulas>
+            <v:path o:extrusionok="f" gradientshapeok="t" o:connecttype="rect"/>
+            <o:lock v:ext="edit" aspectratio="t"/>
+          </v:shapetype>
           <v:shape id="_x0000_i1026" type="#_x0000_t75" style="width:5.25pt;height:6pt" o:ole="" fillcolor="window">
-            <v:imagedata r:id="rId12" o:title=""/>
+            <v:imagedata r:id="rId10" o:title=""/>
           </v:shape>
-          <o:OLEObject Type="Embed" ProgID="Equation.3" ShapeID="_x0000_i1026" DrawAspect="Content" ObjectID="_1839071958" r:id="rId13"/>
+          <o:OLEObject Type="Embed" ProgID="Equation.3" ShapeID="_x0000_i1026" DrawAspect="Content" ObjectID="_1839228515" r:id="rId11"/>
         </w:object>
       </w:r>
       <w:r>
@@ -2997,47 +2636,7 @@
           <w:sz w:val="20"/>
           <w:szCs w:val="20"/>
         </w:rPr>
-        <w:t xml:space="preserve">For example, four author photographs for a paper may be named: oppen.ps, </w:t>
-      </w:r>
-      <w:proofErr w:type="spellStart"/>
-      <w:r>
-        <w:rPr>
-          <w:rStyle w:val="BodyText2"/>
-          <w:rFonts w:ascii="Times" w:hAnsi="Times"/>
-          <w:sz w:val="20"/>
-          <w:szCs w:val="20"/>
-        </w:rPr>
-        <w:t>moshc.tif</w:t>
-      </w:r>
-      <w:proofErr w:type="spellEnd"/>
-      <w:r>
-        <w:rPr>
-          <w:rStyle w:val="BodyText2"/>
-          <w:rFonts w:ascii="Times" w:hAnsi="Times"/>
-          <w:sz w:val="20"/>
-          <w:szCs w:val="20"/>
-        </w:rPr>
-        <w:t xml:space="preserve">, </w:t>
-      </w:r>
-      <w:proofErr w:type="spellStart"/>
-      <w:r>
-        <w:rPr>
-          <w:rStyle w:val="BodyText2"/>
-          <w:rFonts w:ascii="Times" w:hAnsi="Times"/>
-          <w:sz w:val="20"/>
-          <w:szCs w:val="20"/>
-        </w:rPr>
-        <w:t>chen.eps</w:t>
-      </w:r>
-      <w:proofErr w:type="spellEnd"/>
-      <w:r>
-        <w:rPr>
-          <w:rStyle w:val="BodyText2"/>
-          <w:rFonts w:ascii="Times" w:hAnsi="Times"/>
-          <w:sz w:val="20"/>
-          <w:szCs w:val="20"/>
-        </w:rPr>
-        <w:t xml:space="preserve">, and duran.pdf.  </w:t>
+        <w:t xml:space="preserve">For example, four author photographs for a paper may be named: oppen.ps, moshc.tif, chen.eps, and duran.pdf.  </w:t>
       </w:r>
     </w:p>
     <w:p>
@@ -3094,47 +2693,7 @@
           <w:sz w:val="20"/>
           <w:szCs w:val="20"/>
         </w:rPr>
-        <w:t xml:space="preserve"> </w:t>
-      </w:r>
-      <w:proofErr w:type="spellStart"/>
-      <w:r>
-        <w:rPr>
-          <w:rStyle w:val="BodyText2"/>
-          <w:rFonts w:ascii="Times" w:hAnsi="Times"/>
-          <w:sz w:val="20"/>
-          <w:szCs w:val="20"/>
-        </w:rPr>
-        <w:t>oppmi.tif</w:t>
-      </w:r>
-      <w:proofErr w:type="spellEnd"/>
-      <w:r>
-        <w:rPr>
-          <w:rStyle w:val="BodyText2"/>
-          <w:rFonts w:ascii="Times" w:hAnsi="Times"/>
-          <w:sz w:val="20"/>
-          <w:szCs w:val="20"/>
-        </w:rPr>
-        <w:t xml:space="preserve">, and </w:t>
-      </w:r>
-      <w:proofErr w:type="spellStart"/>
-      <w:r>
-        <w:rPr>
-          <w:rStyle w:val="BodyText2"/>
-          <w:rFonts w:ascii="Times" w:hAnsi="Times"/>
-          <w:sz w:val="20"/>
-          <w:szCs w:val="20"/>
-        </w:rPr>
-        <w:t>oppmo.eps</w:t>
-      </w:r>
-      <w:proofErr w:type="spellEnd"/>
-      <w:r>
-        <w:rPr>
-          <w:rStyle w:val="BodyText2"/>
-          <w:rFonts w:ascii="Times" w:hAnsi="Times"/>
-          <w:sz w:val="20"/>
-          <w:szCs w:val="20"/>
-        </w:rPr>
-        <w:t>.</w:t>
+        <w:t xml:space="preserve"> oppmi.tif, and oppmo.eps.</w:t>
       </w:r>
     </w:p>
     <w:p>
@@ -3236,7 +2795,7 @@
       <w:r>
         <w:t xml:space="preserve">enables authors to pre-screen their graphics for compliance with IEEE Transactions and Journals standards before submission. The online tool, located at </w:t>
       </w:r>
-      <w:hyperlink r:id="rId14" w:history="1">
+      <w:hyperlink r:id="rId12" w:history="1">
         <w:r>
           <w:rPr>
             <w:rStyle w:val="Hyperlink"/>
@@ -3247,15 +2806,10 @@
         </w:r>
       </w:hyperlink>
       <w:r>
-        <w:t xml:space="preserve">, allows authors to upload their graphics in order to check that each file is the correct file format, resolution, size and </w:t>
-      </w:r>
-      <w:proofErr w:type="spellStart"/>
-      <w:r>
-        <w:t>colorspace</w:t>
-      </w:r>
-      <w:proofErr w:type="spellEnd"/>
-      <w:r>
-        <w:t>; that no fonts are missing or corrupt; that figures are not compiled in layers or have transparency, and that they are named according to the IEEE Transactions and Journals naming convention. At the end of this automated process, authors are provided with a detailed report on each graphic within the web applet, as well as by email.</w:t>
+        <w:t xml:space="preserve">, allows authors to upload their graphics in order to check that each file is the correct file format, resolution, size and colorspace; that no fonts are missing or corrupt; that figures are not compiled in layers or have transparency, and that they are named according to the IEEE Transactions and Journals naming convention. At the end of this automated process, authors are provided with a detailed </w:t>
+      </w:r>
+      <w:r>
+        <w:t>report on each graphic within the web applet, as well as by email.</w:t>
       </w:r>
     </w:p>
     <w:p>
@@ -3284,7 +2838,7 @@
       <w:r>
         <w:t xml:space="preserve"> Desk by e-mail at </w:t>
       </w:r>
-      <w:hyperlink r:id="rId15" w:history="1">
+      <w:hyperlink r:id="rId13" w:history="1">
         <w:r>
           <w:rPr>
             <w:rStyle w:val="Hyperlink"/>
@@ -3324,11 +2878,7 @@
         <w:br/>
       </w:r>
       <w:r>
-        <w:t xml:space="preserve">you do not need to position figures and tables at the top and bottom of each column. In fact, all figures, figure captions, and tables can be placed at the end of your paper. In addition to, or even in lieu of submitting figures within your final manuscript, figures should be submitted individually, separate from the </w:t>
-      </w:r>
-      <w:r>
-        <w:lastRenderedPageBreak/>
-        <w:t xml:space="preserve">manuscript in one of the file formats listed above in </w:t>
+        <w:t xml:space="preserve">you do not need to position figures and tables at the top and bottom of each column. In fact, all figures, figure captions, and tables can be placed at the end of your paper. In addition to, or even in lieu of submitting figures within your final manuscript, figures should be submitted individually, separate from the manuscript in one of the file formats listed above in </w:t>
       </w:r>
       <w:r>
         <w:t>section VI-J</w:t>
@@ -3597,7 +3147,11 @@
         <w:t xml:space="preserve"> inside</w:t>
       </w:r>
       <w:r>
-        <w:t xml:space="preserve"> the punctuation.  Multiple references </w:t>
+        <w:t xml:space="preserve"> the punctuation.  </w:t>
+      </w:r>
+      <w:r>
+        <w:lastRenderedPageBreak/>
+        <w:t xml:space="preserve">Multiple references </w:t>
       </w:r>
       <w:r>
         <w:t>are each numbere</w:t>
@@ -3645,14 +3199,7 @@
           <w:bCs/>
           <w:iCs/>
         </w:rPr>
-        <w:t xml:space="preserve">Reference numbers are set flush left and form a column of their own, hanging out beyond the body of the reference. The reference numbers are on the line, enclosed in square brackets. </w:t>
-      </w:r>
-      <w:r>
-        <w:rPr>
-          <w:bCs/>
-          <w:iCs/>
-        </w:rPr>
-        <w:t xml:space="preserve">In all references, the given name of the author or editor is abbreviated to the initial only and precedes the last name. </w:t>
+        <w:t xml:space="preserve">Reference numbers are set flush left and form a column of their own, hanging out beyond the body of the reference. The reference numbers are on the line, enclosed in square brackets. In all references, the given name of the author or editor is abbreviated to the initial only and precedes the last name. </w:t>
       </w:r>
       <w:r>
         <w:rPr>
@@ -3826,7 +3373,7 @@
       <w:r>
         <w:t xml:space="preserve">at </w:t>
       </w:r>
-      <w:hyperlink r:id="rId16" w:tgtFrame="_blank" w:history="1">
+      <w:hyperlink r:id="rId14" w:tgtFrame="_blank" w:history="1">
         <w:r>
           <w:rPr>
             <w:rStyle w:val="Hyperlink"/>
@@ -3980,42 +3527,17 @@
           <w:i/>
           <w:iCs/>
         </w:rPr>
-        <w:t xml:space="preserve">Compress, </w:t>
-      </w:r>
-      <w:proofErr w:type="spellStart"/>
+        <w:t>Compress, Pkzip, Stuffit,</w:t>
+      </w:r>
+      <w:r>
+        <w:t xml:space="preserve"> or </w:t>
+      </w:r>
       <w:r>
         <w:rPr>
           <w:i/>
           <w:iCs/>
         </w:rPr>
-        <w:t>Pkzip</w:t>
-      </w:r>
-      <w:proofErr w:type="spellEnd"/>
-      <w:r>
-        <w:rPr>
-          <w:i/>
-          <w:iCs/>
-        </w:rPr>
-        <w:t>, Stuffit,</w:t>
-      </w:r>
-      <w:r>
-        <w:t xml:space="preserve"> or </w:t>
-      </w:r>
-      <w:proofErr w:type="spellStart"/>
-      <w:r>
-        <w:rPr>
-          <w:i/>
-          <w:iCs/>
-        </w:rPr>
-        <w:t>Gzip</w:t>
-      </w:r>
-      <w:proofErr w:type="spellEnd"/>
-      <w:r>
-        <w:rPr>
-          <w:i/>
-          <w:iCs/>
-        </w:rPr>
-        <w:t>.</w:t>
+        <w:t>Gzip.</w:t>
       </w:r>
       <w:r>
         <w:t xml:space="preserve"> </w:t>
@@ -4026,11 +3548,7 @@
         <w:pStyle w:val="Text"/>
       </w:pPr>
       <w:r>
-        <w:t xml:space="preserve">Also, send a sheet of paper or PDF with complete contact information for all authors. Include full mailing addresses, telephone numbers, fax numbers, and e-mail addresses. This </w:t>
-      </w:r>
-      <w:r>
-        <w:lastRenderedPageBreak/>
-        <w:t>information will be used to send each author a complimentary copy of the journal in which the paper appears. In addition, designate one author as the “corresponding author.” This is the author to whom proofs of the paper will be sent. Proofs are sent to the corresponding author only.</w:t>
+        <w:t>Also, send a sheet of paper or PDF with complete contact information for all authors. Include full mailing addresses, telephone numbers, fax numbers, and e-mail addresses. This information will be used to send each author a complimentary copy of the journal in which the paper appears. In addition, designate one author as the “corresponding author.” This is the author to whom proofs of the paper will be sent. Proofs are sent to the corresponding author only.</w:t>
       </w:r>
     </w:p>
     <w:p>
@@ -4043,11 +3561,9 @@
       <w:r>
         <w:t xml:space="preserve">Using </w:t>
       </w:r>
-      <w:proofErr w:type="spellStart"/>
       <w:r>
         <w:t>ScholarOne</w:t>
       </w:r>
-      <w:proofErr w:type="spellEnd"/>
       <w:r>
         <w:rPr>
           <w:color w:val="000000"/>
@@ -4122,16 +3638,8 @@
         <w:rPr>
           <w:color w:val="000000"/>
         </w:rPr>
-        <w:t xml:space="preserve"> may be submitted electronically on IEEE’s on-line manuscript submission and peer-review system, </w:t>
-      </w:r>
-      <w:proofErr w:type="spellStart"/>
-      <w:r>
-        <w:rPr>
-          <w:color w:val="000000"/>
-        </w:rPr>
-        <w:t>ScholarOne</w:t>
-      </w:r>
-      <w:proofErr w:type="spellEnd"/>
+        <w:t xml:space="preserve"> may be submitted electronically on IEEE’s on-line manuscript submission and peer-review system, ScholarOne</w:t>
+      </w:r>
       <w:r>
         <w:rPr>
           <w:color w:val="000000"/>
@@ -4151,14 +3659,12 @@
         </w:rPr>
         <w:t xml:space="preserve"> You can get a listing of the publications that participate in </w:t>
       </w:r>
-      <w:proofErr w:type="spellStart"/>
       <w:r>
         <w:rPr>
           <w:color w:val="000000"/>
         </w:rPr>
         <w:t>ScholarOne</w:t>
       </w:r>
-      <w:proofErr w:type="spellEnd"/>
       <w:r>
         <w:rPr>
           <w:color w:val="000000"/>
@@ -4186,7 +3692,7 @@
           <w:color w:val="000000"/>
         </w:rPr>
       </w:pPr>
-      <w:hyperlink r:id="rId17" w:history="1">
+      <w:hyperlink r:id="rId15" w:history="1">
         <w:r>
           <w:rPr>
             <w:rStyle w:val="Hyperlink"/>
@@ -4225,21 +3731,7 @@
         <w:rPr>
           <w:color w:val="000000"/>
         </w:rPr>
-        <w:t xml:space="preserve">Along with other information, you will be asked to select the subject from a pull-down list. Depending on the journal, there are various steps to the submission process; you must complete all steps for a complete submission. At the end of each step you must click “Save and Continue”; just uploading the paper is not sufficient. After the last step, you should see a confirmation that the submission is complete. You should also receive an e-mail confirmation. For inquiries regarding the submission of your paper on </w:t>
-      </w:r>
-      <w:proofErr w:type="spellStart"/>
-      <w:r>
-        <w:rPr>
-          <w:color w:val="000000"/>
-        </w:rPr>
-        <w:t>ScholarOne</w:t>
-      </w:r>
-      <w:proofErr w:type="spellEnd"/>
-      <w:r>
-        <w:rPr>
-          <w:color w:val="000000"/>
-        </w:rPr>
-        <w:t xml:space="preserve"> Manuscripts, please contact oprs-support@ieee.org or call +1 732 465 5861.</w:t>
+        <w:t>Along with other information, you will be asked to select the subject from a pull-down list. Depending on the journal, there are various steps to the submission process; you must complete all steps for a complete submission. At the end of each step you must click “Save and Continue”; just uploading the paper is not sufficient. After the last step, you should see a confirmation that the submission is complete. You should also receive an e-mail confirmation. For inquiries regarding the submission of your paper on ScholarOne Manuscripts, please contact oprs-support@ieee.org or call +1 732 465 5861.</w:t>
       </w:r>
     </w:p>
     <w:p>
@@ -4253,13 +3745,8 @@
         <w:ind w:firstLine="360"/>
         <w:jc w:val="both"/>
       </w:pPr>
-      <w:proofErr w:type="spellStart"/>
-      <w:r>
-        <w:t>ScholarOne</w:t>
-      </w:r>
-      <w:proofErr w:type="spellEnd"/>
-      <w:r>
-        <w:t xml:space="preserve"> Manuscripts will accept files for review in various formats.  Please check the guidelines of the specific journal for which you plan to submit.  </w:t>
+      <w:r>
+        <w:t xml:space="preserve">ScholarOne Manuscripts will accept files for review in various formats.  Please check the guidelines of the specific journal for which you plan to submit.  </w:t>
       </w:r>
     </w:p>
     <w:p>
@@ -4283,15 +3770,7 @@
         <w:pStyle w:val="Heading2"/>
       </w:pPr>
       <w:r>
-        <w:t xml:space="preserve">Final Stage Using </w:t>
-      </w:r>
-      <w:proofErr w:type="spellStart"/>
-      <w:r>
-        <w:t>ScholarOne</w:t>
-      </w:r>
-      <w:proofErr w:type="spellEnd"/>
-      <w:r>
-        <w:t xml:space="preserve"> </w:t>
+        <w:t xml:space="preserve">Final Stage Using ScholarOne </w:t>
       </w:r>
       <w:r>
         <w:t xml:space="preserve"> </w:t>
@@ -4312,15 +3791,11 @@
         <w:jc w:val="both"/>
       </w:pPr>
       <w:r>
-        <w:t xml:space="preserve">Upon acceptance, you will receive an email with specific instructions regarding the submission of your final files.  To avoid any delays in publication, please be sure to follow these instructions.  Most journals require that final submissions be uploaded through </w:t>
-      </w:r>
-      <w:proofErr w:type="spellStart"/>
-      <w:r>
-        <w:t>ScholarOne</w:t>
-      </w:r>
-      <w:proofErr w:type="spellEnd"/>
-      <w:r>
-        <w:t xml:space="preserve"> Manuscripts, although some may still accept final submissions via email.  Final submissions should include source files of your accepted manuscript, high quality graphic files, and a formatted pdf file.  If you have any questions regarding the final submission process, please contact the administrative contact for the journal. </w:t>
+        <w:t xml:space="preserve">Upon acceptance, you will receive an email with specific instructions regarding the submission of your final files.  To avoid any delays in publication, please be sure to follow these instructions.  Most journals require that final submissions be uploaded through ScholarOne Manuscripts, although some may still accept final submissions via email.  Final submissions </w:t>
+      </w:r>
+      <w:r>
+        <w:lastRenderedPageBreak/>
+        <w:t xml:space="preserve">should include source files of your accepted manuscript, high quality graphic files, and a formatted pdf file.  If you have any questions regarding the final submission process, please contact the administrative contact for the journal. </w:t>
       </w:r>
     </w:p>
     <w:p>
@@ -4347,21 +3822,7 @@
         <w:rPr>
           <w:color w:val="000000"/>
         </w:rPr>
-        <w:t xml:space="preserve">In addition to this, upload a file with complete contact information for all authors. Include full mailing addresses, telephone numbers, fax numbers, and e-mail addresses. Designate the author who submitted the manuscript on </w:t>
-      </w:r>
-      <w:proofErr w:type="spellStart"/>
-      <w:r>
-        <w:rPr>
-          <w:color w:val="000000"/>
-        </w:rPr>
-        <w:t>ScholarOne</w:t>
-      </w:r>
-      <w:proofErr w:type="spellEnd"/>
-      <w:r>
-        <w:rPr>
-          <w:color w:val="000000"/>
-        </w:rPr>
-        <w:t xml:space="preserve"> Manuscripts as the “corresponding author.” This is the only author to whom proofs of the paper will be sent. </w:t>
+        <w:t xml:space="preserve">In addition to this, upload a file with complete contact information for all authors. Include full mailing addresses, telephone numbers, fax numbers, and e-mail addresses. Designate the author who submitted the manuscript on ScholarOne Manuscripts as the “corresponding author.” This is the only author to whom proofs of the paper will be sent. </w:t>
       </w:r>
     </w:p>
     <w:p>
@@ -4397,94 +3858,62 @@
           <w:color w:val="222222"/>
           <w:shd w:val="clear" w:color="auto" w:fill="FFFFFF"/>
         </w:rPr>
-        <w:t>Authors must submit an electronic IEEE Copyright Form (</w:t>
-      </w:r>
-      <w:proofErr w:type="spellStart"/>
+        <w:t xml:space="preserve">Authors must submit an electronic IEEE Copyright Form (eCF) upon submitting their final manuscript files.  </w:t>
+      </w:r>
       <w:r>
         <w:rPr>
           <w:color w:val="222222"/>
           <w:shd w:val="clear" w:color="auto" w:fill="FFFFFF"/>
         </w:rPr>
-        <w:t>eCF</w:t>
-      </w:r>
-      <w:proofErr w:type="spellEnd"/>
+        <w:t>You</w:t>
+      </w:r>
       <w:r>
         <w:rPr>
           <w:color w:val="222222"/>
           <w:shd w:val="clear" w:color="auto" w:fill="FFFFFF"/>
         </w:rPr>
-        <w:t xml:space="preserve">) upon submitting their final manuscript files.  </w:t>
+        <w:t xml:space="preserve"> can a</w:t>
       </w:r>
       <w:r>
         <w:rPr>
           <w:color w:val="222222"/>
           <w:shd w:val="clear" w:color="auto" w:fill="FFFFFF"/>
         </w:rPr>
-        <w:t>You</w:t>
+        <w:t>ccess the eCF system through your</w:t>
       </w:r>
       <w:r>
         <w:rPr>
           <w:color w:val="222222"/>
           <w:shd w:val="clear" w:color="auto" w:fill="FFFFFF"/>
         </w:rPr>
-        <w:t xml:space="preserve"> can a</w:t>
+        <w:t xml:space="preserve"> manuscript submission system or through the Author Gateway.</w:t>
       </w:r>
       <w:r>
         <w:rPr>
           <w:color w:val="222222"/>
           <w:shd w:val="clear" w:color="auto" w:fill="FFFFFF"/>
         </w:rPr>
-        <w:t xml:space="preserve">ccess the </w:t>
-      </w:r>
-      <w:proofErr w:type="spellStart"/>
+        <w:t xml:space="preserve"> </w:t>
+      </w:r>
       <w:r>
         <w:rPr>
           <w:color w:val="222222"/>
           <w:shd w:val="clear" w:color="auto" w:fill="FFFFFF"/>
         </w:rPr>
-        <w:t>eCF</w:t>
-      </w:r>
-      <w:proofErr w:type="spellEnd"/>
+        <w:t>You</w:t>
+      </w:r>
       <w:r>
         <w:rPr>
           <w:color w:val="222222"/>
           <w:shd w:val="clear" w:color="auto" w:fill="FFFFFF"/>
         </w:rPr>
-        <w:t xml:space="preserve"> system through your</w:t>
+        <w:t xml:space="preserve"> are responsible for obtaining any necessary approvals and/or security clearances.</w:t>
       </w:r>
       <w:r>
         <w:rPr>
           <w:color w:val="222222"/>
           <w:shd w:val="clear" w:color="auto" w:fill="FFFFFF"/>
         </w:rPr>
-        <w:t xml:space="preserve"> manuscript submission system or through the Author Gateway.</w:t>
-      </w:r>
-      <w:r>
-        <w:rPr>
-          <w:color w:val="222222"/>
-          <w:shd w:val="clear" w:color="auto" w:fill="FFFFFF"/>
-        </w:rPr>
-        <w:t xml:space="preserve"> </w:t>
-      </w:r>
-      <w:r>
-        <w:rPr>
-          <w:color w:val="222222"/>
-          <w:shd w:val="clear" w:color="auto" w:fill="FFFFFF"/>
-        </w:rPr>
-        <w:t>You</w:t>
-      </w:r>
-      <w:r>
-        <w:rPr>
-          <w:color w:val="222222"/>
-          <w:shd w:val="clear" w:color="auto" w:fill="FFFFFF"/>
-        </w:rPr>
-        <w:t xml:space="preserve"> are responsible for obtaining any necessary approvals and/or security clearances.</w:t>
-      </w:r>
-      <w:r>
-        <w:rPr>
-          <w:color w:val="222222"/>
-          <w:shd w:val="clear" w:color="auto" w:fill="FFFFFF"/>
-        </w:rPr>
         <w:t xml:space="preserve"> For additional information on intellectual property rights, visit the IEEE Intellectual Property Rights department web page at </w:t>
       </w:r>
     </w:p>
@@ -4493,7 +3922,7 @@
         <w:pStyle w:val="Text"/>
         <w:ind w:firstLine="0"/>
       </w:pPr>
-      <w:hyperlink r:id="rId18" w:history="1">
+      <w:hyperlink r:id="rId16" w:history="1">
         <w:r>
           <w:rPr>
             <w:rStyle w:val="Hyperlink"/>
@@ -4549,1830 +3978,25 @@
     </w:p>
     <w:p>
       <w:pPr>
-        <w:autoSpaceDE w:val="0"/>
-        <w:autoSpaceDN w:val="0"/>
-        <w:adjustRightInd w:val="0"/>
-        <w:rPr>
-          <w:rFonts w:ascii="TimesNewRomanPS-ItalicMT" w:hAnsi="TimesNewRomanPS-ItalicMT" w:cs="TimesNewRomanPS-ItalicMT"/>
-          <w:i/>
-          <w:iCs/>
-        </w:rPr>
-      </w:pPr>
-      <w:r>
-        <w:rPr>
-          <w:rFonts w:ascii="TimesNewRomanPS-ItalicMT" w:hAnsi="TimesNewRomanPS-ItalicMT" w:cs="TimesNewRomanPS-ItalicMT"/>
-          <w:i/>
-          <w:iCs/>
-        </w:rPr>
-        <w:t>Basic format for books:</w:t>
-      </w:r>
-    </w:p>
-    <w:p>
-      <w:pPr>
-        <w:rPr>
-          <w:rFonts w:ascii="TimesNewRomanPS-ItalicMT" w:hAnsi="TimesNewRomanPS-ItalicMT" w:cs="TimesNewRomanPS-ItalicMT"/>
-          <w:i/>
-          <w:iCs/>
-          <w:sz w:val="16"/>
-          <w:szCs w:val="16"/>
-        </w:rPr>
-      </w:pPr>
-      <w:r>
-        <w:rPr>
-          <w:sz w:val="16"/>
-          <w:szCs w:val="16"/>
-        </w:rPr>
-        <w:t xml:space="preserve"> </w:t>
-      </w:r>
-      <w:r>
-        <w:rPr>
-          <w:sz w:val="16"/>
-          <w:szCs w:val="16"/>
-        </w:rPr>
-        <w:t>J</w:t>
-      </w:r>
-      <w:r>
-        <w:rPr>
-          <w:sz w:val="16"/>
-          <w:szCs w:val="16"/>
-        </w:rPr>
-        <w:t xml:space="preserve">. K. Author, “Title of chapter in the book,” in </w:t>
-      </w:r>
-      <w:r>
-        <w:rPr>
-          <w:rFonts w:ascii="TimesNewRomanPS-ItalicMT" w:hAnsi="TimesNewRomanPS-ItalicMT" w:cs="TimesNewRomanPS-ItalicMT"/>
-          <w:i/>
-          <w:iCs/>
-          <w:sz w:val="16"/>
-          <w:szCs w:val="16"/>
-        </w:rPr>
-        <w:t xml:space="preserve">Title of His Published Book, </w:t>
-      </w:r>
-      <w:proofErr w:type="spellStart"/>
-      <w:r>
-        <w:rPr>
-          <w:rFonts w:ascii="TimesNewRomanPS-ItalicMT" w:hAnsi="TimesNewRomanPS-ItalicMT" w:cs="TimesNewRomanPS-ItalicMT"/>
-          <w:i/>
-          <w:iCs/>
-          <w:sz w:val="16"/>
-          <w:szCs w:val="16"/>
-        </w:rPr>
-        <w:t>x</w:t>
-      </w:r>
-      <w:r>
-        <w:rPr>
-          <w:sz w:val="16"/>
-          <w:szCs w:val="16"/>
-        </w:rPr>
-        <w:t>th</w:t>
-      </w:r>
-      <w:proofErr w:type="spellEnd"/>
-      <w:r>
-        <w:rPr>
-          <w:sz w:val="16"/>
-          <w:szCs w:val="16"/>
-        </w:rPr>
-        <w:t xml:space="preserve"> ed. City of Publisher, </w:t>
-      </w:r>
-      <w:r>
-        <w:rPr>
-          <w:sz w:val="16"/>
-          <w:szCs w:val="16"/>
-        </w:rPr>
-        <w:t>(only U.S. State), Country</w:t>
-      </w:r>
-      <w:r>
-        <w:rPr>
-          <w:sz w:val="16"/>
-          <w:szCs w:val="16"/>
-        </w:rPr>
-        <w:t xml:space="preserve">: Abbrev. of Publisher, year, </w:t>
-      </w:r>
-      <w:proofErr w:type="spellStart"/>
-      <w:r>
-        <w:rPr>
-          <w:sz w:val="16"/>
-          <w:szCs w:val="16"/>
-        </w:rPr>
-        <w:t>ch.</w:t>
-      </w:r>
-      <w:proofErr w:type="spellEnd"/>
-      <w:r>
-        <w:rPr>
-          <w:sz w:val="16"/>
-          <w:szCs w:val="16"/>
-        </w:rPr>
-        <w:t xml:space="preserve"> </w:t>
-      </w:r>
-      <w:r>
-        <w:rPr>
-          <w:rFonts w:ascii="TimesNewRomanPS-ItalicMT" w:hAnsi="TimesNewRomanPS-ItalicMT" w:cs="TimesNewRomanPS-ItalicMT"/>
-          <w:i/>
-          <w:iCs/>
-          <w:sz w:val="16"/>
-          <w:szCs w:val="16"/>
-        </w:rPr>
-        <w:t>x</w:t>
-      </w:r>
-      <w:r>
-        <w:rPr>
-          <w:sz w:val="16"/>
-          <w:szCs w:val="16"/>
-        </w:rPr>
-        <w:t xml:space="preserve">, sec. </w:t>
-      </w:r>
-      <w:r>
-        <w:rPr>
-          <w:rFonts w:ascii="TimesNewRomanPS-ItalicMT" w:hAnsi="TimesNewRomanPS-ItalicMT" w:cs="TimesNewRomanPS-ItalicMT"/>
-          <w:i/>
-          <w:iCs/>
-          <w:sz w:val="16"/>
-          <w:szCs w:val="16"/>
-        </w:rPr>
-        <w:t>x</w:t>
-      </w:r>
-      <w:r>
-        <w:rPr>
-          <w:sz w:val="16"/>
-          <w:szCs w:val="16"/>
-        </w:rPr>
-        <w:t xml:space="preserve">, pp. </w:t>
-      </w:r>
-      <w:r>
-        <w:rPr>
-          <w:rFonts w:ascii="TimesNewRomanPS-ItalicMT" w:hAnsi="TimesNewRomanPS-ItalicMT" w:cs="TimesNewRomanPS-ItalicMT"/>
-          <w:i/>
-          <w:iCs/>
-          <w:sz w:val="16"/>
-          <w:szCs w:val="16"/>
-        </w:rPr>
-        <w:t>xxx–xxx.</w:t>
-      </w:r>
-    </w:p>
-    <w:p>
-      <w:pPr>
         <w:widowControl w:val="0"/>
         <w:autoSpaceDE w:val="0"/>
         <w:autoSpaceDN w:val="0"/>
         <w:adjustRightInd w:val="0"/>
         <w:ind w:right="-20"/>
         <w:rPr>
-          <w:color w:val="000000"/>
-        </w:rPr>
-      </w:pPr>
-      <w:r>
-        <w:rPr>
           <w:i/>
           <w:iCs/>
           <w:color w:val="000000"/>
         </w:rPr>
-        <w:t>Examples:</w:t>
-      </w:r>
-    </w:p>
-    <w:p>
-      <w:pPr>
-        <w:pStyle w:val="References"/>
-      </w:pPr>
-      <w:r>
-        <w:t>G.</w:t>
-      </w:r>
-      <w:r>
-        <w:rPr>
-          <w:spacing w:val="1"/>
-        </w:rPr>
-        <w:t xml:space="preserve"> </w:t>
-      </w:r>
-      <w:r>
-        <w:t>O.</w:t>
-      </w:r>
-      <w:r>
-        <w:rPr>
-          <w:spacing w:val="1"/>
-        </w:rPr>
-        <w:t xml:space="preserve"> </w:t>
-      </w:r>
-      <w:r>
-        <w:t>Y</w:t>
-      </w:r>
-      <w:r>
-        <w:rPr>
-          <w:spacing w:val="1"/>
-        </w:rPr>
-        <w:t>o</w:t>
-      </w:r>
-      <w:r>
-        <w:t>un</w:t>
-      </w:r>
-      <w:r>
-        <w:rPr>
-          <w:spacing w:val="1"/>
-        </w:rPr>
-        <w:t>g</w:t>
-      </w:r>
-      <w:r>
-        <w:t>,</w:t>
-      </w:r>
-      <w:r>
-        <w:rPr>
-          <w:spacing w:val="1"/>
-        </w:rPr>
-        <w:t xml:space="preserve"> </w:t>
-      </w:r>
-      <w:r>
-        <w:t>“Sy</w:t>
-      </w:r>
-      <w:r>
-        <w:rPr>
-          <w:spacing w:val="1"/>
-        </w:rPr>
-        <w:t>n</w:t>
-      </w:r>
-      <w:r>
-        <w:t>t</w:t>
-      </w:r>
-      <w:r>
-        <w:rPr>
-          <w:spacing w:val="1"/>
-        </w:rPr>
-        <w:t>h</w:t>
-      </w:r>
-      <w:r>
-        <w:t>etic</w:t>
-      </w:r>
-      <w:r>
-        <w:rPr>
-          <w:spacing w:val="1"/>
-        </w:rPr>
-        <w:t xml:space="preserve"> </w:t>
-      </w:r>
-      <w:r>
-        <w:t>str</w:t>
-      </w:r>
-      <w:r>
-        <w:rPr>
-          <w:spacing w:val="1"/>
-        </w:rPr>
-        <w:t>u</w:t>
-      </w:r>
-      <w:r>
-        <w:t>ct</w:t>
-      </w:r>
-      <w:r>
-        <w:rPr>
-          <w:spacing w:val="1"/>
-        </w:rPr>
-        <w:t>ur</w:t>
-      </w:r>
-      <w:r>
-        <w:t>e</w:t>
-      </w:r>
-      <w:r>
-        <w:rPr>
-          <w:spacing w:val="1"/>
-        </w:rPr>
-        <w:t xml:space="preserve"> </w:t>
-      </w:r>
-      <w:r>
-        <w:t>of</w:t>
-      </w:r>
-      <w:r>
-        <w:rPr>
-          <w:spacing w:val="1"/>
-        </w:rPr>
-        <w:t xml:space="preserve"> </w:t>
-      </w:r>
-      <w:r>
-        <w:t>i</w:t>
-      </w:r>
-      <w:r>
-        <w:rPr>
-          <w:spacing w:val="1"/>
-        </w:rPr>
-        <w:t>n</w:t>
-      </w:r>
-      <w:r>
-        <w:t>d</w:t>
-      </w:r>
-      <w:r>
-        <w:rPr>
-          <w:spacing w:val="1"/>
-        </w:rPr>
-        <w:t>u</w:t>
-      </w:r>
-      <w:r>
-        <w:t>str</w:t>
-      </w:r>
-      <w:r>
-        <w:rPr>
-          <w:spacing w:val="-2"/>
-        </w:rPr>
-        <w:t>i</w:t>
-      </w:r>
-      <w:r>
-        <w:t>al</w:t>
-      </w:r>
-      <w:r>
-        <w:rPr>
-          <w:spacing w:val="1"/>
-        </w:rPr>
-        <w:t xml:space="preserve"> p</w:t>
-      </w:r>
-      <w:r>
-        <w:t>lastics,”</w:t>
-      </w:r>
-      <w:r>
-        <w:rPr>
-          <w:spacing w:val="1"/>
-        </w:rPr>
-        <w:t xml:space="preserve"> </w:t>
-      </w:r>
-      <w:r>
-        <w:t xml:space="preserve">in </w:t>
-      </w:r>
-      <w:r>
-        <w:rPr>
-          <w:i/>
-          <w:iCs/>
-        </w:rPr>
-        <w:t>Pl</w:t>
-      </w:r>
-      <w:r>
-        <w:rPr>
-          <w:i/>
-          <w:iCs/>
-          <w:spacing w:val="1"/>
-        </w:rPr>
-        <w:t>a</w:t>
-      </w:r>
-      <w:r>
-        <w:rPr>
-          <w:i/>
-          <w:iCs/>
-        </w:rPr>
-        <w:t xml:space="preserve">stics, </w:t>
-      </w:r>
-      <w:r>
-        <w:rPr>
-          <w:i/>
-          <w:iCs/>
-          <w:spacing w:val="38"/>
-        </w:rPr>
-        <w:t xml:space="preserve"> </w:t>
-      </w:r>
-      <w:r>
-        <w:t>2</w:t>
-      </w:r>
-      <w:r>
-        <w:rPr>
-          <w:spacing w:val="-1"/>
-        </w:rPr>
-        <w:t>n</w:t>
-      </w:r>
-      <w:r>
-        <w:t xml:space="preserve">d </w:t>
-      </w:r>
-      <w:r>
-        <w:rPr>
-          <w:spacing w:val="39"/>
-        </w:rPr>
-        <w:t xml:space="preserve"> </w:t>
-      </w:r>
-      <w:r>
-        <w:t>ed</w:t>
-      </w:r>
-      <w:r>
-        <w:rPr>
-          <w:spacing w:val="-1"/>
-        </w:rPr>
-        <w:t>.</w:t>
-      </w:r>
-      <w:r>
-        <w:t xml:space="preserve">, </w:t>
-      </w:r>
-      <w:r>
-        <w:rPr>
-          <w:spacing w:val="38"/>
-        </w:rPr>
-        <w:t xml:space="preserve"> </w:t>
-      </w:r>
-      <w:r>
-        <w:t xml:space="preserve">vol. </w:t>
-      </w:r>
-      <w:r>
-        <w:rPr>
-          <w:spacing w:val="38"/>
-        </w:rPr>
-        <w:t xml:space="preserve"> </w:t>
-      </w:r>
-      <w:r>
-        <w:rPr>
-          <w:spacing w:val="-1"/>
-        </w:rPr>
-        <w:t>3</w:t>
-      </w:r>
-      <w:r>
-        <w:t xml:space="preserve">, </w:t>
-      </w:r>
-      <w:r>
-        <w:rPr>
-          <w:spacing w:val="38"/>
-        </w:rPr>
-        <w:t>J</w:t>
-      </w:r>
-      <w:r>
-        <w:t xml:space="preserve">. </w:t>
-      </w:r>
-      <w:r>
-        <w:rPr>
-          <w:spacing w:val="39"/>
-        </w:rPr>
-        <w:t xml:space="preserve"> </w:t>
-      </w:r>
-      <w:r>
-        <w:t>Pet</w:t>
-      </w:r>
-      <w:r>
-        <w:rPr>
-          <w:spacing w:val="-1"/>
-        </w:rPr>
-        <w:t>e</w:t>
-      </w:r>
-      <w:r>
-        <w:t>rs</w:t>
-      </w:r>
-      <w:r>
-        <w:t xml:space="preserve">, </w:t>
-      </w:r>
-      <w:r>
-        <w:rPr>
-          <w:spacing w:val="38"/>
-        </w:rPr>
-        <w:t>Ed</w:t>
-      </w:r>
-      <w:r>
-        <w:t xml:space="preserve">. </w:t>
-      </w:r>
-      <w:r>
-        <w:rPr>
-          <w:spacing w:val="38"/>
-        </w:rPr>
-        <w:t xml:space="preserve"> </w:t>
-      </w:r>
-      <w:r>
-        <w:t>N</w:t>
-      </w:r>
-      <w:r>
-        <w:rPr>
-          <w:spacing w:val="-1"/>
-        </w:rPr>
-        <w:t>e</w:t>
-      </w:r>
-      <w:r>
-        <w:t xml:space="preserve">w </w:t>
-      </w:r>
-      <w:r>
-        <w:rPr>
-          <w:spacing w:val="38"/>
-        </w:rPr>
-        <w:t>York</w:t>
-      </w:r>
-      <w:r>
-        <w:rPr>
-          <w:spacing w:val="-1"/>
-        </w:rPr>
-        <w:t>, NY, USA</w:t>
-      </w:r>
-      <w:r>
-        <w:t>: McGraw-Hill,</w:t>
-      </w:r>
-      <w:r>
-        <w:rPr>
-          <w:spacing w:val="-1"/>
-        </w:rPr>
-        <w:t xml:space="preserve"> </w:t>
-      </w:r>
-      <w:r>
-        <w:rPr>
-          <w:spacing w:val="1"/>
-        </w:rPr>
-        <w:t>1</w:t>
-      </w:r>
-      <w:r>
-        <w:t>96</w:t>
-      </w:r>
-      <w:r>
-        <w:rPr>
-          <w:spacing w:val="1"/>
-        </w:rPr>
-        <w:t>4</w:t>
-      </w:r>
-      <w:r>
-        <w:t>,</w:t>
-      </w:r>
-      <w:r>
-        <w:rPr>
-          <w:spacing w:val="-1"/>
-        </w:rPr>
-        <w:t xml:space="preserve"> </w:t>
-      </w:r>
-      <w:r>
-        <w:t>p</w:t>
-      </w:r>
-      <w:r>
-        <w:rPr>
-          <w:spacing w:val="1"/>
-        </w:rPr>
-        <w:t>p</w:t>
-      </w:r>
-      <w:r>
-        <w:t>.</w:t>
-      </w:r>
-      <w:r>
-        <w:rPr>
-          <w:spacing w:val="-1"/>
-        </w:rPr>
-        <w:t xml:space="preserve"> </w:t>
-      </w:r>
-      <w:r>
-        <w:t>1</w:t>
-      </w:r>
-      <w:r>
-        <w:rPr>
-          <w:spacing w:val="1"/>
-        </w:rPr>
-        <w:t>5</w:t>
-      </w:r>
-      <w:r>
-        <w:t>–6</w:t>
-      </w:r>
-      <w:r>
-        <w:rPr>
-          <w:spacing w:val="1"/>
-        </w:rPr>
-        <w:t>4</w:t>
-      </w:r>
-      <w:r>
-        <w:t>.</w:t>
-      </w:r>
-    </w:p>
-    <w:p>
-      <w:pPr>
-        <w:pStyle w:val="References"/>
-        <w:rPr>
-          <w:spacing w:val="-1"/>
-        </w:rPr>
-      </w:pPr>
-      <w:r>
-        <w:rPr>
-          <w:spacing w:val="6"/>
-        </w:rPr>
-        <w:t>W</w:t>
-      </w:r>
-      <w:r>
-        <w:rPr>
-          <w:spacing w:val="5"/>
-        </w:rPr>
-        <w:t>.</w:t>
-      </w:r>
-      <w:r>
-        <w:rPr>
-          <w:spacing w:val="6"/>
-        </w:rPr>
-        <w:t>-</w:t>
-      </w:r>
-      <w:r>
-        <w:rPr>
-          <w:spacing w:val="5"/>
-        </w:rPr>
-        <w:t>K</w:t>
-      </w:r>
-      <w:r>
-        <w:t>.</w:t>
-      </w:r>
-      <w:r>
-        <w:rPr>
-          <w:spacing w:val="13"/>
-        </w:rPr>
-        <w:t xml:space="preserve"> </w:t>
-      </w:r>
-      <w:r>
-        <w:rPr>
-          <w:spacing w:val="6"/>
-        </w:rPr>
-        <w:t>Ch</w:t>
-      </w:r>
-      <w:r>
-        <w:rPr>
-          <w:spacing w:val="5"/>
-        </w:rPr>
-        <w:t>e</w:t>
-      </w:r>
-      <w:r>
-        <w:rPr>
-          <w:spacing w:val="7"/>
-        </w:rPr>
-        <w:t>n</w:t>
-      </w:r>
-      <w:r>
-        <w:t>,</w:t>
-      </w:r>
-      <w:r>
-        <w:rPr>
-          <w:spacing w:val="10"/>
-        </w:rPr>
-        <w:t xml:space="preserve"> </w:t>
-      </w:r>
-      <w:r>
-        <w:rPr>
-          <w:i/>
-          <w:iCs/>
-          <w:spacing w:val="6"/>
-        </w:rPr>
-        <w:t>Linea</w:t>
-      </w:r>
-      <w:r>
-        <w:rPr>
-          <w:i/>
-          <w:iCs/>
-        </w:rPr>
-        <w:t>r</w:t>
-      </w:r>
-      <w:r>
-        <w:rPr>
-          <w:i/>
-          <w:iCs/>
-          <w:spacing w:val="12"/>
-        </w:rPr>
-        <w:t xml:space="preserve"> </w:t>
-      </w:r>
-      <w:r>
-        <w:rPr>
-          <w:i/>
-          <w:iCs/>
-          <w:spacing w:val="6"/>
-        </w:rPr>
-        <w:t>Network</w:t>
-      </w:r>
-      <w:r>
-        <w:rPr>
-          <w:i/>
-          <w:iCs/>
-        </w:rPr>
-        <w:t>s</w:t>
-      </w:r>
-      <w:r>
-        <w:rPr>
-          <w:i/>
-          <w:iCs/>
-          <w:spacing w:val="12"/>
-        </w:rPr>
-        <w:t xml:space="preserve"> </w:t>
-      </w:r>
-      <w:r>
-        <w:rPr>
-          <w:i/>
-          <w:iCs/>
-          <w:spacing w:val="6"/>
-        </w:rPr>
-        <w:t>an</w:t>
-      </w:r>
-      <w:r>
-        <w:rPr>
-          <w:i/>
-          <w:iCs/>
-        </w:rPr>
-        <w:t>d</w:t>
-      </w:r>
-      <w:r>
-        <w:rPr>
-          <w:i/>
-          <w:iCs/>
-          <w:spacing w:val="11"/>
-        </w:rPr>
-        <w:t xml:space="preserve"> </w:t>
-      </w:r>
-      <w:r>
-        <w:rPr>
-          <w:i/>
-          <w:iCs/>
-          <w:spacing w:val="6"/>
-        </w:rPr>
-        <w:t>Syst</w:t>
-      </w:r>
-      <w:r>
-        <w:rPr>
-          <w:i/>
-          <w:iCs/>
-          <w:spacing w:val="5"/>
-        </w:rPr>
-        <w:t>e</w:t>
-      </w:r>
-      <w:r>
-        <w:rPr>
-          <w:i/>
-          <w:iCs/>
-          <w:spacing w:val="6"/>
-        </w:rPr>
-        <w:t>ms</w:t>
-      </w:r>
-      <w:r>
-        <w:rPr>
-          <w:i/>
-          <w:iCs/>
-        </w:rPr>
-        <w:t>.</w:t>
-      </w:r>
-      <w:r>
-        <w:rPr>
-          <w:i/>
-          <w:iCs/>
-          <w:spacing w:val="13"/>
-        </w:rPr>
-        <w:t xml:space="preserve"> </w:t>
-      </w:r>
-      <w:r>
-        <w:rPr>
-          <w:spacing w:val="5"/>
-        </w:rPr>
-        <w:t>B</w:t>
-      </w:r>
-      <w:r>
-        <w:rPr>
-          <w:spacing w:val="6"/>
-        </w:rPr>
-        <w:t>el</w:t>
-      </w:r>
-      <w:r>
-        <w:rPr>
-          <w:spacing w:val="4"/>
-        </w:rPr>
-        <w:t>m</w:t>
-      </w:r>
-      <w:r>
-        <w:rPr>
-          <w:spacing w:val="6"/>
-        </w:rPr>
-        <w:t>ont</w:t>
-      </w:r>
-      <w:r>
-        <w:t xml:space="preserve">, </w:t>
-      </w:r>
-      <w:r>
-        <w:rPr>
-          <w:spacing w:val="-1"/>
-        </w:rPr>
-        <w:t>C</w:t>
-      </w:r>
-      <w:r>
-        <w:t>A</w:t>
-      </w:r>
-      <w:r>
-        <w:t>, USA</w:t>
-      </w:r>
-      <w:r>
-        <w:t>:</w:t>
-      </w:r>
-      <w:r>
-        <w:rPr>
-          <w:spacing w:val="-1"/>
-        </w:rPr>
-        <w:t xml:space="preserve"> </w:t>
-      </w:r>
-      <w:r>
-        <w:rPr>
-          <w:spacing w:val="2"/>
-        </w:rPr>
-        <w:t>W</w:t>
-      </w:r>
-      <w:r>
-        <w:rPr>
-          <w:spacing w:val="-1"/>
-        </w:rPr>
-        <w:t>a</w:t>
-      </w:r>
-      <w:r>
-        <w:rPr>
-          <w:spacing w:val="1"/>
-        </w:rPr>
-        <w:t>d</w:t>
-      </w:r>
-      <w:r>
-        <w:rPr>
-          <w:spacing w:val="-1"/>
-        </w:rPr>
-        <w:t>s</w:t>
-      </w:r>
-      <w:r>
-        <w:t>w</w:t>
-      </w:r>
-      <w:r>
-        <w:rPr>
-          <w:spacing w:val="-1"/>
-        </w:rPr>
-        <w:t>o</w:t>
-      </w:r>
-      <w:r>
-        <w:t>r</w:t>
-      </w:r>
-      <w:r>
-        <w:rPr>
-          <w:spacing w:val="-2"/>
-        </w:rPr>
-        <w:t>t</w:t>
-      </w:r>
-      <w:r>
-        <w:rPr>
-          <w:spacing w:val="1"/>
-        </w:rPr>
-        <w:t>h</w:t>
-      </w:r>
-      <w:r>
-        <w:t>,</w:t>
-      </w:r>
-      <w:r>
-        <w:rPr>
-          <w:spacing w:val="-1"/>
-        </w:rPr>
-        <w:t xml:space="preserve"> 1</w:t>
-      </w:r>
-      <w:r>
-        <w:rPr>
-          <w:spacing w:val="1"/>
-        </w:rPr>
-        <w:t>9</w:t>
-      </w:r>
-      <w:r>
-        <w:rPr>
-          <w:spacing w:val="-1"/>
-        </w:rPr>
-        <w:t>9</w:t>
-      </w:r>
-      <w:r>
-        <w:rPr>
-          <w:spacing w:val="1"/>
-        </w:rPr>
-        <w:t>3</w:t>
-      </w:r>
-      <w:r>
-        <w:t xml:space="preserve">, </w:t>
-      </w:r>
-      <w:r>
-        <w:rPr>
-          <w:spacing w:val="-1"/>
-        </w:rPr>
-        <w:t>p</w:t>
-      </w:r>
-      <w:r>
-        <w:rPr>
-          <w:spacing w:val="1"/>
-        </w:rPr>
-        <w:t>p</w:t>
-      </w:r>
-      <w:r>
-        <w:t xml:space="preserve">. </w:t>
-      </w:r>
-      <w:r>
-        <w:rPr>
-          <w:spacing w:val="-1"/>
-        </w:rPr>
-        <w:t>12</w:t>
-      </w:r>
-      <w:r>
-        <w:rPr>
-          <w:spacing w:val="1"/>
-        </w:rPr>
-        <w:t>3</w:t>
-      </w:r>
-      <w:r>
-        <w:rPr>
-          <w:spacing w:val="-1"/>
-        </w:rPr>
-        <w:t>–1</w:t>
-      </w:r>
-      <w:r>
-        <w:rPr>
-          <w:spacing w:val="1"/>
-        </w:rPr>
-        <w:t>3</w:t>
-      </w:r>
-      <w:r>
-        <w:rPr>
-          <w:spacing w:val="-1"/>
-        </w:rPr>
-        <w:t>5.</w:t>
-      </w:r>
-    </w:p>
-    <w:p>
-      <w:pPr>
-        <w:widowControl w:val="0"/>
-        <w:autoSpaceDE w:val="0"/>
-        <w:autoSpaceDN w:val="0"/>
-        <w:adjustRightInd w:val="0"/>
-        <w:spacing w:before="1" w:line="230" w:lineRule="exact"/>
-        <w:ind w:left="361" w:right="250" w:hanging="360"/>
-        <w:rPr>
-          <w:color w:val="000000"/>
-        </w:rPr>
-      </w:pPr>
-    </w:p>
-    <w:p>
-      <w:pPr>
-        <w:autoSpaceDE w:val="0"/>
-        <w:autoSpaceDN w:val="0"/>
-        <w:adjustRightInd w:val="0"/>
-        <w:rPr>
-          <w:rFonts w:ascii="TimesNewRomanPS-ItalicMT" w:hAnsi="TimesNewRomanPS-ItalicMT" w:cs="TimesNewRomanPS-ItalicMT"/>
-          <w:i/>
-          <w:iCs/>
-        </w:rPr>
-      </w:pPr>
-      <w:r>
-        <w:rPr>
-          <w:rFonts w:ascii="TimesNewRomanPS-ItalicMT" w:hAnsi="TimesNewRomanPS-ItalicMT" w:cs="TimesNewRomanPS-ItalicMT"/>
-          <w:i/>
-          <w:iCs/>
-        </w:rPr>
-        <w:t>Basic format for periodicals:</w:t>
-      </w:r>
-    </w:p>
-    <w:p>
-      <w:pPr>
-        <w:rPr>
-          <w:sz w:val="16"/>
-          <w:szCs w:val="16"/>
-        </w:rPr>
-      </w:pPr>
-      <w:r>
-        <w:rPr>
-          <w:sz w:val="16"/>
-          <w:szCs w:val="16"/>
-        </w:rPr>
-        <w:t xml:space="preserve">J. K. Author, “Name of paper,” </w:t>
-      </w:r>
-      <w:r>
-        <w:rPr>
-          <w:i/>
-          <w:iCs/>
-          <w:sz w:val="16"/>
-          <w:szCs w:val="16"/>
-        </w:rPr>
-        <w:t>Abbrev. Title of Periodical</w:t>
-      </w:r>
-      <w:r>
-        <w:rPr>
-          <w:sz w:val="16"/>
-          <w:szCs w:val="16"/>
-        </w:rPr>
-        <w:t xml:space="preserve">, </w:t>
-      </w:r>
-      <w:r>
-        <w:rPr>
-          <w:sz w:val="16"/>
-          <w:szCs w:val="16"/>
-        </w:rPr>
-        <w:t xml:space="preserve"> </w:t>
-      </w:r>
-      <w:r>
-        <w:rPr>
-          <w:sz w:val="16"/>
-          <w:szCs w:val="16"/>
-        </w:rPr>
-        <w:t xml:space="preserve">vol. </w:t>
-      </w:r>
-      <w:r>
-        <w:rPr>
-          <w:i/>
-          <w:iCs/>
-          <w:sz w:val="16"/>
-          <w:szCs w:val="16"/>
-        </w:rPr>
-        <w:t xml:space="preserve">x, </w:t>
-      </w:r>
-      <w:r>
-        <w:rPr>
-          <w:i/>
-          <w:iCs/>
-          <w:sz w:val="16"/>
-          <w:szCs w:val="16"/>
-        </w:rPr>
-        <w:t xml:space="preserve">  no</w:t>
-      </w:r>
-      <w:r>
-        <w:rPr>
-          <w:sz w:val="16"/>
-          <w:szCs w:val="16"/>
-        </w:rPr>
-        <w:t xml:space="preserve">. </w:t>
-      </w:r>
-      <w:r>
-        <w:rPr>
-          <w:i/>
-          <w:iCs/>
-          <w:sz w:val="16"/>
-          <w:szCs w:val="16"/>
-        </w:rPr>
-        <w:t xml:space="preserve">x, </w:t>
-      </w:r>
-      <w:r>
-        <w:rPr>
-          <w:sz w:val="16"/>
-          <w:szCs w:val="16"/>
-        </w:rPr>
-        <w:t>pp</w:t>
-      </w:r>
-      <w:r>
-        <w:rPr>
-          <w:i/>
-          <w:iCs/>
-          <w:sz w:val="16"/>
-          <w:szCs w:val="16"/>
-        </w:rPr>
-        <w:t xml:space="preserve">. xxx-xxx, </w:t>
-      </w:r>
-      <w:r>
-        <w:rPr>
-          <w:sz w:val="16"/>
-          <w:szCs w:val="16"/>
-        </w:rPr>
-        <w:t>Abbrev. Month, year</w:t>
-      </w:r>
-      <w:r>
-        <w:rPr>
-          <w:sz w:val="16"/>
-          <w:szCs w:val="16"/>
-        </w:rPr>
-        <w:t>, DOI</w:t>
-      </w:r>
-      <w:r>
-        <w:rPr>
-          <w:sz w:val="16"/>
-          <w:szCs w:val="16"/>
-        </w:rPr>
-        <w:t>.</w:t>
-      </w:r>
-      <w:r>
-        <w:rPr>
-          <w:sz w:val="16"/>
-          <w:szCs w:val="16"/>
-        </w:rPr>
-        <w:t xml:space="preserve"> 10.1109.</w:t>
-      </w:r>
-      <w:r>
-        <w:rPr>
-          <w:i/>
-          <w:sz w:val="16"/>
-          <w:szCs w:val="16"/>
-        </w:rPr>
-        <w:t>XXX</w:t>
-      </w:r>
-      <w:r>
-        <w:rPr>
-          <w:sz w:val="16"/>
-          <w:szCs w:val="16"/>
-        </w:rPr>
-        <w:t>.123456.</w:t>
-      </w:r>
-    </w:p>
-    <w:p>
-      <w:pPr>
-        <w:autoSpaceDE w:val="0"/>
-        <w:autoSpaceDN w:val="0"/>
-        <w:adjustRightInd w:val="0"/>
-        <w:rPr>
-          <w:rFonts w:ascii="TimesNewRomanPSMT" w:hAnsi="TimesNewRomanPSMT" w:cs="TimesNewRomanPSMT"/>
-          <w:i/>
-        </w:rPr>
-      </w:pPr>
-      <w:r>
-        <w:rPr>
-          <w:rFonts w:ascii="TimesNewRomanPSMT" w:hAnsi="TimesNewRomanPSMT" w:cs="TimesNewRomanPSMT"/>
-          <w:i/>
-        </w:rPr>
-        <w:t>E</w:t>
-      </w:r>
-      <w:r>
-        <w:rPr>
-          <w:rFonts w:ascii="TimesNewRomanPSMT" w:hAnsi="TimesNewRomanPSMT" w:cs="TimesNewRomanPSMT"/>
-          <w:i/>
-        </w:rPr>
-        <w:t>xamples</w:t>
-      </w:r>
-      <w:r>
-        <w:rPr>
-          <w:rFonts w:ascii="TimesNewRomanPSMT" w:hAnsi="TimesNewRomanPSMT" w:cs="TimesNewRomanPSMT"/>
-          <w:i/>
-        </w:rPr>
-        <w:t>:</w:t>
-      </w:r>
-    </w:p>
-    <w:p>
-      <w:pPr>
-        <w:pStyle w:val="References"/>
-      </w:pPr>
-      <w:r>
-        <w:t xml:space="preserve">J. U. Duncombe, “Infrared navigation—Part I: An assessment of feasibility,” </w:t>
-      </w:r>
-      <w:r>
-        <w:rPr>
-          <w:i/>
-        </w:rPr>
-        <w:t>IEEE Trans. Electron Devices</w:t>
-      </w:r>
-      <w:r>
-        <w:t xml:space="preserve">, vol. ED-11, </w:t>
-      </w:r>
-      <w:r>
-        <w:t xml:space="preserve">no. 1, </w:t>
-      </w:r>
-      <w:r>
-        <w:t>pp. 34–39, Jan. 1959</w:t>
-      </w:r>
-      <w:r>
-        <w:t>,</w:t>
-      </w:r>
-      <w:r>
-        <w:rPr>
-          <w:rFonts w:ascii="Times-Roman" w:hAnsi="Times-Roman" w:cs="Times-Roman"/>
-        </w:rPr>
-        <w:t xml:space="preserve"> </w:t>
-      </w:r>
-      <w:r>
-        <w:rPr>
-          <w:rFonts w:ascii="Times-Roman" w:hAnsi="Times-Roman" w:cs="Times-Roman"/>
-        </w:rPr>
-        <w:t>10.1109/TED.2016.2628402</w:t>
-      </w:r>
-      <w:r>
-        <w:t>.</w:t>
-      </w:r>
-    </w:p>
-    <w:p>
-      <w:pPr>
-        <w:widowControl w:val="0"/>
-        <w:autoSpaceDE w:val="0"/>
-        <w:autoSpaceDN w:val="0"/>
-        <w:adjustRightInd w:val="0"/>
-        <w:spacing w:line="229" w:lineRule="exact"/>
-        <w:ind w:left="361" w:right="-20"/>
-        <w:rPr>
-          <w:color w:val="000000"/>
-        </w:rPr>
-      </w:pPr>
-    </w:p>
-    <w:p>
-      <w:pPr>
-        <w:autoSpaceDE w:val="0"/>
-        <w:autoSpaceDN w:val="0"/>
-        <w:adjustRightInd w:val="0"/>
-        <w:rPr>
-          <w:rFonts w:ascii="TimesNewRomanPS-ItalicMT" w:hAnsi="TimesNewRomanPS-ItalicMT" w:cs="TimesNewRomanPS-ItalicMT"/>
-          <w:i/>
-          <w:iCs/>
-        </w:rPr>
-      </w:pPr>
-      <w:r>
-        <w:rPr>
-          <w:rFonts w:ascii="TimesNewRomanPS-ItalicMT" w:hAnsi="TimesNewRomanPS-ItalicMT" w:cs="TimesNewRomanPS-ItalicMT"/>
-          <w:i/>
-          <w:iCs/>
-        </w:rPr>
-        <w:t>Basic format for reports:</w:t>
-      </w:r>
-    </w:p>
-    <w:p>
-      <w:pPr>
-        <w:rPr>
-          <w:sz w:val="16"/>
-          <w:szCs w:val="16"/>
-        </w:rPr>
-      </w:pPr>
-      <w:r>
-        <w:rPr>
-          <w:sz w:val="16"/>
-          <w:szCs w:val="16"/>
-        </w:rPr>
-        <w:t>J. K. Author, “Title of report,” Abbrev. Na</w:t>
-      </w:r>
-      <w:r>
-        <w:rPr>
-          <w:sz w:val="16"/>
-          <w:szCs w:val="16"/>
-        </w:rPr>
-        <w:t>me of Co., City of Co., Abbrev. S</w:t>
-      </w:r>
-      <w:r>
-        <w:rPr>
-          <w:sz w:val="16"/>
-          <w:szCs w:val="16"/>
-        </w:rPr>
-        <w:t xml:space="preserve">tate, </w:t>
-      </w:r>
-      <w:r>
-        <w:rPr>
-          <w:sz w:val="16"/>
-          <w:szCs w:val="16"/>
-        </w:rPr>
-        <w:t xml:space="preserve">Country, </w:t>
-      </w:r>
-      <w:r>
-        <w:rPr>
-          <w:sz w:val="16"/>
-          <w:szCs w:val="16"/>
-        </w:rPr>
-        <w:t xml:space="preserve">Rep. </w:t>
-      </w:r>
-      <w:r>
-        <w:rPr>
-          <w:i/>
-          <w:iCs/>
-          <w:sz w:val="16"/>
-          <w:szCs w:val="16"/>
-        </w:rPr>
-        <w:t>xxx</w:t>
-      </w:r>
-      <w:r>
-        <w:rPr>
-          <w:sz w:val="16"/>
-          <w:szCs w:val="16"/>
-        </w:rPr>
-        <w:t>, year.</w:t>
-      </w:r>
-    </w:p>
-    <w:p>
-      <w:pPr>
-        <w:autoSpaceDE w:val="0"/>
-        <w:autoSpaceDN w:val="0"/>
-        <w:adjustRightInd w:val="0"/>
-        <w:rPr>
-          <w:rFonts w:ascii="TimesNewRomanPS-ItalicMT" w:hAnsi="TimesNewRomanPS-ItalicMT" w:cs="TimesNewRomanPS-ItalicMT"/>
-          <w:i/>
-          <w:iCs/>
-        </w:rPr>
-      </w:pPr>
-      <w:r>
-        <w:rPr>
-          <w:rFonts w:ascii="TimesNewRomanPS-ItalicMT" w:hAnsi="TimesNewRomanPS-ItalicMT" w:cs="TimesNewRomanPS-ItalicMT"/>
-          <w:i/>
-          <w:iCs/>
-        </w:rPr>
-        <w:t>Examples:</w:t>
-      </w:r>
-    </w:p>
-    <w:p>
-      <w:pPr>
-        <w:pStyle w:val="References"/>
-      </w:pPr>
-      <w:r>
-        <w:t>E. E. Reber, R. L. Michell, and C. J. Carter, “Oxygen absorption in the eart</w:t>
-      </w:r>
-      <w:r>
-        <w:t>h’s atmosphere,” Aerospace Corp</w:t>
-      </w:r>
-      <w:r>
-        <w:t>.</w:t>
-      </w:r>
-      <w:r>
-        <w:t>, Los</w:t>
-      </w:r>
-      <w:r>
-        <w:t xml:space="preserve"> </w:t>
-      </w:r>
-      <w:r>
-        <w:t>Angeles, CA</w:t>
-      </w:r>
-      <w:r>
-        <w:t>, USA</w:t>
-      </w:r>
-      <w:r>
-        <w:t>, Tech. Rep. TR-0200 (4230-46)-3, Nov. 1988.</w:t>
-      </w:r>
-    </w:p>
-    <w:p>
-      <w:pPr>
-        <w:autoSpaceDE w:val="0"/>
-        <w:autoSpaceDN w:val="0"/>
-        <w:adjustRightInd w:val="0"/>
-        <w:rPr>
-          <w:rFonts w:ascii="TimesNewRomanPSMT" w:hAnsi="TimesNewRomanPSMT" w:cs="TimesNewRomanPSMT"/>
-        </w:rPr>
-      </w:pPr>
-    </w:p>
-    <w:p>
-      <w:pPr>
-        <w:autoSpaceDE w:val="0"/>
-        <w:autoSpaceDN w:val="0"/>
-        <w:adjustRightInd w:val="0"/>
-        <w:rPr>
-          <w:color w:val="000000"/>
-        </w:rPr>
-      </w:pPr>
-    </w:p>
-    <w:p>
-      <w:pPr>
-        <w:widowControl w:val="0"/>
-        <w:autoSpaceDE w:val="0"/>
-        <w:autoSpaceDN w:val="0"/>
-        <w:adjustRightInd w:val="0"/>
-        <w:spacing w:line="227" w:lineRule="exact"/>
-        <w:ind w:right="-68"/>
+      </w:pPr>
+      <w:r>
         <w:rPr>
           <w:i/>
           <w:iCs/>
           <w:color w:val="000000"/>
-          <w:spacing w:val="35"/>
-        </w:rPr>
-      </w:pPr>
-      <w:r>
-        <w:rPr>
-          <w:i/>
-          <w:iCs/>
-          <w:color w:val="000000"/>
-        </w:rPr>
-        <w:t>Basic format for books (when available online):</w:t>
-      </w:r>
-      <w:r>
-        <w:rPr>
-          <w:i/>
-          <w:iCs/>
-          <w:color w:val="000000"/>
-          <w:spacing w:val="35"/>
-        </w:rPr>
-        <w:t xml:space="preserve"> </w:t>
-      </w:r>
-    </w:p>
-    <w:p>
-      <w:pPr>
-        <w:autoSpaceDE w:val="0"/>
-        <w:autoSpaceDN w:val="0"/>
-        <w:adjustRightInd w:val="0"/>
-        <w:jc w:val="both"/>
-        <w:rPr>
-          <w:color w:val="000000"/>
-          <w:sz w:val="16"/>
-          <w:szCs w:val="16"/>
-        </w:rPr>
-      </w:pPr>
-      <w:r>
-        <w:rPr>
-          <w:color w:val="000000"/>
-          <w:sz w:val="16"/>
-          <w:szCs w:val="16"/>
-        </w:rPr>
-        <w:t xml:space="preserve"> </w:t>
-      </w:r>
-      <w:r>
-        <w:rPr>
-          <w:color w:val="000000"/>
-          <w:sz w:val="16"/>
-          <w:szCs w:val="16"/>
-        </w:rPr>
-        <w:t xml:space="preserve">J. K. Author, “Title of chapter in the book,” in </w:t>
-      </w:r>
-      <w:r>
-        <w:rPr>
-          <w:i/>
-          <w:iCs/>
-          <w:color w:val="000000"/>
-          <w:sz w:val="16"/>
-          <w:szCs w:val="16"/>
-        </w:rPr>
-        <w:t xml:space="preserve">Title of Published </w:t>
-      </w:r>
-      <w:r>
-        <w:rPr>
-          <w:i/>
-          <w:iCs/>
-          <w:color w:val="000000"/>
-          <w:sz w:val="16"/>
-          <w:szCs w:val="16"/>
-        </w:rPr>
-        <w:t>B</w:t>
-      </w:r>
-      <w:r>
-        <w:rPr>
-          <w:i/>
-          <w:iCs/>
-          <w:color w:val="000000"/>
-          <w:sz w:val="16"/>
-          <w:szCs w:val="16"/>
-        </w:rPr>
-        <w:t>ook</w:t>
-      </w:r>
-      <w:r>
-        <w:rPr>
-          <w:color w:val="000000"/>
-          <w:sz w:val="16"/>
-          <w:szCs w:val="16"/>
-        </w:rPr>
-        <w:t xml:space="preserve">, </w:t>
-      </w:r>
-      <w:proofErr w:type="spellStart"/>
-      <w:r>
-        <w:rPr>
-          <w:i/>
-          <w:color w:val="000000"/>
-          <w:sz w:val="16"/>
-          <w:szCs w:val="16"/>
-        </w:rPr>
-        <w:t>x</w:t>
-      </w:r>
-      <w:r>
-        <w:rPr>
-          <w:color w:val="000000"/>
-          <w:sz w:val="16"/>
-          <w:szCs w:val="16"/>
-        </w:rPr>
-        <w:t>th</w:t>
-      </w:r>
-      <w:proofErr w:type="spellEnd"/>
-      <w:r>
-        <w:rPr>
-          <w:color w:val="000000"/>
-          <w:sz w:val="16"/>
-          <w:szCs w:val="16"/>
-        </w:rPr>
-        <w:t xml:space="preserve"> </w:t>
-      </w:r>
-      <w:r>
-        <w:rPr>
-          <w:color w:val="000000"/>
-          <w:sz w:val="16"/>
-          <w:szCs w:val="16"/>
-        </w:rPr>
-        <w:t xml:space="preserve">ed. City of Publisher, State, Country: Abbrev. of Publisher, year, </w:t>
-      </w:r>
-      <w:proofErr w:type="spellStart"/>
-      <w:r>
-        <w:rPr>
-          <w:color w:val="000000"/>
-          <w:sz w:val="16"/>
-          <w:szCs w:val="16"/>
-        </w:rPr>
-        <w:t>ch.</w:t>
-      </w:r>
-      <w:proofErr w:type="spellEnd"/>
-      <w:r>
-        <w:rPr>
-          <w:i/>
-          <w:color w:val="000000"/>
-          <w:sz w:val="16"/>
-          <w:szCs w:val="16"/>
-        </w:rPr>
-        <w:t xml:space="preserve"> x</w:t>
-      </w:r>
-      <w:r>
-        <w:rPr>
-          <w:color w:val="000000"/>
-          <w:sz w:val="16"/>
-          <w:szCs w:val="16"/>
-        </w:rPr>
-        <w:t xml:space="preserve">, sec. </w:t>
-      </w:r>
-      <w:r>
-        <w:rPr>
-          <w:i/>
-          <w:color w:val="000000"/>
-          <w:sz w:val="16"/>
-          <w:szCs w:val="16"/>
-        </w:rPr>
-        <w:t>x</w:t>
-      </w:r>
-      <w:r>
-        <w:rPr>
-          <w:color w:val="000000"/>
-          <w:sz w:val="16"/>
-          <w:szCs w:val="16"/>
-        </w:rPr>
-        <w:t xml:space="preserve">, pp. </w:t>
-      </w:r>
-      <w:r>
-        <w:rPr>
-          <w:i/>
-          <w:color w:val="000000"/>
-          <w:sz w:val="16"/>
-          <w:szCs w:val="16"/>
-        </w:rPr>
-        <w:t>xxx–xxx</w:t>
-      </w:r>
-      <w:r>
-        <w:rPr>
-          <w:color w:val="000000"/>
-          <w:sz w:val="16"/>
-          <w:szCs w:val="16"/>
-        </w:rPr>
-        <w:t xml:space="preserve">. [Online]. Available: http://www.web.com </w:t>
-      </w:r>
-    </w:p>
-    <w:p>
-      <w:pPr>
-        <w:widowControl w:val="0"/>
-        <w:autoSpaceDE w:val="0"/>
-        <w:autoSpaceDN w:val="0"/>
-        <w:adjustRightInd w:val="0"/>
-        <w:spacing w:before="37"/>
-        <w:ind w:right="-20"/>
-        <w:rPr>
-          <w:color w:val="000000"/>
-        </w:rPr>
-      </w:pPr>
-      <w:r>
-        <w:rPr>
-          <w:i/>
-          <w:iCs/>
-          <w:color w:val="000000"/>
-        </w:rPr>
-        <w:t>Example</w:t>
-      </w:r>
-      <w:r>
-        <w:rPr>
-          <w:i/>
-          <w:iCs/>
-          <w:color w:val="000000"/>
-        </w:rPr>
-        <w:t>s</w:t>
-      </w:r>
-      <w:r>
-        <w:rPr>
-          <w:i/>
-          <w:iCs/>
-          <w:color w:val="000000"/>
-        </w:rPr>
-        <w:t>:</w:t>
-      </w:r>
-    </w:p>
-    <w:p>
-      <w:pPr>
-        <w:pStyle w:val="References"/>
-      </w:pPr>
-      <w:r>
-        <w:rPr>
-          <w:color w:val="191919"/>
-        </w:rPr>
-        <w:t>Philip B. Kurla</w:t>
-      </w:r>
-      <w:r>
-        <w:t>nd</w:t>
-      </w:r>
-      <w:r>
-        <w:t xml:space="preserve"> and Ralph Lerner, eds., </w:t>
-      </w:r>
-      <w:r>
-        <w:rPr>
-          <w:i/>
-          <w:iCs/>
-        </w:rPr>
-        <w:t xml:space="preserve">The Founders’ Constitution. </w:t>
-      </w:r>
-      <w:r>
-        <w:t xml:space="preserve">Chicago, IL, USA: Univ. of Chicago Press, 1987, Accessed on: Feb. 28, 2010, [Online] Available: http://press-pubs.uchicago.edu/founders/ </w:t>
-      </w:r>
-    </w:p>
-    <w:p>
-      <w:pPr>
-        <w:widowControl w:val="0"/>
-        <w:autoSpaceDE w:val="0"/>
-        <w:autoSpaceDN w:val="0"/>
-        <w:adjustRightInd w:val="0"/>
-        <w:spacing w:before="5" w:line="140" w:lineRule="exact"/>
-        <w:rPr>
-          <w:color w:val="000000"/>
-          <w:sz w:val="14"/>
-          <w:szCs w:val="14"/>
-        </w:rPr>
-      </w:pPr>
-    </w:p>
-    <w:p>
-      <w:pPr>
-        <w:widowControl w:val="0"/>
-        <w:autoSpaceDE w:val="0"/>
-        <w:autoSpaceDN w:val="0"/>
-        <w:adjustRightInd w:val="0"/>
-        <w:spacing w:line="239" w:lineRule="auto"/>
-        <w:ind w:right="358"/>
-        <w:rPr>
-          <w:i/>
-          <w:iCs/>
-          <w:color w:val="000000"/>
-        </w:rPr>
-      </w:pPr>
-      <w:r>
-        <w:rPr>
-          <w:i/>
-          <w:iCs/>
-          <w:color w:val="000000"/>
-        </w:rPr>
-        <w:t>Basic format for j</w:t>
-      </w:r>
-      <w:r>
-        <w:rPr>
-          <w:i/>
-          <w:iCs/>
-          <w:color w:val="000000"/>
-          <w:spacing w:val="1"/>
-        </w:rPr>
-        <w:t>o</w:t>
-      </w:r>
-      <w:r>
-        <w:rPr>
-          <w:i/>
-          <w:iCs/>
-          <w:color w:val="000000"/>
-        </w:rPr>
-        <w:t>urn</w:t>
-      </w:r>
-      <w:r>
-        <w:rPr>
-          <w:i/>
-          <w:iCs/>
-          <w:color w:val="000000"/>
-          <w:spacing w:val="1"/>
-        </w:rPr>
-        <w:t>a</w:t>
-      </w:r>
-      <w:r>
-        <w:rPr>
-          <w:i/>
-          <w:iCs/>
-          <w:color w:val="000000"/>
-        </w:rPr>
-        <w:t>ls (when available online):</w:t>
-      </w:r>
-    </w:p>
-    <w:p>
-      <w:pPr>
-        <w:rPr>
-          <w:sz w:val="16"/>
-          <w:szCs w:val="16"/>
-        </w:rPr>
-      </w:pPr>
-      <w:r>
-        <w:rPr>
-          <w:sz w:val="16"/>
-          <w:szCs w:val="16"/>
-        </w:rPr>
-        <w:t xml:space="preserve">J. K. Author, “Name of paper,” </w:t>
-      </w:r>
-      <w:r>
-        <w:rPr>
-          <w:i/>
-          <w:iCs/>
-          <w:sz w:val="16"/>
-          <w:szCs w:val="16"/>
-        </w:rPr>
-        <w:t>Abbrev. Title of Periodical</w:t>
-      </w:r>
-      <w:r>
-        <w:rPr>
-          <w:sz w:val="16"/>
-          <w:szCs w:val="16"/>
-        </w:rPr>
-        <w:t xml:space="preserve">, vol. </w:t>
-      </w:r>
-      <w:r>
-        <w:rPr>
-          <w:i/>
-          <w:sz w:val="16"/>
-          <w:szCs w:val="16"/>
-        </w:rPr>
-        <w:t>x</w:t>
-      </w:r>
-      <w:r>
-        <w:rPr>
-          <w:sz w:val="16"/>
-          <w:szCs w:val="16"/>
-        </w:rPr>
-        <w:t xml:space="preserve">, no. </w:t>
-      </w:r>
-      <w:r>
-        <w:rPr>
-          <w:i/>
-          <w:sz w:val="16"/>
-          <w:szCs w:val="16"/>
-        </w:rPr>
-        <w:t>x</w:t>
-      </w:r>
-      <w:r>
-        <w:rPr>
-          <w:sz w:val="16"/>
-          <w:szCs w:val="16"/>
-        </w:rPr>
-        <w:t xml:space="preserve">, pp. </w:t>
-      </w:r>
-      <w:r>
-        <w:rPr>
-          <w:i/>
-          <w:sz w:val="16"/>
-          <w:szCs w:val="16"/>
-        </w:rPr>
-        <w:t>xxx-xxx</w:t>
-      </w:r>
-      <w:r>
-        <w:rPr>
-          <w:sz w:val="16"/>
-          <w:szCs w:val="16"/>
-        </w:rPr>
-        <w:t>, Abbrev. Month, year. Accessed on: Month, Day, year, DOI: 10.1109.</w:t>
-      </w:r>
-      <w:r>
-        <w:rPr>
-          <w:i/>
-          <w:sz w:val="16"/>
-          <w:szCs w:val="16"/>
-        </w:rPr>
-        <w:t>XXX</w:t>
-      </w:r>
-      <w:r>
-        <w:rPr>
-          <w:sz w:val="16"/>
-          <w:szCs w:val="16"/>
-        </w:rPr>
-        <w:t>.123456, [Online].</w:t>
-      </w:r>
-      <w:r>
-        <w:rPr>
-          <w:sz w:val="16"/>
-          <w:szCs w:val="16"/>
-        </w:rPr>
-        <w:t xml:space="preserve"> </w:t>
-      </w:r>
-    </w:p>
-    <w:p>
-      <w:pPr>
-        <w:widowControl w:val="0"/>
-        <w:autoSpaceDE w:val="0"/>
-        <w:autoSpaceDN w:val="0"/>
-        <w:adjustRightInd w:val="0"/>
-        <w:spacing w:line="239" w:lineRule="auto"/>
-        <w:ind w:right="358"/>
-        <w:rPr>
-          <w:color w:val="000000"/>
-        </w:rPr>
-      </w:pPr>
-      <w:r>
-        <w:rPr>
-          <w:i/>
-          <w:iCs/>
-          <w:color w:val="000000"/>
-        </w:rPr>
-        <w:t>Example</w:t>
-      </w:r>
-      <w:r>
-        <w:rPr>
-          <w:i/>
-          <w:iCs/>
-          <w:color w:val="000000"/>
-        </w:rPr>
-        <w:t>s</w:t>
-      </w:r>
-      <w:r>
-        <w:rPr>
-          <w:i/>
-          <w:iCs/>
-          <w:color w:val="000000"/>
-        </w:rPr>
-        <w:t>:</w:t>
-      </w:r>
-    </w:p>
-    <w:p>
-      <w:pPr>
-        <w:pStyle w:val="References"/>
-      </w:pPr>
-      <w:r>
-        <w:rPr>
-          <w:color w:val="000000"/>
-        </w:rPr>
-        <w:t xml:space="preserve">W. P. Risk, G. S. Kino, and H. J. Shaw, “Fiber-optic frequency shifter using a surface acoustic wave incident at an oblique angle,” </w:t>
-      </w:r>
-      <w:r>
-        <w:rPr>
-          <w:i/>
-          <w:iCs/>
-          <w:color w:val="000000"/>
-        </w:rPr>
-        <w:t>Opt. Lett.</w:t>
-      </w:r>
-      <w:r>
-        <w:rPr>
-          <w:color w:val="000000"/>
-        </w:rPr>
-        <w:t>, vol. 11, no. 2, pp. 115–117, Feb. 1986.</w:t>
-      </w:r>
-    </w:p>
-    <w:p>
-      <w:pPr>
-        <w:widowControl w:val="0"/>
-        <w:autoSpaceDE w:val="0"/>
-        <w:autoSpaceDN w:val="0"/>
-        <w:adjustRightInd w:val="0"/>
-        <w:spacing w:line="239" w:lineRule="auto"/>
-        <w:ind w:right="-54"/>
-        <w:jc w:val="both"/>
-        <w:rPr>
-          <w:i/>
-          <w:iCs/>
-          <w:color w:val="000000"/>
-        </w:rPr>
-      </w:pPr>
+        </w:rPr>
+        <w:t>Examples:</w:t>
+      </w:r>
     </w:p>
     <w:p>
       <w:pPr>
@@ -6382,507 +4006,209 @@
         <w:adjustRightInd w:val="0"/>
         <w:ind w:right="-20"/>
         <w:rPr>
-          <w:color w:val="000000"/>
-        </w:rPr>
-      </w:pPr>
-      <w:r>
-        <w:rPr>
-          <w:rFonts w:ascii="TimesNewRomanPS-ItalicMT" w:hAnsi="TimesNewRomanPS-ItalicMT" w:cs="TimesNewRomanPS-ItalicMT"/>
-          <w:i/>
-          <w:iCs/>
-        </w:rPr>
-        <w:t>Basic format</w:t>
-      </w:r>
-      <w:r>
-        <w:rPr>
           <w:i/>
           <w:iCs/>
           <w:color w:val="000000"/>
         </w:rPr>
-        <w:t xml:space="preserve"> for confer</w:t>
-      </w:r>
-      <w:r>
-        <w:rPr>
-          <w:i/>
-          <w:iCs/>
-          <w:color w:val="000000"/>
-          <w:spacing w:val="-1"/>
-        </w:rPr>
-        <w:t>e</w:t>
-      </w:r>
-      <w:r>
-        <w:rPr>
-          <w:i/>
-          <w:iCs/>
-          <w:color w:val="000000"/>
-          <w:spacing w:val="1"/>
-        </w:rPr>
-        <w:t>n</w:t>
-      </w:r>
-      <w:r>
-        <w:rPr>
-          <w:i/>
-          <w:iCs/>
-          <w:color w:val="000000"/>
-        </w:rPr>
-        <w:t>ce p</w:t>
-      </w:r>
-      <w:r>
-        <w:rPr>
-          <w:i/>
-          <w:iCs/>
-          <w:color w:val="000000"/>
-          <w:spacing w:val="-1"/>
-        </w:rPr>
-        <w:t>r</w:t>
-      </w:r>
-      <w:r>
-        <w:rPr>
-          <w:i/>
-          <w:iCs/>
-          <w:color w:val="000000"/>
-        </w:rPr>
-        <w:t>oceed</w:t>
-      </w:r>
-      <w:r>
-        <w:rPr>
-          <w:i/>
-          <w:iCs/>
-          <w:color w:val="000000"/>
-          <w:spacing w:val="-2"/>
-        </w:rPr>
-        <w:t>i</w:t>
-      </w:r>
-      <w:r>
-        <w:rPr>
-          <w:i/>
-          <w:iCs/>
-          <w:color w:val="000000"/>
-          <w:spacing w:val="1"/>
-        </w:rPr>
-        <w:t>n</w:t>
-      </w:r>
-      <w:r>
-        <w:rPr>
-          <w:i/>
-          <w:iCs/>
-          <w:color w:val="000000"/>
-        </w:rPr>
-        <w:t>gs (published</w:t>
-      </w:r>
-      <w:r>
-        <w:rPr>
-          <w:i/>
-          <w:iCs/>
-          <w:color w:val="000000"/>
-          <w:spacing w:val="-2"/>
-        </w:rPr>
-        <w:t>)</w:t>
-      </w:r>
-      <w:r>
-        <w:rPr>
-          <w:i/>
-          <w:iCs/>
-          <w:color w:val="000000"/>
-        </w:rPr>
-        <w:t>:</w:t>
-      </w:r>
-    </w:p>
-    <w:p>
-      <w:pPr>
-        <w:rPr>
-          <w:i/>
-          <w:iCs/>
-          <w:sz w:val="16"/>
-          <w:szCs w:val="16"/>
-        </w:rPr>
-      </w:pPr>
-      <w:r>
-        <w:rPr>
-          <w:sz w:val="16"/>
-          <w:szCs w:val="16"/>
-        </w:rPr>
-        <w:lastRenderedPageBreak/>
-        <w:t xml:space="preserve">J. K. Author, “Title of paper,” in </w:t>
-      </w:r>
-      <w:r>
-        <w:rPr>
-          <w:i/>
-          <w:iCs/>
-          <w:sz w:val="16"/>
-          <w:szCs w:val="16"/>
-        </w:rPr>
-        <w:t>Abbreviated Name of Conf.</w:t>
-      </w:r>
-      <w:r>
-        <w:rPr>
-          <w:sz w:val="16"/>
-          <w:szCs w:val="16"/>
-        </w:rPr>
-        <w:t xml:space="preserve">, City of Conf., Abbrev. State (if given), </w:t>
-      </w:r>
-      <w:r>
-        <w:rPr>
-          <w:sz w:val="16"/>
-          <w:szCs w:val="16"/>
-        </w:rPr>
-        <w:t xml:space="preserve">Country, </w:t>
-      </w:r>
-      <w:r>
-        <w:rPr>
-          <w:sz w:val="16"/>
-          <w:szCs w:val="16"/>
-        </w:rPr>
-        <w:t xml:space="preserve">year, pp. </w:t>
-      </w:r>
-      <w:proofErr w:type="spellStart"/>
-      <w:r>
-        <w:rPr>
-          <w:i/>
-          <w:iCs/>
-          <w:sz w:val="16"/>
-          <w:szCs w:val="16"/>
-        </w:rPr>
-        <w:t>xxxxxx</w:t>
-      </w:r>
-      <w:proofErr w:type="spellEnd"/>
-      <w:r>
-        <w:rPr>
-          <w:i/>
-          <w:iCs/>
-          <w:sz w:val="16"/>
-          <w:szCs w:val="16"/>
-        </w:rPr>
-        <w:t>.</w:t>
-      </w:r>
-    </w:p>
-    <w:p>
-      <w:pPr>
+      </w:pPr>
+    </w:p>
+    <w:p>
+      <w:pPr>
+        <w:widowControl w:val="0"/>
         <w:autoSpaceDE w:val="0"/>
         <w:autoSpaceDN w:val="0"/>
         <w:adjustRightInd w:val="0"/>
-        <w:rPr>
-          <w:rFonts w:ascii="TimesNewRomanPS-ItalicMT" w:hAnsi="TimesNewRomanPS-ItalicMT" w:cs="TimesNewRomanPS-ItalicMT"/>
+        <w:ind w:right="-20"/>
+        <w:rPr>
+          <w:color w:val="000000"/>
+        </w:rPr>
+      </w:pPr>
+    </w:p>
+    <w:p>
+      <w:pPr>
+        <w:pStyle w:val="References"/>
+      </w:pPr>
+      <w:r>
+        <w:t>Chen, S. Davis, H. Jiang, and A. Novobilski, “CUDA-Based Genetic Algorithm on Traveling Salesman Problem,” in Computer and Information Science 2011, R. Lee, Ed. Berlin, Germany: Springer, 2011, pp. 241–252.</w:t>
+      </w:r>
+    </w:p>
+    <w:p>
+      <w:pPr>
+        <w:pStyle w:val="References"/>
+      </w:pPr>
+      <w:r>
+        <w:t>M. BinJubier, M. A. Ismail, E. H. Tusher, and M. Aljanabi, “A GPU Accelerated Parallel Genetic Algorithm for the Traveling Salesman Problem,” Journal of Soft Computing and Data Mining, vol. 5, no. 2, pp. 137–150, 2024, doi: 10.30880/jscdm.2024.05.02.010.</w:t>
+      </w:r>
+    </w:p>
+    <w:p>
+      <w:pPr>
+        <w:pStyle w:val="References"/>
+      </w:pPr>
+      <w:r>
+        <w:t>W.-B. Qiao, J.-C. Créput, N. Wang, K. Meng, and A. Mansouri, “Breaking TSP Local Search Barriers: Scalable Multi-GPU Parallelisation of 4-opt, 5-opt, 6-opt and Hybrid Variable λ-opt,” Expert Systems With Applications, vol. 296, Art. no. 129110, 2026, doi: 10.1016/j.eswa.2025.129110.</w:t>
+      </w:r>
+      <w:r>
+        <w:t>G.</w:t>
+      </w:r>
+      <w:r>
+        <w:rPr>
+          <w:spacing w:val="1"/>
+        </w:rPr>
+        <w:t xml:space="preserve"> </w:t>
+      </w:r>
+      <w:r>
+        <w:t>O.</w:t>
+      </w:r>
+      <w:r>
+        <w:rPr>
+          <w:spacing w:val="1"/>
+        </w:rPr>
+        <w:t xml:space="preserve"> </w:t>
+      </w:r>
+      <w:r>
+        <w:t>Y</w:t>
+      </w:r>
+      <w:r>
+        <w:rPr>
+          <w:spacing w:val="1"/>
+        </w:rPr>
+        <w:t>o</w:t>
+      </w:r>
+      <w:r>
+        <w:t>un</w:t>
+      </w:r>
+      <w:r>
+        <w:rPr>
+          <w:spacing w:val="1"/>
+        </w:rPr>
+        <w:t>g</w:t>
+      </w:r>
+      <w:r>
+        <w:t>,</w:t>
+      </w:r>
+      <w:r>
+        <w:rPr>
+          <w:spacing w:val="1"/>
+        </w:rPr>
+        <w:t xml:space="preserve"> </w:t>
+      </w:r>
+      <w:r>
+        <w:t>“Sy</w:t>
+      </w:r>
+      <w:r>
+        <w:rPr>
+          <w:spacing w:val="1"/>
+        </w:rPr>
+        <w:t>n</w:t>
+      </w:r>
+      <w:r>
+        <w:t>t</w:t>
+      </w:r>
+      <w:r>
+        <w:rPr>
+          <w:spacing w:val="1"/>
+        </w:rPr>
+        <w:t>h</w:t>
+      </w:r>
+      <w:r>
+        <w:t>etic</w:t>
+      </w:r>
+      <w:r>
+        <w:rPr>
+          <w:spacing w:val="1"/>
+        </w:rPr>
+        <w:t xml:space="preserve"> </w:t>
+      </w:r>
+      <w:r>
+        <w:t>str</w:t>
+      </w:r>
+      <w:r>
+        <w:rPr>
+          <w:spacing w:val="1"/>
+        </w:rPr>
+        <w:t>u</w:t>
+      </w:r>
+      <w:r>
+        <w:t>ct</w:t>
+      </w:r>
+      <w:r>
+        <w:rPr>
+          <w:spacing w:val="1"/>
+        </w:rPr>
+        <w:t>ur</w:t>
+      </w:r>
+      <w:r>
+        <w:t>e</w:t>
+      </w:r>
+      <w:r>
+        <w:rPr>
+          <w:spacing w:val="1"/>
+        </w:rPr>
+        <w:t xml:space="preserve"> </w:t>
+      </w:r>
+      <w:r>
+        <w:t>of</w:t>
+      </w:r>
+      <w:r>
+        <w:rPr>
+          <w:spacing w:val="1"/>
+        </w:rPr>
+        <w:t xml:space="preserve"> </w:t>
+      </w:r>
+      <w:r>
+        <w:t>i</w:t>
+      </w:r>
+      <w:r>
+        <w:rPr>
+          <w:spacing w:val="1"/>
+        </w:rPr>
+        <w:t>n</w:t>
+      </w:r>
+      <w:r>
+        <w:t>d</w:t>
+      </w:r>
+      <w:r>
+        <w:rPr>
+          <w:spacing w:val="1"/>
+        </w:rPr>
+        <w:t>u</w:t>
+      </w:r>
+      <w:r>
+        <w:t>str</w:t>
+      </w:r>
+      <w:r>
+        <w:rPr>
+          <w:spacing w:val="-2"/>
+        </w:rPr>
+        <w:t>i</w:t>
+      </w:r>
+      <w:r>
+        <w:t>al</w:t>
+      </w:r>
+      <w:r>
+        <w:rPr>
+          <w:spacing w:val="1"/>
+        </w:rPr>
+        <w:t xml:space="preserve"> p</w:t>
+      </w:r>
+      <w:r>
+        <w:t>lastics,”</w:t>
+      </w:r>
+      <w:r>
+        <w:rPr>
+          <w:spacing w:val="1"/>
+        </w:rPr>
+        <w:t xml:space="preserve"> </w:t>
+      </w:r>
+      <w:r>
+        <w:t xml:space="preserve">in </w:t>
+      </w:r>
+      <w:r>
+        <w:rPr>
           <w:i/>
           <w:iCs/>
         </w:rPr>
-      </w:pPr>
-      <w:r>
-        <w:rPr>
-          <w:rFonts w:ascii="TimesNewRomanPS-ItalicMT" w:hAnsi="TimesNewRomanPS-ItalicMT" w:cs="TimesNewRomanPS-ItalicMT"/>
-          <w:i/>
-          <w:iCs/>
-        </w:rPr>
-        <w:t>Example</w:t>
-      </w:r>
-      <w:r>
-        <w:rPr>
-          <w:rFonts w:ascii="TimesNewRomanPS-ItalicMT" w:hAnsi="TimesNewRomanPS-ItalicMT" w:cs="TimesNewRomanPS-ItalicMT"/>
-          <w:i/>
-          <w:iCs/>
-        </w:rPr>
-        <w:t>:</w:t>
-      </w:r>
-    </w:p>
-    <w:p>
-      <w:pPr>
-        <w:pStyle w:val="References"/>
-      </w:pPr>
-      <w:r>
-        <w:t xml:space="preserve">D. </w:t>
-      </w:r>
-      <w:r>
-        <w:rPr>
-          <w:spacing w:val="-1"/>
-        </w:rPr>
-        <w:t>B</w:t>
-      </w:r>
-      <w:r>
-        <w:t>. Pa</w:t>
-      </w:r>
-      <w:r>
-        <w:rPr>
-          <w:spacing w:val="-1"/>
-        </w:rPr>
-        <w:t>y</w:t>
-      </w:r>
-      <w:r>
-        <w:rPr>
-          <w:spacing w:val="1"/>
-        </w:rPr>
-        <w:t>n</w:t>
-      </w:r>
-      <w:r>
-        <w:t xml:space="preserve">e </w:t>
-      </w:r>
-      <w:r>
-        <w:rPr>
-          <w:spacing w:val="-1"/>
-        </w:rPr>
-        <w:t>a</w:t>
-      </w:r>
-      <w:r>
-        <w:t xml:space="preserve">nd </w:t>
-      </w:r>
-      <w:r>
-        <w:rPr>
-          <w:spacing w:val="-1"/>
-        </w:rPr>
-        <w:t>J</w:t>
-      </w:r>
-      <w:r>
-        <w:t xml:space="preserve">. </w:t>
-      </w:r>
-      <w:r>
-        <w:rPr>
-          <w:spacing w:val="-1"/>
-        </w:rPr>
-        <w:t>R</w:t>
-      </w:r>
-      <w:r>
-        <w:t>. S</w:t>
-      </w:r>
-      <w:r>
-        <w:rPr>
-          <w:spacing w:val="-1"/>
-        </w:rPr>
-        <w:t>t</w:t>
-      </w:r>
-      <w:r>
-        <w:t>er</w:t>
-      </w:r>
-      <w:r>
-        <w:rPr>
-          <w:spacing w:val="-1"/>
-        </w:rPr>
-        <w:t>n</w:t>
-      </w:r>
-      <w:r>
-        <w:t xml:space="preserve">, </w:t>
-      </w:r>
-      <w:r>
-        <w:rPr>
-          <w:spacing w:val="-1"/>
-        </w:rPr>
-        <w:t>“</w:t>
-      </w:r>
-      <w:r>
-        <w:rPr>
-          <w:spacing w:val="2"/>
-        </w:rPr>
-        <w:t>W</w:t>
-      </w:r>
-      <w:r>
-        <w:t>a</w:t>
-      </w:r>
-      <w:r>
-        <w:rPr>
-          <w:spacing w:val="-1"/>
-        </w:rPr>
-        <w:t>v</w:t>
-      </w:r>
-      <w:r>
-        <w:t>ele</w:t>
-      </w:r>
-      <w:r>
-        <w:rPr>
-          <w:spacing w:val="-1"/>
-        </w:rPr>
-        <w:t>n</w:t>
-      </w:r>
-      <w:r>
-        <w:t>g</w:t>
-      </w:r>
-      <w:r>
-        <w:rPr>
-          <w:spacing w:val="-1"/>
-        </w:rPr>
-        <w:t>th</w:t>
-      </w:r>
-      <w:r>
-        <w:t>-sw</w:t>
-      </w:r>
-      <w:r>
-        <w:rPr>
-          <w:spacing w:val="-1"/>
-        </w:rPr>
-        <w:t>it</w:t>
-      </w:r>
-      <w:r>
-        <w:t>ch</w:t>
-      </w:r>
-      <w:r>
-        <w:rPr>
-          <w:spacing w:val="-1"/>
-        </w:rPr>
-        <w:t>e</w:t>
-      </w:r>
-      <w:r>
-        <w:t>d p</w:t>
-      </w:r>
-      <w:r>
-        <w:rPr>
-          <w:spacing w:val="-1"/>
-        </w:rPr>
-        <w:t>a</w:t>
-      </w:r>
-      <w:r>
-        <w:t xml:space="preserve">s- </w:t>
-      </w:r>
-      <w:proofErr w:type="spellStart"/>
-      <w:r>
-        <w:t>s</w:t>
-      </w:r>
-      <w:r>
-        <w:rPr>
-          <w:spacing w:val="-1"/>
-        </w:rPr>
-        <w:t>i</w:t>
-      </w:r>
-      <w:r>
-        <w:t>vely</w:t>
-      </w:r>
-      <w:proofErr w:type="spellEnd"/>
-      <w:r>
-        <w:rPr>
-          <w:spacing w:val="1"/>
-        </w:rPr>
-        <w:t xml:space="preserve"> </w:t>
-      </w:r>
-      <w:r>
-        <w:t>cou</w:t>
-      </w:r>
-      <w:r>
-        <w:rPr>
-          <w:spacing w:val="1"/>
-        </w:rPr>
-        <w:t>p</w:t>
-      </w:r>
-      <w:r>
-        <w:t>l</w:t>
-      </w:r>
-      <w:r>
-        <w:rPr>
-          <w:spacing w:val="-1"/>
-        </w:rPr>
-        <w:t>e</w:t>
-      </w:r>
-      <w:r>
-        <w:t>d</w:t>
-      </w:r>
-      <w:r>
-        <w:rPr>
-          <w:spacing w:val="1"/>
-        </w:rPr>
-        <w:t xml:space="preserve"> </w:t>
-      </w:r>
-      <w:r>
-        <w:t>s</w:t>
-      </w:r>
-      <w:r>
-        <w:rPr>
-          <w:spacing w:val="-1"/>
-        </w:rPr>
-        <w:t>in</w:t>
-      </w:r>
-      <w:r>
-        <w:rPr>
-          <w:spacing w:val="1"/>
-        </w:rPr>
-        <w:t>g</w:t>
-      </w:r>
-      <w:r>
-        <w:t>le-</w:t>
-      </w:r>
-      <w:r>
-        <w:rPr>
-          <w:spacing w:val="-2"/>
-        </w:rPr>
-        <w:t>m</w:t>
-      </w:r>
-      <w:r>
-        <w:t>ode optical</w:t>
-      </w:r>
-      <w:r>
-        <w:rPr>
-          <w:spacing w:val="1"/>
-        </w:rPr>
-        <w:t xml:space="preserve"> </w:t>
-      </w:r>
-      <w:r>
-        <w:t>net</w:t>
-      </w:r>
-      <w:r>
-        <w:rPr>
-          <w:spacing w:val="-1"/>
-        </w:rPr>
-        <w:t>w</w:t>
-      </w:r>
-      <w:r>
-        <w:t>o</w:t>
-      </w:r>
-      <w:r>
-        <w:rPr>
-          <w:spacing w:val="-1"/>
-        </w:rPr>
-        <w:t>r</w:t>
-      </w:r>
-      <w:r>
-        <w:t>k,”</w:t>
-      </w:r>
-      <w:r>
-        <w:rPr>
-          <w:spacing w:val="2"/>
-        </w:rPr>
-        <w:t xml:space="preserve"> </w:t>
-      </w:r>
-      <w:r>
-        <w:t xml:space="preserve">in </w:t>
-      </w:r>
-      <w:r>
-        <w:rPr>
-          <w:i/>
-          <w:iCs/>
-        </w:rPr>
-        <w:t>Pro</w:t>
-      </w:r>
-      <w:r>
-        <w:rPr>
-          <w:i/>
-          <w:iCs/>
-          <w:spacing w:val="-1"/>
-        </w:rPr>
-        <w:t>c</w:t>
-      </w:r>
-      <w:r>
-        <w:rPr>
-          <w:i/>
-          <w:iCs/>
-        </w:rPr>
-        <w:t>. I</w:t>
-      </w:r>
-      <w:r>
-        <w:rPr>
-          <w:i/>
-          <w:iCs/>
-          <w:spacing w:val="-1"/>
-        </w:rPr>
-        <w:t>O</w:t>
-      </w:r>
-      <w:r>
-        <w:rPr>
-          <w:i/>
-          <w:iCs/>
-        </w:rPr>
-        <w:t>OC-E</w:t>
-      </w:r>
-      <w:r>
-        <w:rPr>
-          <w:i/>
-          <w:iCs/>
-          <w:spacing w:val="-2"/>
-        </w:rPr>
-        <w:t>C</w:t>
+        <w:t>Pl</w:t>
       </w:r>
       <w:r>
         <w:rPr>
@@ -6890,342 +4216,245 @@
           <w:iCs/>
           <w:spacing w:val="1"/>
         </w:rPr>
-        <w:t>O</w:t>
+        <w:t>a</w:t>
       </w:r>
       <w:r>
         <w:rPr>
           <w:i/>
           <w:iCs/>
         </w:rPr>
-        <w:t>C,</w:t>
+        <w:t xml:space="preserve">stics, </w:t>
       </w:r>
       <w:r>
         <w:rPr>
           <w:i/>
           <w:iCs/>
+          <w:spacing w:val="38"/>
         </w:rPr>
         <w:t xml:space="preserve"> </w:t>
       </w:r>
       <w:r>
-        <w:rPr>
-          <w:iCs/>
-        </w:rPr>
-        <w:t>Boston, MA, USA,</w:t>
-      </w:r>
-      <w:r>
-        <w:rPr>
-          <w:i/>
-          <w:iCs/>
+        <w:t>2</w:t>
+      </w:r>
+      <w:r>
+        <w:rPr>
           <w:spacing w:val="-1"/>
         </w:rPr>
+        <w:t>n</w:t>
+      </w:r>
+      <w:r>
+        <w:t xml:space="preserve">d </w:t>
+      </w:r>
+      <w:r>
+        <w:rPr>
+          <w:spacing w:val="39"/>
+        </w:rPr>
         <w:t xml:space="preserve"> </w:t>
       </w:r>
       <w:r>
+        <w:t>ed</w:t>
+      </w:r>
+      <w:r>
+        <w:rPr>
+          <w:spacing w:val="-1"/>
+        </w:rPr>
+        <w:t>.</w:t>
+      </w:r>
+      <w:r>
+        <w:t xml:space="preserve">, </w:t>
+      </w:r>
+      <w:r>
+        <w:rPr>
+          <w:spacing w:val="38"/>
+        </w:rPr>
+        <w:t xml:space="preserve"> </w:t>
+      </w:r>
+      <w:r>
+        <w:t xml:space="preserve">vol. </w:t>
+      </w:r>
+      <w:r>
+        <w:rPr>
+          <w:spacing w:val="38"/>
+        </w:rPr>
+        <w:t xml:space="preserve"> </w:t>
+      </w:r>
+      <w:r>
+        <w:rPr>
+          <w:spacing w:val="-1"/>
+        </w:rPr>
+        <w:t>3</w:t>
+      </w:r>
+      <w:r>
+        <w:t xml:space="preserve">, </w:t>
+      </w:r>
+      <w:r>
+        <w:rPr>
+          <w:spacing w:val="38"/>
+        </w:rPr>
+        <w:t>J</w:t>
+      </w:r>
+      <w:r>
+        <w:t xml:space="preserve">. </w:t>
+      </w:r>
+      <w:r>
+        <w:rPr>
+          <w:spacing w:val="39"/>
+        </w:rPr>
+        <w:t xml:space="preserve"> </w:t>
+      </w:r>
+      <w:r>
+        <w:t>Pet</w:t>
+      </w:r>
+      <w:r>
+        <w:rPr>
+          <w:spacing w:val="-1"/>
+        </w:rPr>
+        <w:t>e</w:t>
+      </w:r>
+      <w:r>
+        <w:t>rs</w:t>
+      </w:r>
+      <w:r>
+        <w:t xml:space="preserve">, </w:t>
+      </w:r>
+      <w:r>
+        <w:rPr>
+          <w:spacing w:val="38"/>
+        </w:rPr>
+        <w:t>Ed</w:t>
+      </w:r>
+      <w:r>
+        <w:t xml:space="preserve">. </w:t>
+      </w:r>
+      <w:r>
+        <w:rPr>
+          <w:spacing w:val="38"/>
+        </w:rPr>
+        <w:t xml:space="preserve"> </w:t>
+      </w:r>
+      <w:r>
+        <w:t>N</w:t>
+      </w:r>
+      <w:r>
+        <w:rPr>
+          <w:spacing w:val="-1"/>
+        </w:rPr>
+        <w:t>e</w:t>
+      </w:r>
+      <w:r>
+        <w:t xml:space="preserve">w </w:t>
+      </w:r>
+      <w:r>
+        <w:rPr>
+          <w:spacing w:val="38"/>
+        </w:rPr>
+        <w:t>York</w:t>
+      </w:r>
+      <w:r>
+        <w:rPr>
+          <w:spacing w:val="-1"/>
+        </w:rPr>
+        <w:t>, NY, USA</w:t>
+      </w:r>
+      <w:r>
+        <w:t>: McGraw-Hill,</w:t>
+      </w:r>
+      <w:r>
+        <w:rPr>
+          <w:spacing w:val="-1"/>
+        </w:rPr>
+        <w:t xml:space="preserve"> </w:t>
+      </w:r>
+      <w:r>
         <w:rPr>
           <w:spacing w:val="1"/>
         </w:rPr>
         <w:t>1</w:t>
       </w:r>
       <w:r>
-        <w:t>98</w:t>
+        <w:t>96</w:t>
       </w:r>
       <w:r>
         <w:rPr>
           <w:spacing w:val="1"/>
         </w:rPr>
+        <w:t>4</w:t>
+      </w:r>
+      <w:r>
+        <w:t>,</w:t>
+      </w:r>
+      <w:r>
+        <w:rPr>
+          <w:spacing w:val="-1"/>
+        </w:rPr>
+        <w:t xml:space="preserve"> </w:t>
+      </w:r>
+      <w:r>
+        <w:t>p</w:t>
+      </w:r>
+      <w:r>
+        <w:rPr>
+          <w:spacing w:val="1"/>
+        </w:rPr>
+        <w:t>p</w:t>
+      </w:r>
+      <w:r>
+        <w:t>.</w:t>
+      </w:r>
+      <w:r>
+        <w:rPr>
+          <w:spacing w:val="-1"/>
+        </w:rPr>
+        <w:t xml:space="preserve"> </w:t>
+      </w:r>
+      <w:r>
+        <w:t>1</w:t>
+      </w:r>
+      <w:r>
+        <w:rPr>
+          <w:spacing w:val="1"/>
+        </w:rPr>
         <w:t>5</w:t>
       </w:r>
       <w:r>
-        <w:t>,</w:t>
-      </w:r>
-      <w:r>
-        <w:rPr>
-          <w:spacing w:val="-1"/>
-        </w:rPr>
-        <w:t xml:space="preserve"> </w:t>
-      </w:r>
-      <w:r>
-        <w:rPr>
-          <w:spacing w:val="-1"/>
-        </w:rPr>
-        <w:br/>
-      </w:r>
-      <w:r>
-        <w:t>p</w:t>
+        <w:t>–6</w:t>
       </w:r>
       <w:r>
         <w:rPr>
           <w:spacing w:val="1"/>
         </w:rPr>
-        <w:t>p</w:t>
+        <w:t>4</w:t>
       </w:r>
       <w:r>
         <w:t>.</w:t>
       </w:r>
-      <w:r>
-        <w:rPr>
-          <w:spacing w:val="-1"/>
-        </w:rPr>
-        <w:t xml:space="preserve"> </w:t>
-      </w:r>
-      <w:r>
-        <w:t>5</w:t>
-      </w:r>
-      <w:r>
-        <w:rPr>
-          <w:spacing w:val="1"/>
-        </w:rPr>
-        <w:t>8</w:t>
-      </w:r>
-      <w:r>
-        <w:t>5–</w:t>
-      </w:r>
-      <w:r>
-        <w:rPr>
-          <w:spacing w:val="1"/>
-        </w:rPr>
-        <w:t>5</w:t>
-      </w:r>
-      <w:r>
-        <w:t>9</w:t>
-      </w:r>
-      <w:r>
-        <w:rPr>
-          <w:spacing w:val="1"/>
-        </w:rPr>
-        <w:t>0</w:t>
-      </w:r>
-      <w:r>
-        <w:t>.</w:t>
-      </w:r>
-    </w:p>
-    <w:p>
-      <w:pPr>
-        <w:autoSpaceDE w:val="0"/>
-        <w:autoSpaceDN w:val="0"/>
-        <w:adjustRightInd w:val="0"/>
-        <w:rPr>
-          <w:rFonts w:ascii="TimesNewRomanPS-ItalicMT" w:hAnsi="TimesNewRomanPS-ItalicMT" w:cs="TimesNewRomanPS-ItalicMT"/>
-          <w:i/>
-          <w:iCs/>
-        </w:rPr>
-      </w:pPr>
-      <w:r>
-        <w:rPr>
-          <w:rFonts w:ascii="TimesNewRomanPS-ItalicMT" w:hAnsi="TimesNewRomanPS-ItalicMT" w:cs="TimesNewRomanPS-ItalicMT"/>
-          <w:i/>
-          <w:iCs/>
-        </w:rPr>
-        <w:br/>
-      </w:r>
-      <w:r>
-        <w:rPr>
-          <w:rFonts w:ascii="TimesNewRomanPS-ItalicMT" w:hAnsi="TimesNewRomanPS-ItalicMT" w:cs="TimesNewRomanPS-ItalicMT"/>
-          <w:i/>
-          <w:iCs/>
-        </w:rPr>
-        <w:t xml:space="preserve">Basic </w:t>
-      </w:r>
-      <w:r>
-        <w:rPr>
-          <w:rFonts w:ascii="TimesNewRomanPS-ItalicMT" w:hAnsi="TimesNewRomanPS-ItalicMT" w:cs="TimesNewRomanPS-ItalicMT"/>
-          <w:i/>
-          <w:iCs/>
-        </w:rPr>
-        <w:t>f</w:t>
-      </w:r>
-      <w:r>
-        <w:rPr>
-          <w:rFonts w:ascii="TimesNewRomanPS-ItalicMT" w:hAnsi="TimesNewRomanPS-ItalicMT" w:cs="TimesNewRomanPS-ItalicMT"/>
-          <w:i/>
-          <w:iCs/>
-        </w:rPr>
-        <w:t>ormat</w:t>
-      </w:r>
-      <w:r>
+    </w:p>
+    <w:p>
+      <w:pPr>
+        <w:pStyle w:val="References"/>
+      </w:pPr>
+      <w:r>
+        <w:t>G. Reinelt, “TSPLIB: A Traveling Salesman Problem Library,” ORSA Journal on Computing, vol. 3, no. 4, pp. 376–384, 1991.</w:t>
+      </w:r>
+    </w:p>
+    <w:p>
+      <w:pPr>
+        <w:pStyle w:val="FigureCaption"/>
         <w:rPr>
           <w:b/>
           <w:bCs/>
-          <w:i/>
-          <w:iCs/>
-        </w:rPr>
-        <w:t xml:space="preserve"> </w:t>
-      </w:r>
-      <w:r>
-        <w:rPr>
-          <w:bCs/>
-          <w:i/>
-          <w:iCs/>
-        </w:rPr>
-        <w:t>for t</w:t>
-      </w:r>
-      <w:r>
-        <w:rPr>
-          <w:bCs/>
-          <w:i/>
-          <w:iCs/>
-        </w:rPr>
-        <w:t xml:space="preserve">heses (M.S.) and </w:t>
-      </w:r>
-      <w:r>
-        <w:rPr>
-          <w:bCs/>
-          <w:i/>
-          <w:iCs/>
-        </w:rPr>
-        <w:t>d</w:t>
-      </w:r>
-      <w:r>
-        <w:rPr>
-          <w:bCs/>
-          <w:i/>
-          <w:iCs/>
-        </w:rPr>
-        <w:t>issertations (Ph.D.</w:t>
-      </w:r>
-      <w:r>
-        <w:rPr>
-          <w:bCs/>
-          <w:i/>
-          <w:iCs/>
-        </w:rPr>
-        <w:t>):</w:t>
-      </w:r>
-    </w:p>
-    <w:p>
-      <w:pPr>
-        <w:rPr>
-          <w:sz w:val="16"/>
-          <w:szCs w:val="16"/>
-        </w:rPr>
-      </w:pPr>
-      <w:r>
-        <w:rPr>
-          <w:sz w:val="16"/>
-          <w:szCs w:val="16"/>
-        </w:rPr>
-        <w:t xml:space="preserve">a) </w:t>
-      </w:r>
-      <w:r>
-        <w:rPr>
-          <w:sz w:val="16"/>
-          <w:szCs w:val="16"/>
-        </w:rPr>
-        <w:t>J. K. Author, “Title of thesis,” M.S. thesis, Abbrev. Dept., Abbrev. Univ., City of Univ., Abbrev. State, year.</w:t>
-      </w:r>
-    </w:p>
-    <w:p>
-      <w:pPr>
-        <w:rPr>
-          <w:sz w:val="16"/>
-          <w:szCs w:val="16"/>
-        </w:rPr>
-      </w:pPr>
-      <w:r>
-        <w:rPr>
-          <w:sz w:val="16"/>
-          <w:szCs w:val="16"/>
-        </w:rPr>
-        <w:t xml:space="preserve">b) </w:t>
-      </w:r>
-      <w:r>
-        <w:rPr>
-          <w:sz w:val="16"/>
-          <w:szCs w:val="16"/>
-        </w:rPr>
-        <w:t>J. K. Author, “Title of dissertation,” Ph.D. dissertation, Abbrev. Dept., Abbrev. Univ., City of Univ., Abbrev. State,</w:t>
-      </w:r>
-      <w:r>
-        <w:rPr>
-          <w:sz w:val="16"/>
-          <w:szCs w:val="16"/>
-        </w:rPr>
-        <w:t xml:space="preserve"> </w:t>
-      </w:r>
-      <w:r>
-        <w:rPr>
-          <w:sz w:val="16"/>
-          <w:szCs w:val="16"/>
-        </w:rPr>
-        <w:t>year.</w:t>
-      </w:r>
-    </w:p>
-    <w:p>
-      <w:pPr>
-        <w:autoSpaceDE w:val="0"/>
-        <w:autoSpaceDN w:val="0"/>
-        <w:adjustRightInd w:val="0"/>
-        <w:rPr>
-          <w:rFonts w:ascii="TimesNewRomanPS-ItalicMT" w:hAnsi="TimesNewRomanPS-ItalicMT" w:cs="TimesNewRomanPS-ItalicMT"/>
-          <w:i/>
-          <w:iCs/>
-        </w:rPr>
-      </w:pPr>
-      <w:r>
-        <w:rPr>
-          <w:rFonts w:ascii="TimesNewRomanPS-ItalicMT" w:hAnsi="TimesNewRomanPS-ItalicMT" w:cs="TimesNewRomanPS-ItalicMT"/>
-          <w:i/>
-          <w:iCs/>
-        </w:rPr>
-        <w:t>Examples:</w:t>
-      </w:r>
-    </w:p>
-    <w:p>
-      <w:pPr>
-        <w:pStyle w:val="References"/>
-      </w:pPr>
-      <w:r>
-        <w:t>N. Kawasaki, “Parametric study of thermal and chemical nonequilibrium nozzle flow,” M.S. thesis, Dept. Electron.</w:t>
-      </w:r>
-      <w:r>
-        <w:t xml:space="preserve"> </w:t>
-      </w:r>
-      <w:r>
-        <w:t>Eng., Osaka Univ., Osaka, Japan, 1993.</w:t>
-      </w:r>
-    </w:p>
-    <w:p>
-      <w:pPr>
-        <w:autoSpaceDE w:val="0"/>
-        <w:autoSpaceDN w:val="0"/>
-        <w:adjustRightInd w:val="0"/>
-      </w:pPr>
-      <w:r>
-        <w:rPr>
-          <w:rFonts w:ascii="TimesNewRomanPS-ItalicMT" w:hAnsi="TimesNewRomanPS-ItalicMT" w:cs="TimesNewRomanPS-ItalicMT"/>
-          <w:i/>
-          <w:iCs/>
-        </w:rPr>
-        <w:br/>
-      </w:r>
+        </w:rPr>
+      </w:pPr>
     </w:p>
     <w:p>
       <w:pPr>
         <w:pStyle w:val="FigureCaption"/>
         <w:rPr>
-          <w:b/>
-          <w:bCs/>
-        </w:rPr>
-      </w:pPr>
-    </w:p>
-    <w:p>
-      <w:pPr>
-        <w:pStyle w:val="FigureCaption"/>
-        <w:rPr>
-          <w:b/>
-          <w:bCs/>
-        </w:rPr>
-      </w:pPr>
-    </w:p>
-    <w:p>
-      <w:pPr>
-        <w:pStyle w:val="FigureCaption"/>
-        <w:rPr>
           <w:sz w:val="20"/>
           <w:szCs w:val="20"/>
         </w:rPr>
         <w:sectPr>
-          <w:headerReference w:type="default" r:id="rId19"/>
+          <w:headerReference w:type="default" r:id="rId17"/>
           <w:type w:val="continuous"/>
           <w:pgSz w:w="12240" w:h="15840" w:code="1"/>
           <w:pgMar w:top="1008" w:right="936" w:bottom="1008" w:left="936" w:header="432" w:footer="432" w:gutter="0"/>

</xml_diff>

<commit_message>
Updated report with all sections minus results
</commit_message>
<xml_diff>
--- a/docs/report/Travel Salesman with Genetic Algorithms, using CUDA optimizations.docx
+++ b/docs/report/Travel Salesman with Genetic Algorithms, using CUDA optimizations.docx
@@ -141,277 +141,69 @@
         <w:ind w:firstLine="0"/>
       </w:pPr>
       <w:r>
-        <w:rPr>
-          <w:smallCaps/>
-          <w:highlight w:val="yellow"/>
-        </w:rPr>
-        <w:t>HIS</w:t>
-      </w:r>
-      <w:r>
-        <w:rPr>
-          <w:highlight w:val="yellow"/>
-        </w:rPr>
-        <w:t xml:space="preserve"> document is a template for </w:t>
-      </w:r>
-      <w:r>
-        <w:rPr>
-          <w:highlight w:val="yellow"/>
-        </w:rPr>
-        <w:t xml:space="preserve">the ece569 project report. </w:t>
-      </w:r>
-      <w:r>
-        <w:rPr>
-          <w:highlight w:val="yellow"/>
-        </w:rPr>
-        <w:t xml:space="preserve">If you would prefer to use </w:t>
-      </w:r>
-      <w:r>
-        <w:rPr>
-          <w:highlight w:val="yellow"/>
-        </w:rPr>
-        <w:t>LaTeX</w:t>
-      </w:r>
-      <w:r>
-        <w:rPr>
-          <w:highlight w:val="yellow"/>
-        </w:rPr>
-        <w:t xml:space="preserve">, download IEEE’s </w:t>
-      </w:r>
-      <w:r>
-        <w:rPr>
-          <w:highlight w:val="yellow"/>
-        </w:rPr>
-        <w:t>LaTeX</w:t>
-      </w:r>
-      <w:r>
-        <w:rPr>
-          <w:highlight w:val="yellow"/>
-        </w:rPr>
-        <w:t xml:space="preserve"> style and sample files from </w:t>
-      </w:r>
-      <w:hyperlink r:id="rId8" w:history="1">
-        <w:r>
-          <w:rPr>
-            <w:rStyle w:val="Hyperlink"/>
-            <w:highlight w:val="yellow"/>
-          </w:rPr>
-          <w:t>https://www.ieee.org/publications_standards/publications/authors/author_templates.html</w:t>
-        </w:r>
-      </w:hyperlink>
-      <w:r>
-        <w:rPr>
-          <w:highlight w:val="yellow"/>
-        </w:rPr>
+        <w:t>he Traveling Salesman Problem (TSP) is a classic combinatorial optimization problem in which a salesman must visit a set of cities exactly once and return to the starting city while minimizing the total travel distance. Although the problem is simple to describe, it becomes computationally difficult as the number of cities increases because the number of possible tours grows factorially. As a result, finding the exact optimal solution becomes impractical for large instances, making TSP a useful benchmark for evaluating heuristic and parallel optimization methods.</w:t>
+      </w:r>
+    </w:p>
+    <w:p>
+      <w:pPr>
+        <w:pStyle w:val="Text"/>
+      </w:pPr>
+    </w:p>
+    <w:p>
+      <w:pPr>
+        <w:pStyle w:val="Text"/>
+      </w:pPr>
+      <w:r>
+        <w:t>A Genetic Algorithm (GA) is a search heuristic inspired by biological evolution. Instead of examining every possible solution, a GA maintains a population of candidate solutions and improves them over multiple generations. Each candidate solution is evaluated using a fitness function, and stronger candidates are more likely to contribute to the next generation through operations such as selection, crossover, and mutation. For the TSP, a candidate solution can be represented as an ordered tour of cities, and the fitness value is typically based on the total distance of that tour.</w:t>
+      </w:r>
+    </w:p>
+    <w:p>
+      <w:pPr>
+        <w:pStyle w:val="Text"/>
+      </w:pPr>
+    </w:p>
+    <w:p>
+      <w:pPr>
+        <w:pStyle w:val="Text"/>
+      </w:pPr>
+      <w:r>
+        <w:t>Genetic Algorithms help address the TSP by searching a large solution space without requiring exhaustive enumeration of every possible route. Selection encourages shorter tours to survive, crossover combines information from existing tours, and mutation introduces variation that can help the search avoid premature convergence. While a GA does not guarantee an optimal solution, it can often produce high-quality approximate solutions within a reasonable amount of time.</w:t>
+      </w:r>
+    </w:p>
+    <w:p>
+      <w:pPr>
+        <w:pStyle w:val="Text"/>
+      </w:pPr>
+    </w:p>
+    <w:p>
+      <w:pPr>
+        <w:pStyle w:val="Text"/>
+      </w:pPr>
+      <w:r>
+        <w:t>Parallel processing is especially useful for this problem because many parts of a GA can be evaluated independently. For example, the fitness of each candidate tour can be computed separately, and many genetic operations can be applied to different individuals at the same time. Graphics Processing Units (GPUs) are well suited for this style of computation because they contain many cores designed to execute large numbers of similar operations concurrently. By moving suitable portions of the algorithm to the GPU, the runtime can be reduced while still preserving the overall search behavior of the GA.</w:t>
+      </w:r>
+    </w:p>
+    <w:p>
+      <w:pPr>
+        <w:pStyle w:val="Text"/>
+      </w:pPr>
+    </w:p>
+    <w:p>
+      <w:pPr>
+        <w:pStyle w:val="Text"/>
+      </w:pPr>
+      <w:r>
+        <w:t>In this project, we implement a GPU-accelerated approach for solving TSP instances using a GA. Candidate tours are generated and evolved through standard GA operations, while computationally expensive work is parallelized using CUDA (Compute Unified Device Architecture). The implementation is evaluated using TSPLIB benchmark instances and compared against known tour lengths or optimal solutions where available.</w:t>
+      </w:r>
+      <w:r>
         <w:t>.</w:t>
       </w:r>
-      <w:r>
-        <w:rPr>
-          <w:highlight w:val="yellow"/>
-        </w:rPr>
-        <w:t xml:space="preserve"> </w:t>
-      </w:r>
-      <w:r>
-        <w:rPr>
-          <w:highlight w:val="yellow"/>
-        </w:rPr>
-        <w:t>The projects will be graded in the same way that I referee papers -- by what you discover in doing the project, how coherently you present your results, how well you put your work in perspective with other research. The final report should follow the same outline you would follow for a conference paper, and they should be 6 pages in length plus references. (Remember: it’s easy to write a lot of text. It’s hard to write concise.) Your report should contain the following sections. There may be variations depending on what needs to be reported:</w:t>
-      </w:r>
-    </w:p>
-    <w:p>
-      <w:pPr>
-        <w:pStyle w:val="Text"/>
-      </w:pPr>
-      <w:r>
-        <w:t>•</w:t>
-      </w:r>
-      <w:r>
-        <w:tab/>
-      </w:r>
-      <w:r>
-        <w:rPr>
-          <w:b/>
-          <w:highlight w:val="yellow"/>
-        </w:rPr>
-        <w:t>Abstract</w:t>
-      </w:r>
-      <w:r>
-        <w:t xml:space="preserve"> (150 words max): problem statement, motivation, proposed approach, results and impact</w:t>
-      </w:r>
-    </w:p>
-    <w:p>
-      <w:pPr>
-        <w:pStyle w:val="Text"/>
-      </w:pPr>
-      <w:r>
-        <w:t>•</w:t>
-      </w:r>
-      <w:r>
-        <w:tab/>
-      </w:r>
-      <w:r>
-        <w:rPr>
-          <w:b/>
-          <w:highlight w:val="yellow"/>
-        </w:rPr>
-        <w:t>Introduction:</w:t>
-      </w:r>
-      <w:r>
-        <w:t xml:space="preserve"> This section should motivate the reader to read rest of the paper (Why should I read this paper?) Introduction section includes the motivation and problem statement, limitation(s) of the state of the art, proposed solution (method), in what capacity the proposed approach solves the problem (quantify, most important results ),  background information and a longer summary of what you did and results you got. You should briefly mention how you technique differs from previous work in this section</w:t>
-      </w:r>
-    </w:p>
-    <w:p>
-      <w:pPr>
-        <w:pStyle w:val="Text"/>
-      </w:pPr>
-      <w:r>
-        <w:t>•</w:t>
-      </w:r>
-      <w:r>
-        <w:tab/>
-      </w:r>
-      <w:r>
-        <w:rPr>
-          <w:b/>
-          <w:highlight w:val="yellow"/>
-        </w:rPr>
-        <w:t>Related work:</w:t>
-      </w:r>
-      <w:r>
-        <w:t xml:space="preserve"> It is your responsibility to find and report any related work. Provide summaries of previous work related to your optimization including references to the papers (include cross-reference to paper listed in your references section). In this section you should clearly distinguish your work from previous work, giving details on how your work is different and how your work improves and/or extends previous methods. Be careful not to trash anyone else’s work in this section. For one, it is tacky and two, the authors you are trashing are likely reviewing your paper</w:t>
-      </w:r>
-      <w:r>
-        <w:t>. In 569, it is me : )</w:t>
-      </w:r>
-    </w:p>
-    <w:p>
-      <w:pPr>
-        <w:pStyle w:val="Text"/>
-      </w:pPr>
-      <w:r>
-        <w:t>•</w:t>
-      </w:r>
-      <w:r>
-        <w:tab/>
-      </w:r>
-      <w:r>
-        <w:rPr>
-          <w:b/>
-          <w:highlight w:val="yellow"/>
-        </w:rPr>
-        <w:t>Methodology:</w:t>
-      </w:r>
-      <w:r>
-        <w:t xml:space="preserve"> </w:t>
-      </w:r>
-      <w:r>
-        <w:t xml:space="preserve">Details of your implementation approach, highlighting key technical contributions that will be quantified experimentally during your evaluations.  </w:t>
-      </w:r>
-      <w:r>
-        <w:t>If you are proposing a new mechanism describe it.</w:t>
-      </w:r>
-      <w:r>
-        <w:t xml:space="preserve"> Discuss how your approach is different from published studies when applicable. </w:t>
-      </w:r>
-    </w:p>
-    <w:p>
-      <w:pPr>
-        <w:pStyle w:val="Text"/>
-      </w:pPr>
-      <w:r>
-        <w:t>•</w:t>
-      </w:r>
-      <w:r>
-        <w:tab/>
-      </w:r>
-      <w:r>
-        <w:rPr>
-          <w:b/>
-          <w:highlight w:val="yellow"/>
-        </w:rPr>
-        <w:t>Evaluation and Validation:</w:t>
-      </w:r>
-      <w:r>
-        <w:t xml:space="preserve"> description of the experimental testbed, performance metrics (WHY are you using them), data collection strategy, nature of benchmarks, machine configuration and any other relevant parameters. You should discuss your validation approach. This section should be detailed enough for anyone to replicate your experimental set up and repeat your experiments.  </w:t>
-      </w:r>
-    </w:p>
-    <w:p>
-      <w:pPr>
-        <w:pStyle w:val="Text"/>
-      </w:pPr>
-      <w:r>
-        <w:t>•</w:t>
-      </w:r>
-      <w:r>
-        <w:tab/>
-        <w:t>Experimental results and analysis: Each figure should be self-explanatory with x,y coordinates, metrics, parameters, variables, constraints. Each figure, table, chart should be followed by analysis and significance of the results.  Just showing some charts and reciting numbers does not provide any insights on what you have learned from these results. Provide an in</w:t>
-      </w:r>
-      <w:r>
-        <w:t xml:space="preserve"> </w:t>
-      </w:r>
-      <w:r>
-        <w:t xml:space="preserve">depth analysis on what the results mean and trends that are revealed. This is the most </w:t>
-      </w:r>
-      <w:r>
-        <w:t>important</w:t>
-      </w:r>
-      <w:r>
-        <w:t xml:space="preserve"> section of the paper!</w:t>
-      </w:r>
-    </w:p>
-    <w:p>
-      <w:pPr>
-        <w:pStyle w:val="Text"/>
-      </w:pPr>
-      <w:r>
-        <w:t>•</w:t>
-      </w:r>
-      <w:r>
-        <w:tab/>
-      </w:r>
-      <w:r>
-        <w:rPr>
-          <w:b/>
-          <w:highlight w:val="yellow"/>
-        </w:rPr>
-        <w:t>Conclusion</w:t>
-      </w:r>
-      <w:r>
-        <w:t xml:space="preserve"> (200 words max): restate impact of the study, discuss any addition work that could improve the project</w:t>
-      </w:r>
-    </w:p>
-    <w:p>
-      <w:pPr>
-        <w:pStyle w:val="Text"/>
-      </w:pPr>
-      <w:r>
-        <w:t>•</w:t>
-      </w:r>
-      <w:r>
-        <w:tab/>
-      </w:r>
-      <w:r>
-        <w:rPr>
-          <w:b/>
-          <w:highlight w:val="yellow"/>
-        </w:rPr>
-        <w:t>References</w:t>
-      </w:r>
-      <w:r>
-        <w:rPr>
-          <w:highlight w:val="yellow"/>
-        </w:rPr>
-        <w:t>:</w:t>
-      </w:r>
-      <w:r>
-        <w:t xml:space="preserve"> List of papers cited throughout your paper.</w:t>
-      </w:r>
     </w:p>
     <w:p>
       <w:pPr>
         <w:pStyle w:val="Heading1"/>
       </w:pPr>
       <w:r>
-        <w:lastRenderedPageBreak/>
         <w:t>Related Work</w:t>
       </w:r>
     </w:p>
@@ -432,7 +224,31 @@
           <w:i w:val="0"/>
           <w:iCs w:val="0"/>
         </w:rPr>
-        <w:t>Recent work on GPU-accelerated solutions for the Traveling Salesman Problem shows that parallelism can significantly reduce execution time when the algorithm exposes many independent operations. Chen et al. implemented a CUDA-based genetic algorithm in which chromosomes were mapped to GPU threads, allowing initialization, mutation, selection, and portions of crossover to be performed in parallel [1]. Their work found that even a genetic algorithm with frequent interactions between individuals could benefit from CUDA execution, although the speedup was limited because their implementation used only one CUDA block, which prevented full utilization of the GPU. BinJubier et al. extended this direction with a coarse-grained parallel genetic algorithm, dividing the population into subpopulations processed concurrently on the GPU [2]. Their results on TSPLIB instances showed substantial runtime improvements over a sequential genetic algorithm, with speedups reaching approximately 75.81x depending on the dataset, population size, and hardware configuration.</w:t>
+        <w:t xml:space="preserve">Recent work on GPU-accelerated solutions for the Traveling Salesman Problem shows that parallelism can significantly reduce execution time when the algorithm exposes many independent operations. Chen et al. implemented a CUDA-based genetic algorithm in which chromosomes were mapped to GPU threads, allowing initialization, mutation, selection, and portions of crossover to be performed in parallel [1]. Their work found that even a genetic algorithm with frequent interactions between individuals could benefit from CUDA execution, although the speedup was limited because their </w:t>
+      </w:r>
+      <w:r>
+        <w:rPr>
+          <w:i w:val="0"/>
+          <w:iCs w:val="0"/>
+        </w:rPr>
+        <w:lastRenderedPageBreak/>
+        <w:t xml:space="preserve">implementation used only one CUDA block, which prevented full utilization of the GPU. </w:t>
+      </w:r>
+      <w:proofErr w:type="spellStart"/>
+      <w:r>
+        <w:rPr>
+          <w:i w:val="0"/>
+          <w:iCs w:val="0"/>
+        </w:rPr>
+        <w:t>BinJubier</w:t>
+      </w:r>
+      <w:proofErr w:type="spellEnd"/>
+      <w:r>
+        <w:rPr>
+          <w:i w:val="0"/>
+          <w:iCs w:val="0"/>
+        </w:rPr>
+        <w:t xml:space="preserve"> et al. extended this direction with a coarse-grained parallel genetic algorithm, dividing the population into subpopulations processed concurrently on the GPU [2]. Their results on TSPLIB instances showed substantial runtime improvements over a sequential genetic algorithm, with speedups reaching approximately 75.81x depending on the dataset, population size, and hardware configuration.</w:t>
       </w:r>
     </w:p>
     <w:p>
@@ -465,7 +281,23 @@
           <w:i w:val="0"/>
           <w:iCs w:val="0"/>
         </w:rPr>
-        <w:t>The main optimization strategies across the genetic algorithm papers are population-level parallelism, careful management of genetic operators, and GPU-aware memory decisions. Chen et al. used per-thread random seeds, avoided storing a large distance table by computing Euclidean distances from coordinates, and used 2-opt as a mutation operator to improve convergence [1]. BinJubier et al. focused on a coarse-grained design with parallel fitness evaluation, reduction-based best-solution selection, and CUDA block-size tuning, showing that GPU configuration can strongly affect runtime [2]. Together, these papers suggest that a GPU implementation should not simply port CPU code directly, but should restructure the algorithm around independent work units such as chromosomes, fitness calculations, and candidate tour modifications.</w:t>
+        <w:t xml:space="preserve">The main optimization strategies across the genetic algorithm papers are population-level parallelism, careful management of genetic operators, and GPU-aware memory decisions. Chen et al. used per-thread random seeds, avoided storing a large distance table by computing Euclidean distances from coordinates, and used 2-opt as a mutation operator to improve convergence [1]. </w:t>
+      </w:r>
+      <w:proofErr w:type="spellStart"/>
+      <w:r>
+        <w:rPr>
+          <w:i w:val="0"/>
+          <w:iCs w:val="0"/>
+        </w:rPr>
+        <w:t>BinJubier</w:t>
+      </w:r>
+      <w:proofErr w:type="spellEnd"/>
+      <w:r>
+        <w:rPr>
+          <w:i w:val="0"/>
+          <w:iCs w:val="0"/>
+        </w:rPr>
+        <w:t xml:space="preserve"> et al. focused on a coarse-grained design with parallel fitness evaluation, reduction-based best-solution selection, and CUDA block-size tuning, showing that GPU configuration can strongly affect runtime [2]. Together, these papers suggest that a GPU implementation should not simply port CPU code directly, but should restructure the algorithm around independent work units such as chromosomes, fitness calculations, and candidate tour modifications.</w:t>
       </w:r>
     </w:p>
     <w:p>
@@ -494,17 +326,22 @@
           <w:i w:val="0"/>
           <w:iCs w:val="0"/>
         </w:rPr>
-        <w:t xml:space="preserve">A complementary line of work focuses on GPU acceleration of local-search refinement rather than genetic algorithms. Qiao et al. presented scalable GPU implementations of complete 4-opt, 5-opt, 6-opt, and hybrid variable λ-opt search across one or more GPUs [3]. Their approach assigns independent k-opt edge-combination checks to CUDA threads and supports multiple non-interacting tour improvements within a single iteration. The reported results show very large acceleration over serial local search, including complete 4-opt search on mu1979.tsp running in 135.1 seconds on one GPU compared with more than 48 hours serially [3]. This demonstrates that higher-order local search becomes practical only when its large number of independent candidate moves can be </w:t>
-      </w:r>
+        <w:t xml:space="preserve">A complementary line of work focuses on GPU acceleration of local-search refinement rather than genetic algorithms. Qiao et al. presented scalable GPU implementations of complete 4-opt, 5-opt, 6-opt, and hybrid variable λ-opt search across one or more GPUs [3]. Their approach assigns independent k-opt edge-combination checks to CUDA threads and supports multiple non-interacting tour improvements within a single iteration. The reported results show very large acceleration over serial local search, including complete 4-opt search on mu1979.tsp running in 135.1 seconds on one GPU compared with more than 48 hours serially [3]. This demonstrates that higher-order local search becomes practical only when its large number of independent candidate moves can be evaluated in parallel, making it especially relevant for GPU-based TSP </w:t>
+      </w:r>
+      <w:proofErr w:type="spellStart"/>
       <w:r>
         <w:rPr>
           <w:i w:val="0"/>
           <w:iCs w:val="0"/>
         </w:rPr>
-        <w:t>evaluated in parallel, making it especially relevant for GPU-based TSP optimization.</w:t>
-      </w:r>
-      <w:r>
-        <w:t>Abbreviations and Acronyms</w:t>
+        <w:t>optimization.</w:t>
+      </w:r>
+      <w:r>
+        <w:t>Abbreviations</w:t>
+      </w:r>
+      <w:proofErr w:type="spellEnd"/>
+      <w:r>
+        <w:t xml:space="preserve"> and Acronyms</w:t>
       </w:r>
     </w:p>
     <w:p>
@@ -694,7 +531,15 @@
           </w:tcPr>
           <w:p>
             <w:r>
-              <w:t>University of Arizona Ocelote HPC cluster</w:t>
+              <w:t xml:space="preserve">University of Arizona </w:t>
+            </w:r>
+            <w:proofErr w:type="spellStart"/>
+            <w:r>
+              <w:t>Ocelote</w:t>
+            </w:r>
+            <w:proofErr w:type="spellEnd"/>
+            <w:r>
+              <w:t xml:space="preserve"> HPC cluster</w:t>
             </w:r>
           </w:p>
         </w:tc>
@@ -888,8 +733,13 @@
             <w:hideMark/>
           </w:tcPr>
           <w:p>
+            <w:proofErr w:type="spellStart"/>
             <w:r>
-              <w:t>CMake 3.28.3</w:t>
+              <w:t>CMake</w:t>
+            </w:r>
+            <w:proofErr w:type="spellEnd"/>
+            <w:r>
+              <w:t xml:space="preserve"> 3.28.3</w:t>
             </w:r>
           </w:p>
         </w:tc>
@@ -1095,6 +945,90 @@
         <w:pStyle w:val="Heading1"/>
       </w:pPr>
       <w:r>
+        <w:t>Methodology</w:t>
+      </w:r>
+    </w:p>
+    <w:p>
+      <w:pPr>
+        <w:pStyle w:val="Text"/>
+      </w:pPr>
+      <w:r>
+        <w:t>The implementation process began with a basic Central Processing Unit (CPU) version of the Traveling Salesman Problem (TSP) solver. This version was designed as a baseline model for correctness and comparison before introducing Graphics Processing Unit (GPU) acceleration. The initial CPU implementation used a fixed problem-size limit of 128 cities, which allowed the data structures and algorithm design to be optimized around that upper bound. This constraint simplified memory allocation and tour representation while still supporting a useful range of benchmark instances from TSPLIB. The CPU model also provided a reference for validating tour construction, distance calculation, and final route-cost evaluation.</w:t>
+      </w:r>
+    </w:p>
+    <w:p>
+      <w:pPr>
+        <w:pStyle w:val="Text"/>
+      </w:pPr>
+    </w:p>
+    <w:p>
+      <w:pPr>
+        <w:pStyle w:val="Text"/>
+      </w:pPr>
+      <w:r>
+        <w:t>After establishing the CPU baseline, the next step was to implement a naive GPU version using CUDA (Compute Unified Device Architecture). This version focused on moving suitable computations from the CPU to the GPU with minimal algorithmic restructuring. The purpose of this stage was to evaluate the direct benefit of GPU parallelism and identify which parts of the solver were most expensive. Because this implementation was intentionally simple, it provided a useful intermediate comparison point between the CPU baseline and the more specialized GPU-based Genetic Algorithm (GA).</w:t>
+      </w:r>
+    </w:p>
+    <w:p>
+      <w:pPr>
+        <w:pStyle w:val="Text"/>
+      </w:pPr>
+    </w:p>
+    <w:p>
+      <w:pPr>
+        <w:pStyle w:val="Text"/>
+      </w:pPr>
+      <w:r>
+        <w:t>The final implementation used a GPU-based GA to search for high-quality approximate TSP solutions. In this approach, each candidate tour represented a possible ordering of cities, and the algorithm improved a population of candidate tours over multiple generations. Candidate tours were evaluated using a fitness function based on total tour distance, while genetic operations such as selection, crossover, and mutation were used to evolve the population. Portions of this process were parallelized on the GPU so that multiple candidate tours or operations could be evaluated concurrently. This structure allowed the implementation to take advantage of the large number of parallel execution units available on the GPU.</w:t>
+      </w:r>
+    </w:p>
+    <w:p>
+      <w:pPr>
+        <w:pStyle w:val="Text"/>
+      </w:pPr>
+    </w:p>
+    <w:p>
+      <w:pPr>
+        <w:pStyle w:val="Text"/>
+      </w:pPr>
+      <w:r>
+        <w:t>Additional optimization techniques were considered during development, including improvements to memory usage, kernel organization, thread layout, and data transfer patterns. [Placeholder: Add specific discussion of implemented optimizations, including any changes to memory layout, block/grid sizing, shared memory usage, reduction strategy, CUDA streams, or tour representation.]</w:t>
+      </w:r>
+    </w:p>
+    <w:p>
+      <w:pPr>
+        <w:pStyle w:val="Text"/>
+      </w:pPr>
+    </w:p>
+    <w:p>
+      <w:pPr>
+        <w:pStyle w:val="Text"/>
+      </w:pPr>
+      <w:r>
+        <w:t>Experimental results were collected using benchmark instances from TSPLIB. For each test case, the solution produced by the solver was compared against the known optimal or reference solution from TSPLIB. This comparison made it possible to measure solution quality using the difference between the produced tour length and the ideal tour length. Timing data was also collected for each implementation variant, allowing the CPU baseline, naive GPU version, and GPU-based GA to be compared in terms of runtime and solution quality.</w:t>
+      </w:r>
+    </w:p>
+    <w:p>
+      <w:pPr>
+        <w:pStyle w:val="Text"/>
+      </w:pPr>
+    </w:p>
+    <w:p>
+      <w:pPr>
+        <w:pStyle w:val="Text"/>
+      </w:pPr>
+      <w:r>
+        <w:t>Because the GA is probabilistic, individual runs may produce different tours and runtimes depending on the initial population, random choices during selection, crossover, and mutation, and the convergence behavior of the search. As a result, exact results are difficult to reproduce from a single run. To address this, multiple runs were performed for each variant and benchmark instance. Although each run could vary, repeated trials were sufficient to demonstrate consistent performance trends and provide a useful basis for comparing different implementation variants and optimization strategies.</w:t>
+      </w:r>
+      <w:r>
+        <w:t>”</w:t>
+      </w:r>
+    </w:p>
+    <w:p>
+      <w:pPr>
+        <w:pStyle w:val="Heading1"/>
+      </w:pPr>
+      <w:r>
         <w:t>Results</w:t>
       </w:r>
     </w:p>
@@ -1137,7 +1071,15 @@
         <w:t>2</w:t>
       </w:r>
       <w:r>
-        <w:t>).” An exception is when English units are used as identifiers in trade, such as “3½-in disk drive.” Avoid combining SI and CGS units, such as current in amperes and magnetic field in oersteds. This often leads to confusion because equations do not balance dimensionally. If you must use mixed units, clearly state the units for each quantity in an equation.</w:t>
+        <w:t xml:space="preserve">).” An exception is when English units are used as identifiers in trade, such as “3½-in disk drive.” Avoid combining SI and CGS units, such as current in amperes and magnetic field in </w:t>
+      </w:r>
+      <w:proofErr w:type="spellStart"/>
+      <w:r>
+        <w:t>oersteds</w:t>
+      </w:r>
+      <w:proofErr w:type="spellEnd"/>
+      <w:r>
+        <w:t>. This often leads to confusion because equations do not balance dimensionally. If you must use mixed units, clearly state the units for each quantity in an equation.</w:t>
       </w:r>
     </w:p>
     <w:p>
@@ -1195,127 +1137,73 @@
     </w:p>
     <w:p>
       <w:pPr>
+        <w:pStyle w:val="Text"/>
+      </w:pPr>
+    </w:p>
+    <w:p>
+      <w:pPr>
         <w:pStyle w:val="Heading1"/>
       </w:pPr>
       <w:r>
-        <w:t>S</w:t>
-      </w:r>
-    </w:p>
-    <w:p>
-      <w:pPr>
-        <w:pStyle w:val="Text"/>
-      </w:pPr>
-      <w:r>
-        <w:t>The word “data” is plural, not singular. The subscript for the permeability of vacuum µ</w:t>
-      </w:r>
-      <w:r>
-        <w:rPr>
-          <w:vertAlign w:val="subscript"/>
-        </w:rPr>
-        <w:t>0</w:t>
-      </w:r>
-      <w:r>
-        <w:t xml:space="preserve"> is zero, not a lowercase letter “o.” The term for residual magnetization is “remanence”; the adjective is “remanent”; do not write “remnance” or “remnant.” Use the word “micrometer” instead of “micron.” A graph within a graph is an “inset,” not an “insert.” The word “alternatively” is preferred to the word “alternately” (unless “issue” as a euphemism for “problem.” When compositions are not specified, separate chemical symbols by en-dashes; for example, “NiMn” indicates the intermetallic compound Ni</w:t>
-      </w:r>
-      <w:r>
-        <w:rPr>
-          <w:vertAlign w:val="subscript"/>
-        </w:rPr>
-        <w:t>0.5</w:t>
-      </w:r>
-      <w:r>
-        <w:t>Mn</w:t>
-      </w:r>
-      <w:r>
-        <w:rPr>
-          <w:vertAlign w:val="subscript"/>
-        </w:rPr>
-        <w:t>0.5</w:t>
-      </w:r>
-      <w:r>
-        <w:t xml:space="preserve"> whereas “Ni–Mn” indicates an alloy of some composition Ni</w:t>
-      </w:r>
-      <w:r>
-        <w:rPr>
-          <w:vertAlign w:val="subscript"/>
-        </w:rPr>
-        <w:t>x</w:t>
-      </w:r>
-      <w:r>
-        <w:t>Mn</w:t>
-      </w:r>
-      <w:r>
-        <w:rPr>
-          <w:vertAlign w:val="subscript"/>
-        </w:rPr>
-        <w:t>1-x</w:t>
-      </w:r>
-      <w:r>
-        <w:t>.</w:t>
-      </w:r>
-    </w:p>
-    <w:p>
-      <w:pPr>
-        <w:pStyle w:val="Text"/>
-      </w:pPr>
-      <w:r>
-        <w:t xml:space="preserve">Be aware of the different meanings of the homophones “affect” (usually a verb) and “effect” (usually a noun), “complement” and “compliment,” “discreet” and “discrete,” “principal” (e.g., “principal investigator”) and “principle” (e.g., “principle of measurement”). Do not confuse “imply” and “infer.” </w:t>
-      </w:r>
-    </w:p>
-    <w:p>
-      <w:pPr>
-        <w:pStyle w:val="Text"/>
-      </w:pPr>
-      <w:r>
-        <w:t xml:space="preserve">Prefixes such as “non,” “sub,” “micro,” “multi,” and “ultra” are not independent words; they should be joined to the words </w:t>
-      </w:r>
-      <w:r>
-        <w:lastRenderedPageBreak/>
-        <w:t>they modify, usually without a hyphen. There is no period after the “et” in the Latin abbreviation “</w:t>
-      </w:r>
-      <w:r>
-        <w:rPr>
-          <w:i/>
-          <w:iCs/>
-        </w:rPr>
-        <w:t>et al.</w:t>
-      </w:r>
-      <w:r>
-        <w:t>” (it is also italicized). The abbreviation “i.e.,” means “that is,” and the abbreviation “e.g.,” means “for example” (these abbreviations are not italicized).</w:t>
-      </w:r>
-    </w:p>
-    <w:p>
-      <w:pPr>
-        <w:pStyle w:val="Text"/>
-      </w:pPr>
-      <w:r>
-        <w:t>A general IEEE style</w:t>
-      </w:r>
-      <w:r>
-        <w:t xml:space="preserve">guide is available at </w:t>
-      </w:r>
-      <w:hyperlink r:id="rId9" w:tgtFrame="_blank" w:history="1">
-        <w:r>
-          <w:rPr>
-            <w:rStyle w:val="Hyperlink"/>
-            <w:color w:val="1155CC"/>
-            <w:sz w:val="19"/>
-            <w:szCs w:val="19"/>
-            <w:shd w:val="clear" w:color="auto" w:fill="FFFFFF"/>
-          </w:rPr>
-          <w:t>www.ieee.org/authortools</w:t>
-        </w:r>
-      </w:hyperlink>
-      <w:r>
-        <w:rPr>
-          <w:rStyle w:val="Hyperlink"/>
-          <w:color w:val="1155CC"/>
-          <w:sz w:val="19"/>
-          <w:szCs w:val="19"/>
-          <w:shd w:val="clear" w:color="auto" w:fill="FFFFFF"/>
-        </w:rPr>
-        <w:t>.</w:t>
-      </w:r>
+        <w:t>Future work</w:t>
+      </w:r>
+    </w:p>
+    <w:p>
+      <w:pPr>
+        <w:pStyle w:val="Heading2"/>
+        <w:rPr>
+          <w:i w:val="0"/>
+          <w:iCs w:val="0"/>
+        </w:rPr>
+      </w:pPr>
+      <w:r>
+        <w:rPr>
+          <w:i w:val="0"/>
+          <w:iCs w:val="0"/>
+        </w:rPr>
+        <w:t>Future work for this project could explore hybrid approaches that combine the current GPU-based search strategy with local optimization methods such as 2-opt, 3-opt, or higher-order k-opt searches. A hybrid design could use the primary algorithm to generate promising candidate tours, then apply opt-based local search to refine those tours and reduce total path length. This would allow the algorithm to balance global exploration with local improvement, potentially improving solution quality without requiring a full exhaustive search over the entire solution space.</w:t>
+      </w:r>
+    </w:p>
+    <w:p>
+      <w:pPr>
+        <w:pStyle w:val="Heading2"/>
+        <w:rPr>
+          <w:i w:val="0"/>
+          <w:iCs w:val="0"/>
+        </w:rPr>
+      </w:pPr>
+    </w:p>
+    <w:p>
+      <w:pPr>
+        <w:pStyle w:val="Heading2"/>
+        <w:rPr>
+          <w:i w:val="0"/>
+          <w:iCs w:val="0"/>
+        </w:rPr>
+      </w:pPr>
+      <w:r>
+        <w:rPr>
+          <w:i w:val="0"/>
+          <w:iCs w:val="0"/>
+        </w:rPr>
+        <w:t xml:space="preserve">Additional optimization work could also focus on improving GPU utilization and reducing memory overhead. This includes experimenting with different CUDA block and grid configurations, improving memory coalescing, reducing unnecessary global memory accesses, and evaluating whether shared memory or constant memory can improve distance </w:t>
+      </w:r>
+      <w:r>
+        <w:rPr>
+          <w:i w:val="0"/>
+          <w:iCs w:val="0"/>
+        </w:rPr>
+        <w:t>calculations. Further profiling could help identify bottlenecks in kernel execution, memory transfer, and synchronization, allowing the implementation to better exploit the available GPU hardware.</w:t>
+      </w:r>
+    </w:p>
+    <w:p>
+      <w:pPr>
+        <w:pStyle w:val="Heading2"/>
+        <w:rPr>
+          <w:i w:val="0"/>
+          <w:iCs w:val="0"/>
+        </w:rPr>
+      </w:pPr>
     </w:p>
     <w:p>
       <w:pPr>
@@ -1325,1683 +1213,13 @@
           <w:numId w:val="0"/>
         </w:numPr>
       </w:pPr>
-    </w:p>
-    <w:p>
-      <w:pPr>
-        <w:pStyle w:val="Heading1"/>
-      </w:pPr>
-      <w:r>
-        <w:t>Guidelines for Graphics Preparation</w:t>
-      </w:r>
-      <w:r>
-        <w:t xml:space="preserve"> </w:t>
-      </w:r>
-      <w:r>
-        <w:br/>
-      </w:r>
-      <w:r>
-        <w:t>and Submission</w:t>
-      </w:r>
-    </w:p>
-    <w:p>
-      <w:pPr>
-        <w:pStyle w:val="Heading2"/>
-      </w:pPr>
-      <w:r>
-        <w:t>Types of Graphics</w:t>
-      </w:r>
-    </w:p>
-    <w:p>
-      <w:pPr>
-        <w:ind w:firstLine="144"/>
-        <w:jc w:val="both"/>
-      </w:pPr>
-      <w:r>
-        <w:t xml:space="preserve">The following list outlines the different types of graphics published in IEEE </w:t>
-      </w:r>
-      <w:r>
-        <w:t>j</w:t>
-      </w:r>
-      <w:r>
-        <w:t>ournals</w:t>
-      </w:r>
-      <w:r>
-        <w:t>. They are categorized based on their construction, and use of color / shades of gray:</w:t>
-      </w:r>
-    </w:p>
-    <w:p/>
-    <w:p>
-      <w:pPr>
-        <w:pStyle w:val="Heading3"/>
-        <w:jc w:val="both"/>
-        <w:rPr>
-          <w:rStyle w:val="Heading2Char"/>
-          <w:rFonts w:ascii="Times" w:hAnsi="Times" w:cs="Verdana"/>
-          <w:i/>
-          <w:color w:val="000000"/>
-        </w:rPr>
-      </w:pPr>
-      <w:r>
-        <w:rPr>
-          <w:rStyle w:val="Heading2Char"/>
-          <w:i/>
-        </w:rPr>
-        <w:t>Color/Grayscale figures</w:t>
-      </w:r>
-    </w:p>
-    <w:p>
-      <w:pPr>
-        <w:pStyle w:val="Heading3"/>
-        <w:numPr>
-          <w:ilvl w:val="0"/>
-          <w:numId w:val="0"/>
-        </w:numPr>
-        <w:ind w:left="288"/>
-        <w:jc w:val="both"/>
-        <w:rPr>
-          <w:rStyle w:val="BodyText2"/>
-          <w:rFonts w:ascii="Times" w:hAnsi="Times"/>
+      <w:r>
+        <w:rPr>
           <w:i w:val="0"/>
           <w:iCs w:val="0"/>
-          <w:sz w:val="20"/>
-          <w:szCs w:val="20"/>
-        </w:rPr>
-      </w:pPr>
-      <w:r>
-        <w:rPr>
-          <w:rStyle w:val="BodyText2"/>
-          <w:rFonts w:ascii="Times" w:hAnsi="Times"/>
-          <w:i w:val="0"/>
-          <w:sz w:val="20"/>
-          <w:szCs w:val="20"/>
-        </w:rPr>
-        <w:t xml:space="preserve"> </w:t>
-      </w:r>
-      <w:r>
-        <w:rPr>
-          <w:rStyle w:val="BodyText2"/>
-          <w:rFonts w:ascii="Times" w:hAnsi="Times"/>
-          <w:i w:val="0"/>
-          <w:sz w:val="20"/>
-          <w:szCs w:val="20"/>
-        </w:rPr>
-        <w:t xml:space="preserve">Figures that are meant to appear in color, or shades of black/gray. Such figures may include photographs, </w:t>
-      </w:r>
-      <w:r>
-        <w:rPr>
-          <w:rStyle w:val="BodyText2"/>
-          <w:rFonts w:ascii="Times" w:hAnsi="Times"/>
-          <w:i w:val="0"/>
-          <w:sz w:val="20"/>
-          <w:szCs w:val="20"/>
-        </w:rPr>
-        <w:br/>
-        <w:t>illustrations, multicolor graphs, and flowcharts.</w:t>
-      </w:r>
-    </w:p>
-    <w:p>
-      <w:pPr>
-        <w:pStyle w:val="Heading3"/>
-        <w:jc w:val="both"/>
-        <w:rPr>
-          <w:rStyle w:val="Heading2Char"/>
-          <w:rFonts w:ascii="Times" w:hAnsi="Times" w:cs="Verdana"/>
-          <w:i/>
-          <w:iCs/>
-          <w:color w:val="000000"/>
-        </w:rPr>
-      </w:pPr>
-      <w:r>
-        <w:rPr>
-          <w:rStyle w:val="Heading2Char"/>
-          <w:i/>
-        </w:rPr>
-        <w:t>Line</w:t>
-      </w:r>
-      <w:r>
-        <w:rPr>
-          <w:rStyle w:val="Heading2Char"/>
-          <w:i/>
-        </w:rPr>
-        <w:t xml:space="preserve"> A</w:t>
-      </w:r>
-      <w:r>
-        <w:rPr>
-          <w:rStyle w:val="Heading2Char"/>
-          <w:i/>
-        </w:rPr>
-        <w:t>rt figures</w:t>
-      </w:r>
-    </w:p>
-    <w:p>
-      <w:pPr>
-        <w:pStyle w:val="Heading3"/>
-        <w:numPr>
-          <w:ilvl w:val="0"/>
-          <w:numId w:val="0"/>
-        </w:numPr>
-        <w:ind w:left="288"/>
-        <w:jc w:val="both"/>
-        <w:rPr>
-          <w:rStyle w:val="BodyText2"/>
-          <w:rFonts w:ascii="Times" w:hAnsi="Times"/>
-          <w:i w:val="0"/>
-          <w:iCs w:val="0"/>
-          <w:sz w:val="20"/>
-          <w:szCs w:val="20"/>
-        </w:rPr>
-      </w:pPr>
-      <w:r>
-        <w:rPr>
-          <w:rStyle w:val="BodyText2"/>
-          <w:rFonts w:ascii="Times" w:hAnsi="Times"/>
-          <w:i w:val="0"/>
-          <w:sz w:val="20"/>
-          <w:szCs w:val="20"/>
-        </w:rPr>
-        <w:t>Figures that are composed of only black lines and shapes. These figures should have n</w:t>
-      </w:r>
-      <w:r>
-        <w:rPr>
-          <w:rStyle w:val="BodyText2"/>
-          <w:rFonts w:ascii="Times" w:hAnsi="Times"/>
-          <w:i w:val="0"/>
-          <w:sz w:val="20"/>
-          <w:szCs w:val="20"/>
-        </w:rPr>
-        <w:t>o shades or half-tones of gray, o</w:t>
-      </w:r>
-      <w:r>
-        <w:rPr>
-          <w:rStyle w:val="BodyText2"/>
-          <w:rFonts w:ascii="Times" w:hAnsi="Times"/>
-          <w:i w:val="0"/>
-          <w:sz w:val="20"/>
-          <w:szCs w:val="20"/>
-        </w:rPr>
-        <w:t>nly black and white.</w:t>
-      </w:r>
-    </w:p>
-    <w:p>
-      <w:pPr>
-        <w:pStyle w:val="Heading3"/>
-        <w:jc w:val="both"/>
-        <w:rPr>
-          <w:rStyle w:val="BodyText2"/>
-          <w:rFonts w:ascii="Times" w:hAnsi="Times"/>
-          <w:i w:val="0"/>
-          <w:iCs w:val="0"/>
-          <w:sz w:val="20"/>
-          <w:szCs w:val="20"/>
-        </w:rPr>
-      </w:pPr>
-      <w:r>
-        <w:rPr>
-          <w:rStyle w:val="Heading2Char"/>
-          <w:i/>
-        </w:rPr>
-        <w:t>Author p</w:t>
-      </w:r>
-      <w:r>
-        <w:rPr>
-          <w:rStyle w:val="Heading2Char"/>
-          <w:i/>
-        </w:rPr>
-        <w:t>hotos</w:t>
-      </w:r>
-    </w:p>
-    <w:p>
-      <w:pPr>
-        <w:pStyle w:val="Heading3"/>
-        <w:numPr>
-          <w:ilvl w:val="0"/>
-          <w:numId w:val="0"/>
-        </w:numPr>
-        <w:ind w:left="288"/>
-        <w:jc w:val="both"/>
-        <w:rPr>
-          <w:rStyle w:val="BodyText2"/>
-          <w:rFonts w:ascii="Times" w:hAnsi="Times"/>
-          <w:i w:val="0"/>
-          <w:iCs w:val="0"/>
-          <w:sz w:val="20"/>
-          <w:szCs w:val="20"/>
-        </w:rPr>
-      </w:pPr>
-      <w:r>
-        <w:rPr>
-          <w:rStyle w:val="BodyText2"/>
-          <w:rFonts w:ascii="Times" w:hAnsi="Times"/>
-          <w:i w:val="0"/>
-          <w:sz w:val="20"/>
-          <w:szCs w:val="20"/>
-        </w:rPr>
-        <w:t xml:space="preserve">Head and </w:t>
-      </w:r>
-      <w:r>
-        <w:rPr>
-          <w:rStyle w:val="BodyText2"/>
-          <w:rFonts w:ascii="Times" w:hAnsi="Times"/>
-          <w:i w:val="0"/>
-          <w:sz w:val="20"/>
-          <w:szCs w:val="20"/>
-        </w:rPr>
-        <w:t>shoulders shots of authors that</w:t>
-      </w:r>
-      <w:r>
-        <w:rPr>
-          <w:rStyle w:val="BodyText2"/>
-          <w:rFonts w:ascii="Times" w:hAnsi="Times"/>
-          <w:i w:val="0"/>
-          <w:sz w:val="20"/>
-          <w:szCs w:val="20"/>
-        </w:rPr>
-        <w:t xml:space="preserve"> appear at the end of our papers. </w:t>
-      </w:r>
-    </w:p>
-    <w:p>
-      <w:pPr>
-        <w:pStyle w:val="Heading3"/>
-        <w:jc w:val="both"/>
-        <w:rPr>
-          <w:rStyle w:val="BodyText2"/>
-          <w:rFonts w:ascii="Times" w:hAnsi="Times"/>
-          <w:i w:val="0"/>
-          <w:iCs w:val="0"/>
-          <w:sz w:val="20"/>
-          <w:szCs w:val="20"/>
-        </w:rPr>
-      </w:pPr>
-      <w:r>
-        <w:rPr>
-          <w:rStyle w:val="Heading2Char"/>
-          <w:i/>
-        </w:rPr>
-        <w:t>Tables</w:t>
-      </w:r>
-      <w:r>
-        <w:rPr>
-          <w:rStyle w:val="BodyText2"/>
-          <w:rFonts w:ascii="Times" w:hAnsi="Times"/>
-          <w:sz w:val="20"/>
-          <w:szCs w:val="20"/>
-        </w:rPr>
-        <w:br/>
-      </w:r>
-      <w:r>
-        <w:rPr>
-          <w:rStyle w:val="BodyText2"/>
-          <w:rFonts w:ascii="Times" w:hAnsi="Times"/>
-          <w:i w:val="0"/>
-          <w:sz w:val="20"/>
-          <w:szCs w:val="20"/>
-        </w:rPr>
-        <w:t>Data charts which are typically black and white, but sometimes include color.</w:t>
-      </w:r>
-    </w:p>
-    <w:p>
-      <w:pPr>
-        <w:pStyle w:val="Heading2"/>
-        <w:jc w:val="both"/>
-        <w:rPr>
-          <w:rStyle w:val="BodyText2"/>
-          <w:rFonts w:ascii="Cambria" w:hAnsi="Cambria" w:cs="Times New Roman"/>
-          <w:color w:val="auto"/>
-          <w:sz w:val="20"/>
-          <w:szCs w:val="20"/>
-        </w:rPr>
-      </w:pPr>
-      <w:r>
-        <w:rPr>
-          <w:rStyle w:val="BodyText2"/>
-          <w:rFonts w:ascii="Cambria" w:hAnsi="Cambria" w:cs="Times New Roman"/>
-          <w:color w:val="auto"/>
-          <w:sz w:val="20"/>
-          <w:szCs w:val="20"/>
-        </w:rPr>
-        <w:t>Multip</w:t>
-      </w:r>
-      <w:r>
-        <w:rPr>
-          <w:rStyle w:val="BodyText2"/>
-          <w:rFonts w:ascii="Cambria" w:hAnsi="Cambria" w:cs="Times New Roman"/>
-          <w:color w:val="auto"/>
-          <w:sz w:val="20"/>
-          <w:szCs w:val="20"/>
-        </w:rPr>
-        <w:t>art figures</w:t>
-      </w:r>
-    </w:p>
-    <w:p>
-      <w:pPr>
-        <w:ind w:firstLine="144"/>
-        <w:jc w:val="both"/>
-        <w:rPr>
-          <w:rFonts w:ascii="Times" w:hAnsi="Times" w:cs="Verdana"/>
-          <w:color w:val="000000"/>
-        </w:rPr>
-      </w:pPr>
-      <w:r>
-        <w:rPr>
-          <w:rFonts w:ascii="Times" w:hAnsi="Times" w:cs="Verdana"/>
-          <w:color w:val="000000"/>
-        </w:rPr>
-        <w:t>Figures compiled of more than one sub-figure presented side-by-side, or</w:t>
-      </w:r>
-      <w:r>
-        <w:rPr>
-          <w:rFonts w:ascii="Times" w:hAnsi="Times" w:cs="Verdana"/>
-          <w:color w:val="000000"/>
-        </w:rPr>
-        <w:t xml:space="preserve"> stacked</w:t>
-      </w:r>
-      <w:r>
-        <w:rPr>
-          <w:rFonts w:ascii="Times" w:hAnsi="Times" w:cs="Verdana"/>
-          <w:color w:val="000000"/>
-        </w:rPr>
-        <w:t>. If a multipart figure is made up of multiple figure types (one part is lineart, and another is grayscale or color) the figure should meet the stricter guidelin</w:t>
-      </w:r>
-      <w:r>
-        <w:rPr>
-          <w:rFonts w:ascii="Times" w:hAnsi="Times" w:cs="Verdana"/>
-          <w:color w:val="000000"/>
-        </w:rPr>
-        <w:t>es</w:t>
-      </w:r>
-      <w:r>
-        <w:rPr>
-          <w:rFonts w:ascii="Times" w:hAnsi="Times" w:cs="Verdana"/>
-          <w:color w:val="000000"/>
-        </w:rPr>
-        <w:t>.</w:t>
-      </w:r>
-    </w:p>
-    <w:p>
-      <w:pPr>
-        <w:pStyle w:val="Heading2"/>
-        <w:jc w:val="both"/>
-      </w:pPr>
-      <w:r>
-        <w:t>File Formats For Graphics</w:t>
-      </w:r>
-    </w:p>
-    <w:p>
-      <w:pPr>
-        <w:ind w:firstLine="144"/>
-        <w:jc w:val="both"/>
-      </w:pPr>
-      <w:r>
-        <w:t>Format and save your graphics using a suitable graphics processing program that will allow you to create the images as PostScript (PS), Encapsulated PostScript (</w:t>
-      </w:r>
-      <w:r>
-        <w:t>.</w:t>
-      </w:r>
-      <w:r>
-        <w:t>EPS), Tagged Image File Format (</w:t>
-      </w:r>
-      <w:r>
-        <w:t>.</w:t>
-      </w:r>
-      <w:r>
-        <w:t>TIFF), Portable Document Format (</w:t>
-      </w:r>
-      <w:r>
-        <w:t>.</w:t>
-      </w:r>
-      <w:r>
-        <w:t>PDF), or Portable Network Graphics (</w:t>
-      </w:r>
-      <w:r>
-        <w:t>.</w:t>
-      </w:r>
-      <w:r>
-        <w:t>PNG) sizes them, and adjusts the resolution settings. If you created your source files in one of the following programs you will be able to submit the graphics without converting to a PS, EPS, TIFF, PDF, or PNG file: Microsoft Word, Microsoft PowerPoint, or Microsoft Excel.</w:t>
-      </w:r>
-      <w:r>
-        <w:t xml:space="preserve"> Though it is not required, it is </w:t>
-      </w:r>
-      <w:r>
-        <w:t xml:space="preserve">strongly </w:t>
-      </w:r>
-      <w:r>
-        <w:t>recommended that these files be saved in PDF format rather than DOC, XLS, or PPT. Doing so will protect your figures from common font and arrow stroke issues that occur when working on the files across multiple platforms.</w:t>
-      </w:r>
-      <w:r>
-        <w:t xml:space="preserve"> When submitting your final paper, your graphics should all be submitted individually in one of these formats along with the manuscript.</w:t>
-      </w:r>
-    </w:p>
-    <w:p>
-      <w:pPr>
-        <w:pStyle w:val="Heading2"/>
-        <w:jc w:val="both"/>
-      </w:pPr>
-      <w:r>
-        <w:t>Sizing of Graphics</w:t>
-      </w:r>
-    </w:p>
-    <w:p>
-      <w:pPr>
-        <w:ind w:firstLine="144"/>
-        <w:jc w:val="both"/>
-        <w:rPr>
-          <w:rStyle w:val="BodyText2"/>
-          <w:rFonts w:ascii="Times" w:hAnsi="Times"/>
-          <w:sz w:val="20"/>
-          <w:szCs w:val="20"/>
-        </w:rPr>
-      </w:pPr>
-      <w:r>
-        <w:rPr>
-          <w:rStyle w:val="BodyText2"/>
-          <w:rFonts w:ascii="Times" w:hAnsi="Times"/>
-          <w:sz w:val="20"/>
-          <w:szCs w:val="20"/>
-        </w:rPr>
-        <w:t xml:space="preserve">Most charts, graphs, and tables are one column wide (3.5 inches / 88 millimeters / 21 picas) or page wide (7.16 inches / 181 millimeters / 43 picas). The maximum depth a graphic can </w:t>
-      </w:r>
-      <w:r>
-        <w:rPr>
-          <w:rStyle w:val="BodyText2"/>
-          <w:rFonts w:ascii="Times" w:hAnsi="Times"/>
-          <w:sz w:val="20"/>
-          <w:szCs w:val="20"/>
-        </w:rPr>
-        <w:t xml:space="preserve">be is 8.5 inches (216 millimeters / 54 picas). When choosing the depth of a graphic, please allow space for a caption. Figures can be sized between column and page widths if the author chooses, however it is recommended that figures are not sized less than column width unless when necessary. </w:t>
-      </w:r>
-    </w:p>
-    <w:p>
-      <w:pPr>
-        <w:ind w:firstLine="144"/>
-        <w:jc w:val="both"/>
-        <w:rPr>
-          <w:rStyle w:val="bodytype"/>
-          <w:rFonts w:ascii="Times" w:hAnsi="Times"/>
-          <w:sz w:val="20"/>
-          <w:szCs w:val="20"/>
-        </w:rPr>
-      </w:pPr>
-      <w:r>
-        <w:rPr>
-          <w:rStyle w:val="bodytype"/>
-          <w:rFonts w:ascii="Times" w:hAnsi="Times"/>
-          <w:sz w:val="20"/>
-          <w:szCs w:val="20"/>
-        </w:rPr>
-        <w:t>There is currently one publication with column measurements that do</w:t>
-      </w:r>
-      <w:r>
-        <w:rPr>
-          <w:rStyle w:val="bodytype"/>
-          <w:rFonts w:ascii="Times" w:hAnsi="Times"/>
-          <w:sz w:val="20"/>
-          <w:szCs w:val="20"/>
-        </w:rPr>
-        <w:t xml:space="preserve"> no</w:t>
-      </w:r>
-      <w:r>
-        <w:rPr>
-          <w:rStyle w:val="bodytype"/>
-          <w:rFonts w:ascii="Times" w:hAnsi="Times"/>
-          <w:sz w:val="20"/>
-          <w:szCs w:val="20"/>
-        </w:rPr>
-        <w:t xml:space="preserve">t </w:t>
-      </w:r>
-      <w:r>
-        <w:rPr>
-          <w:rStyle w:val="bodytype"/>
-          <w:rFonts w:ascii="Times" w:hAnsi="Times"/>
-          <w:sz w:val="20"/>
-          <w:szCs w:val="20"/>
-        </w:rPr>
-        <w:t>coincide</w:t>
-      </w:r>
-      <w:r>
-        <w:rPr>
-          <w:rStyle w:val="bodytype"/>
-          <w:rFonts w:ascii="Times" w:hAnsi="Times"/>
-          <w:sz w:val="20"/>
-          <w:szCs w:val="20"/>
-        </w:rPr>
-        <w:t xml:space="preserve"> with those listed above. </w:t>
-      </w:r>
-      <w:r>
-        <w:rPr>
-          <w:rStyle w:val="Style1Char"/>
-        </w:rPr>
-        <w:t>Proceedings of the IEEE</w:t>
-      </w:r>
-      <w:r>
-        <w:rPr>
-          <w:rStyle w:val="bodytype"/>
-          <w:rFonts w:ascii="Times" w:hAnsi="Times"/>
-          <w:sz w:val="20"/>
-          <w:szCs w:val="20"/>
-        </w:rPr>
-        <w:t xml:space="preserve"> has a column measurement of 3.25 inches (82.5 millimeters / 19.5 picas). </w:t>
-      </w:r>
-    </w:p>
-    <w:p>
-      <w:pPr>
-        <w:ind w:firstLine="144"/>
-        <w:jc w:val="both"/>
-        <w:rPr>
-          <w:rStyle w:val="bodytype"/>
-          <w:rFonts w:ascii="Times" w:hAnsi="Times" w:cs="Verdana"/>
-          <w:sz w:val="20"/>
-          <w:szCs w:val="20"/>
-        </w:rPr>
-      </w:pPr>
-      <w:r>
-        <w:rPr>
-          <w:rStyle w:val="BodyText2"/>
-          <w:rFonts w:ascii="Times" w:hAnsi="Times"/>
-          <w:sz w:val="20"/>
-          <w:szCs w:val="20"/>
-        </w:rPr>
-        <w:t xml:space="preserve">The final printed size of author photographs is exactly </w:t>
-      </w:r>
-      <w:r>
-        <w:rPr>
-          <w:rStyle w:val="BodyText2"/>
-          <w:rFonts w:ascii="Times" w:hAnsi="Times"/>
-          <w:sz w:val="20"/>
-          <w:szCs w:val="20"/>
-        </w:rPr>
-        <w:br/>
-        <w:t>1 inc</w:t>
-      </w:r>
-      <w:r>
-        <w:rPr>
-          <w:rStyle w:val="BodyText2"/>
-          <w:rFonts w:ascii="Times" w:hAnsi="Times"/>
-          <w:sz w:val="20"/>
-          <w:szCs w:val="20"/>
-        </w:rPr>
-        <w:t>h wide by 1.25 inches tall (25</w:t>
-      </w:r>
-      <w:r>
-        <w:rPr>
-          <w:rStyle w:val="BodyText2"/>
-          <w:rFonts w:ascii="Times" w:hAnsi="Times"/>
-          <w:sz w:val="20"/>
-          <w:szCs w:val="20"/>
-        </w:rPr>
-        <w:t>.4</w:t>
-      </w:r>
-      <w:r>
-        <w:rPr>
-          <w:rStyle w:val="BodyText2"/>
-          <w:rFonts w:ascii="Times" w:hAnsi="Times"/>
-          <w:sz w:val="20"/>
-          <w:szCs w:val="20"/>
-        </w:rPr>
-        <w:t xml:space="preserve"> </w:t>
-      </w:r>
-      <w:r>
-        <w:rPr>
-          <w:rStyle w:val="BodyText2"/>
-          <w:rFonts w:ascii="Times" w:hAnsi="Times"/>
-          <w:sz w:val="20"/>
-          <w:szCs w:val="20"/>
-        </w:rPr>
-        <w:t>millimeters x 3</w:t>
-      </w:r>
-      <w:r>
-        <w:rPr>
-          <w:rStyle w:val="BodyText2"/>
-          <w:rFonts w:ascii="Times" w:hAnsi="Times"/>
-          <w:sz w:val="20"/>
-          <w:szCs w:val="20"/>
-        </w:rPr>
-        <w:t>1.75</w:t>
-      </w:r>
-      <w:r>
-        <w:rPr>
-          <w:rStyle w:val="BodyText2"/>
-          <w:rFonts w:ascii="Times" w:hAnsi="Times"/>
-          <w:sz w:val="20"/>
-          <w:szCs w:val="20"/>
-        </w:rPr>
-        <w:t xml:space="preserve"> millimeters / 6 picas x 7.5 picas). Author photos printed in editorials measure 1.59 inches wide by 2 inches tall (40 </w:t>
-      </w:r>
-      <w:r>
-        <w:rPr>
-          <w:rStyle w:val="BodyText2"/>
-          <w:rFonts w:ascii="Times" w:hAnsi="Times"/>
-          <w:sz w:val="20"/>
-          <w:szCs w:val="20"/>
-        </w:rPr>
-        <w:t>millimeters x</w:t>
-      </w:r>
-      <w:r>
-        <w:rPr>
-          <w:rStyle w:val="BodyText2"/>
-          <w:rFonts w:ascii="Times" w:hAnsi="Times"/>
-          <w:sz w:val="20"/>
-          <w:szCs w:val="20"/>
-        </w:rPr>
-        <w:t xml:space="preserve"> 50 </w:t>
-      </w:r>
-      <w:r>
-        <w:rPr>
-          <w:rStyle w:val="BodyText2"/>
-          <w:rFonts w:ascii="Times" w:hAnsi="Times"/>
-          <w:sz w:val="20"/>
-          <w:szCs w:val="20"/>
-        </w:rPr>
-        <w:t>millimeters /</w:t>
-      </w:r>
-      <w:r>
-        <w:rPr>
-          <w:rStyle w:val="BodyText2"/>
-          <w:rFonts w:ascii="Times" w:hAnsi="Times"/>
-          <w:sz w:val="20"/>
-          <w:szCs w:val="20"/>
-        </w:rPr>
-        <w:t xml:space="preserve"> 9.5 picas x 12 picas).</w:t>
-      </w:r>
-    </w:p>
-    <w:p>
-      <w:pPr>
-        <w:pStyle w:val="Heading2"/>
-        <w:jc w:val="both"/>
-        <w:rPr>
-          <w:rStyle w:val="bodytype"/>
-          <w:rFonts w:ascii="Times" w:hAnsi="Times"/>
-          <w:b/>
-          <w:smallCaps/>
-          <w:sz w:val="20"/>
-          <w:szCs w:val="20"/>
-        </w:rPr>
-      </w:pPr>
-      <w:r>
-        <w:t>Resolution</w:t>
-      </w:r>
-      <w:r>
-        <w:rPr>
-          <w:rStyle w:val="bodytype"/>
-          <w:rFonts w:ascii="Times" w:hAnsi="Times"/>
-          <w:sz w:val="20"/>
-          <w:szCs w:val="20"/>
-        </w:rPr>
-        <w:t xml:space="preserve"> </w:t>
-      </w:r>
-    </w:p>
-    <w:p>
-      <w:pPr>
-        <w:ind w:firstLine="144"/>
-        <w:jc w:val="both"/>
-        <w:rPr>
-          <w:rStyle w:val="bodytype"/>
-          <w:rFonts w:ascii="Times" w:hAnsi="Times"/>
-          <w:sz w:val="20"/>
-          <w:szCs w:val="20"/>
-        </w:rPr>
-      </w:pPr>
-      <w:r>
-        <w:rPr>
-          <w:rStyle w:val="bodytype"/>
-          <w:rFonts w:ascii="Times" w:hAnsi="Times"/>
-          <w:sz w:val="20"/>
-          <w:szCs w:val="20"/>
-        </w:rPr>
-        <w:t>The proper resolution of your figures will depend on the type of figure it is as defined in the “Types of Figures” section. Author photographs, color, and grayscale figures should be at least 300dpi. Line</w:t>
-      </w:r>
-      <w:r>
-        <w:rPr>
-          <w:rStyle w:val="bodytype"/>
-          <w:rFonts w:ascii="Times" w:hAnsi="Times"/>
-          <w:sz w:val="20"/>
-          <w:szCs w:val="20"/>
-        </w:rPr>
-        <w:t xml:space="preserve"> </w:t>
-      </w:r>
-      <w:r>
-        <w:rPr>
-          <w:rStyle w:val="bodytype"/>
-          <w:rFonts w:ascii="Times" w:hAnsi="Times"/>
-          <w:sz w:val="20"/>
-          <w:szCs w:val="20"/>
-        </w:rPr>
-        <w:t>art, including tables should be a minimum of 600dpi.</w:t>
-      </w:r>
-    </w:p>
-    <w:p>
-      <w:pPr>
-        <w:pStyle w:val="Heading2"/>
-        <w:jc w:val="both"/>
-        <w:rPr>
-          <w:rStyle w:val="bodytype"/>
-          <w:rFonts w:ascii="Cambria" w:hAnsi="Cambria" w:cs="Times New Roman"/>
-          <w:smallCaps/>
-          <w:color w:val="auto"/>
-          <w:sz w:val="20"/>
-          <w:szCs w:val="20"/>
-        </w:rPr>
-      </w:pPr>
-      <w:r>
-        <w:rPr>
-          <w:rStyle w:val="bodytype"/>
-          <w:rFonts w:ascii="Cambria" w:hAnsi="Cambria" w:cs="Times New Roman"/>
-          <w:color w:val="auto"/>
-          <w:sz w:val="20"/>
-          <w:szCs w:val="20"/>
-        </w:rPr>
-        <w:t>Vector Art</w:t>
-      </w:r>
-    </w:p>
-    <w:p>
-      <w:pPr>
-        <w:ind w:firstLine="144"/>
-        <w:jc w:val="both"/>
-        <w:rPr>
-          <w:rStyle w:val="bodytype"/>
-          <w:rFonts w:ascii="Times" w:hAnsi="Times"/>
-          <w:sz w:val="20"/>
-          <w:szCs w:val="20"/>
-        </w:rPr>
-      </w:pPr>
-      <w:r>
-        <w:rPr>
-          <w:rStyle w:val="bodytype"/>
-          <w:rFonts w:ascii="Times" w:hAnsi="Times"/>
-          <w:sz w:val="20"/>
-          <w:szCs w:val="20"/>
-        </w:rPr>
-        <w:t>I</w:t>
-      </w:r>
-      <w:r>
-        <w:rPr>
-          <w:rStyle w:val="bodytype"/>
-          <w:rFonts w:ascii="Times" w:hAnsi="Times"/>
-          <w:sz w:val="20"/>
-          <w:szCs w:val="20"/>
-        </w:rPr>
-        <w:t xml:space="preserve">n order to preserve the figures’ integrity across multiple </w:t>
-      </w:r>
-      <w:r>
-        <w:rPr>
-          <w:rStyle w:val="bodytype"/>
-          <w:rFonts w:ascii="Times" w:hAnsi="Times"/>
-          <w:sz w:val="20"/>
-          <w:szCs w:val="20"/>
-        </w:rPr>
-        <w:t xml:space="preserve">computer </w:t>
-      </w:r>
-      <w:r>
-        <w:rPr>
-          <w:rStyle w:val="bodytype"/>
-          <w:rFonts w:ascii="Times" w:hAnsi="Times"/>
-          <w:sz w:val="20"/>
-          <w:szCs w:val="20"/>
-        </w:rPr>
-        <w:t>platforms, we accept files in the following formats: .EPS/.PDF/.PS. All fonts must be embedded or text converted to outlines in order to achieve the best-quality results.</w:t>
-      </w:r>
-    </w:p>
-    <w:p>
-      <w:pPr>
-        <w:jc w:val="both"/>
-      </w:pPr>
-    </w:p>
-    <w:p>
-      <w:pPr>
-        <w:pStyle w:val="Heading2"/>
-        <w:jc w:val="both"/>
-        <w:rPr>
-          <w:rStyle w:val="bodytype"/>
-          <w:rFonts w:ascii="Cambria" w:hAnsi="Cambria" w:cs="Times New Roman"/>
-          <w:smallCaps/>
-          <w:color w:val="auto"/>
-          <w:sz w:val="20"/>
-          <w:szCs w:val="20"/>
-        </w:rPr>
-      </w:pPr>
-      <w:r>
-        <w:rPr>
-          <w:rStyle w:val="BodyText2"/>
-          <w:rFonts w:ascii="Cambria" w:hAnsi="Cambria" w:cs="Times New Roman"/>
-          <w:color w:val="auto"/>
-          <w:sz w:val="20"/>
-          <w:szCs w:val="20"/>
-        </w:rPr>
-        <w:t>Color Space</w:t>
-      </w:r>
-    </w:p>
-    <w:p>
-      <w:pPr>
-        <w:ind w:firstLine="144"/>
-        <w:jc w:val="both"/>
-        <w:rPr>
-          <w:rStyle w:val="BodyText2"/>
-          <w:rFonts w:ascii="Times" w:hAnsi="Times"/>
-          <w:sz w:val="20"/>
-          <w:szCs w:val="20"/>
-        </w:rPr>
-      </w:pPr>
-      <w:r>
-        <w:rPr>
-          <w:rStyle w:val="BodyText2"/>
-          <w:rFonts w:ascii="Times" w:hAnsi="Times"/>
-          <w:sz w:val="20"/>
-          <w:szCs w:val="20"/>
-        </w:rPr>
-        <w:t xml:space="preserve">The term </w:t>
-      </w:r>
-      <w:r>
-        <w:rPr>
-          <w:rStyle w:val="BodyText2"/>
-          <w:rFonts w:ascii="Times" w:hAnsi="Times" w:cs="Verdana-Italic"/>
-          <w:iCs/>
-          <w:sz w:val="20"/>
-          <w:szCs w:val="20"/>
-        </w:rPr>
-        <w:t>color space</w:t>
-      </w:r>
-      <w:r>
-        <w:rPr>
-          <w:rStyle w:val="BodyText2"/>
-          <w:rFonts w:ascii="Times" w:hAnsi="Times"/>
-          <w:sz w:val="20"/>
-          <w:szCs w:val="20"/>
-        </w:rPr>
-        <w:t xml:space="preserve"> refers to the entire sum of colors that can be represented within the said medium. For our purposes, the three main co</w:t>
-      </w:r>
-      <w:r>
-        <w:rPr>
-          <w:rStyle w:val="BodyText2"/>
-          <w:rFonts w:ascii="Times" w:hAnsi="Times"/>
-          <w:sz w:val="20"/>
-          <w:szCs w:val="20"/>
-        </w:rPr>
-        <w:t>lor spaces are Grayscale, RGB (red/green/blue) and CMYK (cyan/magenta/yellow/black</w:t>
-      </w:r>
-      <w:r>
-        <w:rPr>
-          <w:rStyle w:val="BodyText2"/>
-          <w:rFonts w:ascii="Times" w:hAnsi="Times"/>
-          <w:sz w:val="20"/>
-          <w:szCs w:val="20"/>
-        </w:rPr>
-        <w:t>). RGB is generally used with on-screen graphics, whereas CMYK is used for printing purposes.</w:t>
-      </w:r>
-    </w:p>
-    <w:p>
-      <w:pPr>
-        <w:ind w:firstLine="144"/>
-        <w:jc w:val="both"/>
-        <w:rPr>
-          <w:rFonts w:ascii="Times" w:hAnsi="Times" w:cs="Verdana"/>
-          <w:color w:val="000000"/>
-        </w:rPr>
-      </w:pPr>
-      <w:r>
-        <w:rPr>
-          <w:rStyle w:val="BodyText2"/>
-          <w:rFonts w:ascii="Times" w:hAnsi="Times"/>
-          <w:sz w:val="20"/>
-          <w:szCs w:val="20"/>
-        </w:rPr>
-        <w:t xml:space="preserve">All color figures should be generated in RGB or CMYK color space. Grayscale images should be submitted in Grayscale color space. Line art may be provided in grayscale OR bitmap colorspace. Note that “bitmap colorspace” and “bitmap file format” are not the same thing. When bitmap color space is selected, </w:t>
-      </w:r>
-      <w:r>
-        <w:rPr>
-          <w:rStyle w:val="BodyText2"/>
-          <w:rFonts w:ascii="Times" w:hAnsi="Times"/>
-          <w:sz w:val="20"/>
-          <w:szCs w:val="20"/>
-        </w:rPr>
-        <w:t>.</w:t>
-      </w:r>
-      <w:r>
-        <w:rPr>
-          <w:rStyle w:val="BodyText2"/>
-          <w:rFonts w:ascii="Times" w:hAnsi="Times"/>
-          <w:sz w:val="20"/>
-          <w:szCs w:val="20"/>
-        </w:rPr>
-        <w:t>TIF/</w:t>
-      </w:r>
-      <w:r>
-        <w:rPr>
-          <w:rStyle w:val="BodyText2"/>
-          <w:rFonts w:ascii="Times" w:hAnsi="Times"/>
-          <w:sz w:val="20"/>
-          <w:szCs w:val="20"/>
-        </w:rPr>
-        <w:t>.</w:t>
-      </w:r>
-      <w:r>
-        <w:rPr>
-          <w:rStyle w:val="BodyText2"/>
-          <w:rFonts w:ascii="Times" w:hAnsi="Times"/>
-          <w:sz w:val="20"/>
-          <w:szCs w:val="20"/>
-        </w:rPr>
-        <w:t>TIFF</w:t>
-      </w:r>
-      <w:r>
-        <w:rPr>
-          <w:rStyle w:val="BodyText2"/>
-          <w:rFonts w:ascii="Times" w:hAnsi="Times"/>
-          <w:sz w:val="20"/>
-          <w:szCs w:val="20"/>
-        </w:rPr>
-        <w:t>/.PNG are</w:t>
-      </w:r>
-      <w:r>
-        <w:rPr>
-          <w:rStyle w:val="BodyText2"/>
-          <w:rFonts w:ascii="Times" w:hAnsi="Times"/>
-          <w:sz w:val="20"/>
-          <w:szCs w:val="20"/>
-        </w:rPr>
-        <w:t xml:space="preserve"> the recommended file format</w:t>
-      </w:r>
-      <w:r>
-        <w:rPr>
-          <w:rStyle w:val="BodyText2"/>
-          <w:rFonts w:ascii="Times" w:hAnsi="Times"/>
-          <w:sz w:val="20"/>
-          <w:szCs w:val="20"/>
-        </w:rPr>
-        <w:t>s</w:t>
-      </w:r>
-      <w:r>
-        <w:rPr>
-          <w:rStyle w:val="BodyText2"/>
-          <w:rFonts w:ascii="Times" w:hAnsi="Times"/>
-          <w:sz w:val="20"/>
-          <w:szCs w:val="20"/>
-        </w:rPr>
-        <w:t>.</w:t>
-      </w:r>
-    </w:p>
-    <w:p/>
-    <w:p>
-      <w:pPr>
-        <w:pStyle w:val="Heading2"/>
-      </w:pPr>
-      <w:r>
-        <w:t>Accepted Fonts Within Figures</w:t>
-      </w:r>
-    </w:p>
-    <w:p>
-      <w:pPr>
-        <w:ind w:firstLine="202"/>
-        <w:rPr>
-          <w:rStyle w:val="BodyText2"/>
-          <w:rFonts w:ascii="Times" w:hAnsi="Times"/>
-          <w:sz w:val="20"/>
-          <w:szCs w:val="20"/>
-        </w:rPr>
-      </w:pPr>
-      <w:r>
-        <w:rPr>
-          <w:rStyle w:val="BodyText2"/>
-          <w:rFonts w:ascii="Times" w:hAnsi="Times"/>
-          <w:sz w:val="20"/>
-          <w:szCs w:val="20"/>
-        </w:rPr>
-        <w:t xml:space="preserve">When preparing your graphics IEEE suggests that you use of one of the following Open Type fonts: Times New Roman, Helvetica, </w:t>
-      </w:r>
-      <w:r>
-        <w:rPr>
-          <w:rStyle w:val="BodyText2"/>
-          <w:rFonts w:ascii="Times" w:hAnsi="Times"/>
-          <w:sz w:val="20"/>
-          <w:szCs w:val="20"/>
-        </w:rPr>
-        <w:t xml:space="preserve">Arial, </w:t>
-      </w:r>
-      <w:r>
-        <w:rPr>
-          <w:rStyle w:val="BodyText2"/>
-          <w:rFonts w:ascii="Times" w:hAnsi="Times"/>
-          <w:sz w:val="20"/>
-          <w:szCs w:val="20"/>
-        </w:rPr>
-        <w:t xml:space="preserve">Cambria, and </w:t>
-      </w:r>
-      <w:r>
-        <w:rPr>
-          <w:rStyle w:val="BodyText2"/>
-          <w:rFonts w:ascii="Times" w:hAnsi="Times"/>
-          <w:sz w:val="20"/>
-          <w:szCs w:val="20"/>
-        </w:rPr>
-        <w:t>Symbol. If you are supplying EPS, PS, or PDF files all fonts must be embedded. Some fonts may only be native to your operating system; without the fonts embedded, parts of the graphic may be distorted or missing.</w:t>
-      </w:r>
-    </w:p>
-    <w:p>
-      <w:pPr>
-        <w:ind w:firstLine="202"/>
-        <w:rPr>
-          <w:rFonts w:ascii="Times" w:hAnsi="Times" w:cs="Verdana"/>
-          <w:color w:val="000000"/>
-          <w:sz w:val="22"/>
-          <w:szCs w:val="22"/>
-        </w:rPr>
-      </w:pPr>
-      <w:r>
-        <w:t>A safe option when finalizing your figures is to strip out the fonts before you save the files, creating “outline” type. This converts fonts to artwork what will appear uniformly on any screen.</w:t>
-      </w:r>
-    </w:p>
-    <w:p/>
-    <w:p>
-      <w:pPr>
-        <w:pStyle w:val="Heading2"/>
-      </w:pPr>
-      <w:r>
-        <w:t>Using Labels Within Figures</w:t>
-      </w:r>
-    </w:p>
-    <w:p>
-      <w:pPr>
-        <w:pStyle w:val="Heading3"/>
-      </w:pPr>
-      <w:r>
-        <w:t>Figure A</w:t>
-      </w:r>
-      <w:r>
-        <w:t xml:space="preserve">xis labels </w:t>
-      </w:r>
-    </w:p>
-    <w:p>
-      <w:pPr>
-        <w:pStyle w:val="Text"/>
-        <w:ind w:firstLine="144"/>
-        <w:rPr>
-          <w:b/>
-        </w:rPr>
-      </w:pPr>
-      <w:r>
-        <w:t xml:space="preserve">Figure axis labels are often a source of confusion. Use words rather than symbols. As an example, write the quantity </w:t>
-      </w:r>
-      <w:r>
-        <w:lastRenderedPageBreak/>
-        <w:t xml:space="preserve">“Magnetization,” or “Magnetization </w:t>
-      </w:r>
-      <w:r>
-        <w:rPr>
-          <w:i/>
-          <w:iCs/>
-        </w:rPr>
-        <w:t>M</w:t>
-      </w:r>
-      <w:r>
-        <w:t>,” not just “</w:t>
-      </w:r>
-      <w:r>
-        <w:rPr>
-          <w:i/>
-          <w:iCs/>
-        </w:rPr>
-        <w:t>M</w:t>
-      </w:r>
-      <w:r>
-        <w:t>.” Put units in parentheses. Do not label axes only with units. As in Fig. 1, for example, write “Magnetization (A/m)” or “Magnetization (A</w:t>
-      </w:r>
-      <w:r>
-        <w:rPr>
-          <w:position w:val="-2"/>
-        </w:rPr>
-        <w:object w:dxaOrig="100" w:dyaOrig="120" w14:anchorId="13B76468">
-          <v:shapetype id="_x0000_t75" coordsize="21600,21600" o:spt="75" o:preferrelative="t" path="m@4@5l@4@11@9@11@9@5xe" filled="f" stroked="f">
-            <v:stroke joinstyle="miter"/>
-            <v:formulas>
-              <v:f eqn="if lineDrawn pixelLineWidth 0"/>
-              <v:f eqn="sum @0 1 0"/>
-              <v:f eqn="sum 0 0 @1"/>
-              <v:f eqn="prod @2 1 2"/>
-              <v:f eqn="prod @3 21600 pixelWidth"/>
-              <v:f eqn="prod @3 21600 pixelHeight"/>
-              <v:f eqn="sum @0 0 1"/>
-              <v:f eqn="prod @6 1 2"/>
-              <v:f eqn="prod @7 21600 pixelWidth"/>
-              <v:f eqn="sum @8 21600 0"/>
-              <v:f eqn="prod @7 21600 pixelHeight"/>
-              <v:f eqn="sum @10 21600 0"/>
-            </v:formulas>
-            <v:path o:extrusionok="f" gradientshapeok="t" o:connecttype="rect"/>
-            <o:lock v:ext="edit" aspectratio="t"/>
-          </v:shapetype>
-          <v:shape id="_x0000_i1026" type="#_x0000_t75" style="width:5.25pt;height:6pt" o:ole="" fillcolor="window">
-            <v:imagedata r:id="rId10" o:title=""/>
-          </v:shape>
-          <o:OLEObject Type="Embed" ProgID="Equation.3" ShapeID="_x0000_i1026" DrawAspect="Content" ObjectID="_1839228515" r:id="rId11"/>
-        </w:object>
-      </w:r>
-      <w:r>
-        <w:t>m</w:t>
-      </w:r>
-      <w:r>
-        <w:rPr>
-          <w:vertAlign w:val="superscript"/>
-        </w:rPr>
-        <w:sym w:font="Symbol" w:char="F02D"/>
-      </w:r>
-      <w:r>
-        <w:rPr>
-          <w:vertAlign w:val="superscript"/>
-        </w:rPr>
-        <w:t>1</w:t>
-      </w:r>
-      <w:r>
-        <w:t xml:space="preserve">),” not just “A/m.” Do not label axes with a ratio of quantities and units. For example, write “Temperature (K),” not “Temperature/K.” </w:t>
-      </w:r>
-    </w:p>
-    <w:p>
-      <w:pPr>
-        <w:ind w:firstLine="144"/>
-        <w:jc w:val="both"/>
-      </w:pPr>
-      <w:r>
-        <w:t>Multipliers can be especially confusing. Write “Magnetization (kA/m)” or “Magnetization (10</w:t>
-      </w:r>
-      <w:r>
-        <w:rPr>
-          <w:vertAlign w:val="superscript"/>
-        </w:rPr>
-        <w:t>3</w:t>
-      </w:r>
-      <w:r>
-        <w:t xml:space="preserve"> A/m).” Do not write “Magnetization (A/m) </w:t>
-      </w:r>
-      <w:r>
-        <w:sym w:font="Symbol" w:char="F0B4"/>
-      </w:r>
-      <w:r>
-        <w:t xml:space="preserve"> 1000” because the reader would not know whether the top axis label in Fig. 1 meant 16000 A/m or 0.016 A/m. Figure labels should be legible, approximately 8 to 10 point type.</w:t>
-      </w:r>
-    </w:p>
-    <w:p>
-      <w:pPr>
-        <w:jc w:val="both"/>
-        <w:rPr>
-          <w:rFonts w:ascii="Times" w:hAnsi="Times" w:cs="Verdana"/>
-          <w:color w:val="000000"/>
-        </w:rPr>
-      </w:pPr>
-    </w:p>
-    <w:p>
-      <w:pPr>
-        <w:pStyle w:val="Heading3"/>
-        <w:jc w:val="both"/>
-      </w:pPr>
-      <w:r>
-        <w:t>Subfigure Labels in Multipart Figures and Tables</w:t>
-      </w:r>
-    </w:p>
-    <w:p>
-      <w:pPr>
-        <w:ind w:firstLine="144"/>
-        <w:jc w:val="both"/>
-      </w:pPr>
-      <w:r>
-        <w:rPr>
-          <w:rFonts w:ascii="Times" w:hAnsi="Times" w:cs="Verdana"/>
-          <w:color w:val="000000"/>
-        </w:rPr>
-        <w:t xml:space="preserve">Multipart figures should be combined and labeled before final submission. Labels should appear centered below each subfigure in 8 point Times New Roman font in the format of (a) (b) (c). </w:t>
-      </w:r>
-    </w:p>
-    <w:p>
-      <w:pPr>
-        <w:pStyle w:val="Heading2"/>
-        <w:jc w:val="both"/>
-      </w:pPr>
-      <w:r>
-        <w:t>File Naming</w:t>
-      </w:r>
-    </w:p>
-    <w:p>
-      <w:pPr>
-        <w:jc w:val="both"/>
-        <w:rPr>
-          <w:rStyle w:val="BodyText2"/>
-          <w:rFonts w:ascii="Times" w:hAnsi="Times"/>
-          <w:smallCaps/>
-          <w:kern w:val="28"/>
-          <w:sz w:val="20"/>
-          <w:szCs w:val="20"/>
-        </w:rPr>
-      </w:pPr>
-      <w:r>
-        <w:rPr>
-          <w:rStyle w:val="BodyText2"/>
-          <w:rFonts w:ascii="Times" w:hAnsi="Times"/>
-          <w:sz w:val="20"/>
-          <w:szCs w:val="20"/>
-        </w:rPr>
-        <w:tab/>
-        <w:t>Figures (line artwork or photographs) should be named starting with the first 5 letters of the author’s last name. The next characters in the filename should be the number that represents the sequential location of this image in your article. For example, in author “Anderson’s” paper, the first three figures would be named ander1.tif, ander2.tif, and ander3.ps.</w:t>
-      </w:r>
-    </w:p>
-    <w:p>
-      <w:pPr>
-        <w:jc w:val="both"/>
-        <w:rPr>
-          <w:rStyle w:val="BodyText2"/>
-          <w:rFonts w:ascii="Times" w:hAnsi="Times"/>
-          <w:sz w:val="20"/>
-          <w:szCs w:val="20"/>
-        </w:rPr>
-      </w:pPr>
-      <w:r>
-        <w:rPr>
-          <w:rStyle w:val="BodyText2"/>
-          <w:rFonts w:ascii="Times" w:hAnsi="Times"/>
-          <w:sz w:val="20"/>
-          <w:szCs w:val="20"/>
-        </w:rPr>
-        <w:tab/>
-        <w:t>Tables should contain only the body of the table (not the caption) and should be named similarly to figures, except that ‘.t’ is inserted in-between the author’s name and the table number. For example, author Anderson’s first three tables would be named ander.t1.tif, ander.t2.ps, ander.t3.eps.</w:t>
-      </w:r>
-    </w:p>
-    <w:p>
-      <w:pPr>
-        <w:jc w:val="both"/>
-        <w:rPr>
-          <w:rStyle w:val="BodyText2"/>
-          <w:rFonts w:ascii="Times" w:hAnsi="Times"/>
-          <w:sz w:val="20"/>
-          <w:szCs w:val="20"/>
-        </w:rPr>
-      </w:pPr>
-      <w:r>
-        <w:rPr>
-          <w:rStyle w:val="BodyText2"/>
-          <w:rFonts w:ascii="Times" w:hAnsi="Times"/>
-          <w:sz w:val="20"/>
-          <w:szCs w:val="20"/>
-        </w:rPr>
-        <w:tab/>
-        <w:t>Author photographs should be named using the first five characters of the pictured author’s last name</w:t>
-      </w:r>
-      <w:r>
-        <w:rPr>
-          <w:rStyle w:val="BodyText2"/>
-          <w:rFonts w:ascii="Times" w:hAnsi="Times"/>
-          <w:sz w:val="20"/>
-          <w:szCs w:val="20"/>
-        </w:rPr>
-        <w:t xml:space="preserve">. </w:t>
-      </w:r>
-      <w:r>
-        <w:rPr>
-          <w:rStyle w:val="BodyText2"/>
-          <w:rFonts w:ascii="Times" w:hAnsi="Times"/>
-          <w:sz w:val="20"/>
-          <w:szCs w:val="20"/>
-        </w:rPr>
-        <w:t xml:space="preserve">For example, four author photographs for a paper may be named: oppen.ps, moshc.tif, chen.eps, and duran.pdf.  </w:t>
-      </w:r>
-    </w:p>
-    <w:p>
-      <w:pPr>
-        <w:jc w:val="both"/>
-        <w:rPr>
-          <w:rStyle w:val="BodyText2"/>
-          <w:rFonts w:ascii="Times" w:hAnsi="Times"/>
-          <w:sz w:val="20"/>
-          <w:szCs w:val="20"/>
-        </w:rPr>
-      </w:pPr>
-      <w:r>
-        <w:rPr>
-          <w:rStyle w:val="BodyText2"/>
-          <w:rFonts w:ascii="Times" w:hAnsi="Times"/>
-          <w:sz w:val="20"/>
-          <w:szCs w:val="20"/>
-        </w:rPr>
-        <w:tab/>
-        <w:t xml:space="preserve">If two authors or more have the same last name, their first initial(s) can be substituted for the fifth, fourth, third... letters of their surname until the degree where there is differentiation. For </w:t>
-      </w:r>
-      <w:r>
-        <w:rPr>
-          <w:rStyle w:val="BodyText2"/>
-          <w:rFonts w:ascii="Times" w:hAnsi="Times"/>
-          <w:sz w:val="20"/>
-          <w:szCs w:val="20"/>
-        </w:rPr>
-        <w:t>e</w:t>
-      </w:r>
-      <w:r>
-        <w:rPr>
-          <w:rStyle w:val="BodyText2"/>
-          <w:rFonts w:ascii="Times" w:hAnsi="Times"/>
-          <w:sz w:val="20"/>
-          <w:szCs w:val="20"/>
-        </w:rPr>
-        <w:t>xample, two authors Michael and Monica Opp</w:t>
-      </w:r>
-      <w:r>
-        <w:rPr>
-          <w:rStyle w:val="BodyText2"/>
-          <w:rFonts w:ascii="Times" w:hAnsi="Times"/>
-          <w:sz w:val="20"/>
-          <w:szCs w:val="20"/>
-        </w:rPr>
-        <w:t>enheimer’s photos would be named</w:t>
-      </w:r>
-      <w:r>
-        <w:rPr>
-          <w:rStyle w:val="BodyText2"/>
-          <w:rFonts w:ascii="Times" w:hAnsi="Times"/>
-          <w:sz w:val="20"/>
-          <w:szCs w:val="20"/>
-        </w:rPr>
-        <w:t xml:space="preserve"> oppmi.tif, and oppmo.eps.</w:t>
-      </w:r>
-    </w:p>
-    <w:p>
-      <w:pPr>
-        <w:jc w:val="both"/>
-        <w:rPr>
-          <w:rStyle w:val="BodyText2"/>
-          <w:rFonts w:ascii="Times" w:hAnsi="Times"/>
-          <w:sz w:val="20"/>
-          <w:szCs w:val="20"/>
-        </w:rPr>
-      </w:pPr>
-    </w:p>
-    <w:p>
-      <w:pPr>
-        <w:pStyle w:val="Heading2"/>
-        <w:jc w:val="both"/>
-        <w:rPr>
-          <w:rStyle w:val="BodyText2"/>
-          <w:rFonts w:ascii="Cambria" w:hAnsi="Cambria" w:cs="Times New Roman"/>
-          <w:color w:val="auto"/>
-          <w:sz w:val="20"/>
-          <w:szCs w:val="20"/>
-        </w:rPr>
-      </w:pPr>
-      <w:r>
-        <w:rPr>
-          <w:rStyle w:val="BodyText2"/>
-          <w:rFonts w:ascii="Cambria" w:hAnsi="Cambria" w:cs="Times New Roman"/>
-          <w:color w:val="auto"/>
-          <w:sz w:val="20"/>
-          <w:szCs w:val="20"/>
-        </w:rPr>
-        <w:t>Referencing a Figure or Table Within Your Paper</w:t>
-      </w:r>
-    </w:p>
-    <w:p>
-      <w:pPr>
-        <w:ind w:firstLine="144"/>
-        <w:jc w:val="both"/>
-        <w:rPr>
-          <w:rStyle w:val="BodyText2"/>
-          <w:rFonts w:ascii="Times" w:hAnsi="Times"/>
-          <w:sz w:val="20"/>
-          <w:szCs w:val="20"/>
-        </w:rPr>
-      </w:pPr>
-      <w:r>
-        <w:rPr>
-          <w:rStyle w:val="BodyText2"/>
-          <w:rFonts w:ascii="Times" w:hAnsi="Times"/>
-          <w:sz w:val="20"/>
-          <w:szCs w:val="20"/>
-        </w:rPr>
-        <w:t>When referencing your figures and tables within your paper, use the abbreviation “F</w:t>
-      </w:r>
-      <w:r>
-        <w:rPr>
-          <w:rStyle w:val="BodyText2"/>
-          <w:rFonts w:ascii="Times" w:hAnsi="Times"/>
-          <w:sz w:val="20"/>
-          <w:szCs w:val="20"/>
-        </w:rPr>
-        <w:t xml:space="preserve">ig.” even at the beginning of a </w:t>
-      </w:r>
-      <w:r>
-        <w:rPr>
-          <w:rStyle w:val="BodyText2"/>
-          <w:rFonts w:ascii="Times" w:hAnsi="Times"/>
-          <w:sz w:val="20"/>
-          <w:szCs w:val="20"/>
-        </w:rPr>
-        <w:t>sentence. Do not abbreviate “Table.” Tables should be numbered with Roman Numerals.</w:t>
-      </w:r>
-    </w:p>
-    <w:p>
-      <w:pPr>
-        <w:pStyle w:val="Heading2"/>
-        <w:jc w:val="both"/>
-      </w:pPr>
-      <w:r>
-        <w:t xml:space="preserve">Checking Your Figures: The IEEE </w:t>
-      </w:r>
-      <w:r>
-        <w:t>Graphics Analyzer</w:t>
-      </w:r>
-    </w:p>
-    <w:p>
-      <w:pPr>
-        <w:ind w:firstLine="144"/>
-        <w:jc w:val="both"/>
-      </w:pPr>
-      <w:r>
-        <w:t xml:space="preserve">The IEEE </w:t>
-      </w:r>
-      <w:r>
-        <w:t xml:space="preserve">Graphics Analyzer </w:t>
-      </w:r>
-      <w:r>
-        <w:t xml:space="preserve">enables authors to pre-screen their graphics for compliance with IEEE Transactions and Journals standards before submission. The online tool, located at </w:t>
-      </w:r>
-      <w:hyperlink r:id="rId12" w:history="1">
-        <w:r>
-          <w:rPr>
-            <w:rStyle w:val="Hyperlink"/>
-            <w:rFonts w:ascii="Times" w:hAnsi="Times"/>
-            <w:color w:val="000000"/>
-          </w:rPr>
-          <w:t>http://graphicsqc.ieee.org/</w:t>
-        </w:r>
-      </w:hyperlink>
-      <w:r>
-        <w:t xml:space="preserve">, allows authors to upload their graphics in order to check that each file is the correct file format, resolution, size and colorspace; that no fonts are missing or corrupt; that figures are not compiled in layers or have transparency, and that they are named according to the IEEE Transactions and Journals naming convention. At the end of this automated process, authors are provided with a detailed </w:t>
-      </w:r>
-      <w:r>
-        <w:t>report on each graphic within the web applet, as well as by email.</w:t>
-      </w:r>
-    </w:p>
-    <w:p>
-      <w:pPr>
-        <w:ind w:firstLine="144"/>
-        <w:jc w:val="both"/>
-      </w:pPr>
-      <w:r>
-        <w:t xml:space="preserve">For more information on using the </w:t>
-      </w:r>
-      <w:r>
-        <w:t>Graphics Analyzer</w:t>
-      </w:r>
-      <w:r>
-        <w:t xml:space="preserve"> </w:t>
-      </w:r>
-      <w:r>
-        <w:br/>
-      </w:r>
-      <w:r>
-        <w:t>or any other graphics related topic, c</w:t>
-      </w:r>
-      <w:r>
-        <w:t>ontact the IEEE Graphics Help</w:t>
-      </w:r>
-      <w:r>
-        <w:t xml:space="preserve"> Desk by e-mail at </w:t>
-      </w:r>
-      <w:hyperlink r:id="rId13" w:history="1">
-        <w:r>
-          <w:rPr>
-            <w:rStyle w:val="Hyperlink"/>
-            <w:rFonts w:ascii="Times" w:hAnsi="Times"/>
-            <w:color w:val="000000"/>
-          </w:rPr>
-          <w:t>graphics@ieee.org</w:t>
-        </w:r>
-      </w:hyperlink>
-      <w:r>
-        <w:t>.</w:t>
-      </w:r>
-    </w:p>
-    <w:p>
-      <w:pPr>
-        <w:jc w:val="both"/>
-      </w:pPr>
-    </w:p>
-    <w:p>
-      <w:pPr>
-        <w:pStyle w:val="Heading2"/>
-        <w:jc w:val="both"/>
-      </w:pPr>
-      <w:r>
-        <w:t>Submitting Your Graphics</w:t>
-      </w:r>
-    </w:p>
-    <w:p>
-      <w:pPr>
-        <w:ind w:firstLine="144"/>
-        <w:jc w:val="both"/>
-      </w:pPr>
-      <w:r>
-        <w:t xml:space="preserve">Because IEEE will do the final formatting of your paper, </w:t>
-      </w:r>
-      <w:r>
-        <w:br/>
-      </w:r>
-      <w:r>
-        <w:t xml:space="preserve">you do not need to position figures and tables at the top and bottom of each column. In fact, all figures, figure captions, and tables can be placed at the end of your paper. In addition to, or even in lieu of submitting figures within your final manuscript, figures should be submitted individually, separate from the manuscript in one of the file formats listed above in </w:t>
-      </w:r>
-      <w:r>
-        <w:t>section VI-J</w:t>
-      </w:r>
-      <w:r>
-        <w:t>. Place figure captions below the figures; place table titles above the tables. Please do not include ca</w:t>
-      </w:r>
-      <w:r>
-        <w:t xml:space="preserve">ptions as part of the figures, </w:t>
-      </w:r>
-      <w:r>
-        <w:t>or put them in “text boxes” linked to the figures. Also, do not place borders around the outside of your figures.</w:t>
-      </w:r>
-    </w:p>
-    <w:p>
-      <w:pPr>
-        <w:jc w:val="both"/>
-      </w:pPr>
-    </w:p>
-    <w:p>
-      <w:pPr>
-        <w:pStyle w:val="Heading2"/>
-        <w:jc w:val="both"/>
-        <w:rPr>
-          <w:rStyle w:val="BodyText2"/>
-          <w:rFonts w:ascii="Cambria" w:hAnsi="Cambria" w:cs="Times New Roman"/>
-          <w:i w:val="0"/>
-          <w:iCs w:val="0"/>
-          <w:color w:val="auto"/>
-          <w:sz w:val="20"/>
-          <w:szCs w:val="20"/>
-        </w:rPr>
-      </w:pPr>
-      <w:r>
-        <w:rPr>
-          <w:rStyle w:val="BodyText2"/>
-          <w:rFonts w:ascii="Cambria" w:hAnsi="Cambria" w:cs="Times New Roman"/>
-          <w:color w:val="auto"/>
-          <w:sz w:val="20"/>
-          <w:szCs w:val="20"/>
-        </w:rPr>
-        <w:t>Color Processing / Printing in IEEE Journals</w:t>
-      </w:r>
-    </w:p>
-    <w:p>
-      <w:pPr>
-        <w:ind w:firstLine="144"/>
-        <w:jc w:val="both"/>
-      </w:pPr>
-      <w:r>
-        <w:t xml:space="preserve">All IEEE </w:t>
-      </w:r>
-      <w:r>
-        <w:t>Transactions</w:t>
-      </w:r>
-      <w:r>
-        <w:t xml:space="preserve">, </w:t>
-      </w:r>
-      <w:r>
-        <w:t>Journals</w:t>
-      </w:r>
-      <w:r>
-        <w:t xml:space="preserve">, and </w:t>
-      </w:r>
-      <w:r>
-        <w:t>Letters</w:t>
-      </w:r>
-      <w:r>
-        <w:t xml:space="preserve"> allow an author to publish color figures on </w:t>
-      </w:r>
-      <w:r>
-        <w:t>IEEE</w:t>
-      </w:r>
-      <w:r>
-        <w:t xml:space="preserve"> </w:t>
-      </w:r>
-      <w:r>
-        <w:rPr>
-          <w:i/>
-        </w:rPr>
-        <w:t>Xplore</w:t>
-      </w:r>
-      <w:r>
-        <w:rPr>
-          <w:vertAlign w:val="superscript"/>
-        </w:rPr>
-        <w:t>®</w:t>
-      </w:r>
-      <w:r>
-        <w:t xml:space="preserve"> at no charge, and automatically convert them to grayscale for print versions. </w:t>
-      </w:r>
-      <w:r>
-        <w:rPr>
-          <w:rStyle w:val="BodyText2"/>
-          <w:rFonts w:ascii="Times" w:hAnsi="Times"/>
-          <w:sz w:val="20"/>
-          <w:szCs w:val="20"/>
-        </w:rPr>
-        <w:t xml:space="preserve">In most journals, figures and tables may alternatively be printed in color if an author chooses to do so. Please </w:t>
-      </w:r>
-      <w:r>
-        <w:rPr>
-          <w:rStyle w:val="BodyText2"/>
-          <w:rFonts w:ascii="Times" w:hAnsi="Times"/>
-          <w:sz w:val="20"/>
-          <w:szCs w:val="20"/>
-        </w:rPr>
-        <w:t>note that</w:t>
-      </w:r>
-      <w:r>
-        <w:rPr>
-          <w:rStyle w:val="BodyText2"/>
-          <w:rFonts w:ascii="Times" w:hAnsi="Times"/>
-          <w:sz w:val="20"/>
-          <w:szCs w:val="20"/>
-        </w:rPr>
-        <w:t xml:space="preserve"> this service comes at an extra expense to the author. If you intend to have print color graphics, include a note with your final paper indicating which figures or tables you would like to be handled that way, and stating that you are willing to pay the additional fee.</w:t>
-      </w:r>
-    </w:p>
-    <w:p>
-      <w:pPr>
-        <w:pStyle w:val="Text"/>
-      </w:pPr>
+        </w:rPr>
+        <w:t>Another promising direction is exploring scalability through CUDA streams. CUDA streams could allow overlapping data transfers with kernel execution, or running independent portions of the search concurrently when enough GPU resources are available. For larger TSPLIB instances or batches of candidate tours, a streaming approach could divide the workload into smaller asynchronous tasks, improving throughput and reducing idle time on the GPU. This would provide a path toward scaling the solver to larger problem sizes and more complex hybrid search strategies.</w:t>
+      </w:r>
     </w:p>
     <w:p>
       <w:pPr>
@@ -3031,802 +1249,6 @@
     </w:p>
     <w:p>
       <w:pPr>
-        <w:pStyle w:val="ReferenceHead"/>
-        <w:jc w:val="both"/>
-      </w:pPr>
-      <w:r>
-        <w:t>Appendix</w:t>
-      </w:r>
-    </w:p>
-    <w:p>
-      <w:pPr>
-        <w:pStyle w:val="Text"/>
-      </w:pPr>
-      <w:r>
-        <w:t>Appendixes</w:t>
-      </w:r>
-      <w:r>
-        <w:t>, if needed, appear before the ac</w:t>
-      </w:r>
-      <w:r>
-        <w:t>knowledgment.</w:t>
-      </w:r>
-    </w:p>
-    <w:p>
-      <w:pPr>
-        <w:pStyle w:val="Style1"/>
-        <w:jc w:val="both"/>
-      </w:pPr>
-      <w:r>
-        <w:t>Acknowledgment</w:t>
-      </w:r>
-    </w:p>
-    <w:p>
-      <w:pPr>
-        <w:pStyle w:val="Text"/>
-        <w:rPr>
-          <w:bCs/>
-        </w:rPr>
-      </w:pPr>
-      <w:r>
-        <w:t xml:space="preserve">The preferred spelling of the word “acknowledgment” in American English is without an “e” after the “g.” Use the singular heading even if you have many acknowledgments. Avoid expressions such as “One of us (S.B.A.) would like to thank ... .” Instead, write “F. A. Author thanks ... .” </w:t>
-      </w:r>
-      <w:r>
-        <w:rPr>
-          <w:bCs/>
-        </w:rPr>
-        <w:t xml:space="preserve">In most cases, </w:t>
-      </w:r>
-      <w:r>
-        <w:rPr>
-          <w:bCs/>
-        </w:rPr>
-        <w:t>s</w:t>
-      </w:r>
-      <w:r>
-        <w:rPr>
-          <w:bCs/>
-        </w:rPr>
-        <w:t>ponsor and financial support acknowledgments are placed in the unnumbered footnote on the first page, not here.</w:t>
-      </w:r>
-    </w:p>
-    <w:p>
-      <w:pPr>
-        <w:pStyle w:val="Style1"/>
-        <w:jc w:val="both"/>
-      </w:pPr>
-      <w:r>
-        <w:t>References</w:t>
-      </w:r>
-      <w:r>
-        <w:t xml:space="preserve"> and Footnotes</w:t>
-      </w:r>
-    </w:p>
-    <w:p>
-      <w:pPr>
-        <w:pStyle w:val="Heading2"/>
-        <w:numPr>
-          <w:ilvl w:val="0"/>
-          <w:numId w:val="29"/>
-        </w:numPr>
-        <w:tabs>
-          <w:tab w:val="left" w:pos="180"/>
-        </w:tabs>
-        <w:ind w:left="90" w:firstLine="0"/>
-      </w:pPr>
-      <w:r>
-        <w:t>References</w:t>
-      </w:r>
-    </w:p>
-    <w:p>
-      <w:pPr>
-        <w:pStyle w:val="Text"/>
-      </w:pPr>
-      <w:r>
-        <w:t>References need not</w:t>
-      </w:r>
-      <w:r>
-        <w:t xml:space="preserve"> be cited in</w:t>
-      </w:r>
-      <w:r>
-        <w:t xml:space="preserve"> text. </w:t>
-      </w:r>
-      <w:r>
-        <w:t>When they are, they appear on the line,</w:t>
-      </w:r>
-      <w:r>
-        <w:t xml:space="preserve"> in square </w:t>
-      </w:r>
-      <w:r>
-        <w:t>brackets</w:t>
-      </w:r>
-      <w:r>
-        <w:t>,</w:t>
-      </w:r>
-      <w:r>
-        <w:t xml:space="preserve"> inside</w:t>
-      </w:r>
-      <w:r>
-        <w:t xml:space="preserve"> the punctuation.  </w:t>
-      </w:r>
-      <w:r>
-        <w:lastRenderedPageBreak/>
-        <w:t xml:space="preserve">Multiple references </w:t>
-      </w:r>
-      <w:r>
-        <w:t>are each numbere</w:t>
-      </w:r>
-      <w:r>
-        <w:t>d with separate brackets</w:t>
-      </w:r>
-      <w:r>
-        <w:t xml:space="preserve">. When citing a section in a book, please give the relevant page numbers. In </w:t>
-      </w:r>
-      <w:r>
-        <w:t>text</w:t>
-      </w:r>
-      <w:r>
-        <w:t>, refer simply to</w:t>
-      </w:r>
-      <w:r>
-        <w:t xml:space="preserve"> the reference number. Do not use “Ref.” or “reference</w:t>
-      </w:r>
-      <w:r>
-        <w:t xml:space="preserve">” except at the beginning of a sentence: “Reference [3] shows ... .” Please do not use automatic endnotes in </w:t>
-      </w:r>
-      <w:r>
-        <w:rPr>
-          <w:i/>
-          <w:iCs/>
-        </w:rPr>
-        <w:t>Word</w:t>
-      </w:r>
-      <w:r>
-        <w:t>, rather, type the reference list at the end of the paper using the “References” style.</w:t>
-      </w:r>
-    </w:p>
-    <w:p>
-      <w:pPr>
-        <w:pStyle w:val="Text"/>
-        <w:ind w:firstLine="144"/>
-        <w:rPr>
-          <w:bCs/>
-          <w:iCs/>
-        </w:rPr>
-      </w:pPr>
-      <w:r>
-        <w:rPr>
-          <w:bCs/>
-          <w:iCs/>
-        </w:rPr>
-        <w:t xml:space="preserve">Reference numbers are set flush left and form a column of their own, hanging out beyond the body of the reference. The reference numbers are on the line, enclosed in square brackets. In all references, the given name of the author or editor is abbreviated to the initial only and precedes the last name. </w:t>
-      </w:r>
-      <w:r>
-        <w:rPr>
-          <w:bCs/>
-          <w:iCs/>
-        </w:rPr>
-        <w:t>U</w:t>
-      </w:r>
-      <w:r>
-        <w:rPr>
-          <w:bCs/>
-          <w:iCs/>
-        </w:rPr>
-        <w:t xml:space="preserve">se them all; use </w:t>
-      </w:r>
-      <w:r>
-        <w:rPr>
-          <w:bCs/>
-          <w:i/>
-          <w:iCs/>
-        </w:rPr>
-        <w:t>et al</w:t>
-      </w:r>
-      <w:r>
-        <w:rPr>
-          <w:bCs/>
-          <w:iCs/>
-        </w:rPr>
-        <w:t>. only if n</w:t>
-      </w:r>
-      <w:r>
-        <w:rPr>
-          <w:bCs/>
-          <w:iCs/>
-        </w:rPr>
-        <w:t xml:space="preserve">ames are not given. </w:t>
-      </w:r>
-      <w:r>
-        <w:rPr>
-          <w:bCs/>
-          <w:iCs/>
-        </w:rPr>
-        <w:t xml:space="preserve">Use commas around Jr., Sr., and III in names. </w:t>
-      </w:r>
-      <w:r>
-        <w:rPr>
-          <w:bCs/>
-          <w:iCs/>
-        </w:rPr>
-        <w:t>Abbreviate c</w:t>
-      </w:r>
-      <w:r>
-        <w:rPr>
-          <w:bCs/>
-          <w:iCs/>
-        </w:rPr>
-        <w:t xml:space="preserve">onference titles.  When citing IEEE </w:t>
-      </w:r>
-      <w:r>
-        <w:rPr>
-          <w:bCs/>
-          <w:iCs/>
-        </w:rPr>
-        <w:t>t</w:t>
-      </w:r>
-      <w:r>
-        <w:rPr>
-          <w:bCs/>
-          <w:iCs/>
-        </w:rPr>
-        <w:t>ransactions, provide the issue number</w:t>
-      </w:r>
-      <w:r>
-        <w:rPr>
-          <w:bCs/>
-          <w:iCs/>
-        </w:rPr>
-        <w:t>, page range, volume number, year,</w:t>
-      </w:r>
-      <w:r>
-        <w:rPr>
-          <w:bCs/>
-          <w:iCs/>
-        </w:rPr>
-        <w:t xml:space="preserve"> </w:t>
-      </w:r>
-      <w:r>
-        <w:rPr>
-          <w:bCs/>
-          <w:iCs/>
-        </w:rPr>
-        <w:t>and/</w:t>
-      </w:r>
-      <w:r>
-        <w:rPr>
-          <w:bCs/>
-          <w:iCs/>
-        </w:rPr>
-        <w:t>or month if available. When referencing a patent, provide the day and the month of issue, or application. References may not include all information; please obtain an</w:t>
-      </w:r>
-      <w:r>
-        <w:rPr>
-          <w:bCs/>
-          <w:iCs/>
-        </w:rPr>
-        <w:t xml:space="preserve">d include relevant information. </w:t>
-      </w:r>
-      <w:r>
-        <w:rPr>
-          <w:bCs/>
-          <w:iCs/>
-        </w:rPr>
-        <w:t>Do not combine references. There must be only one reference with each number. If there is a URL included with the print reference, it can be included at the end of the</w:t>
-      </w:r>
-      <w:r>
-        <w:rPr>
-          <w:bCs/>
-          <w:iCs/>
-        </w:rPr>
-        <w:t xml:space="preserve"> reference.</w:t>
-      </w:r>
-      <w:r>
-        <w:rPr>
-          <w:bCs/>
-          <w:iCs/>
-        </w:rPr>
-        <w:t xml:space="preserve"> </w:t>
-      </w:r>
-    </w:p>
-    <w:p>
-      <w:pPr>
-        <w:pStyle w:val="Text"/>
-        <w:ind w:firstLine="144"/>
-      </w:pPr>
-      <w:r>
-        <w:t>Other than books, c</w:t>
-      </w:r>
-      <w:r>
-        <w:t>apitalize only the first word in a paper title, except for proper nouns and element symbols. For papers published in translation journals, please give the English citation first, followed by the origin</w:t>
-      </w:r>
-      <w:r>
-        <w:t xml:space="preserve">al foreign-language citation See the end of this document for </w:t>
-      </w:r>
-      <w:r>
-        <w:t xml:space="preserve">formats and </w:t>
-      </w:r>
-      <w:r>
-        <w:t>example</w:t>
-      </w:r>
-      <w:r>
-        <w:t>s of common references</w:t>
-      </w:r>
-      <w:r>
-        <w:t>.</w:t>
-      </w:r>
-      <w:r>
-        <w:t xml:space="preserve"> For a complete discussion of ref</w:t>
-      </w:r>
-      <w:r>
-        <w:t>erences and their formats, see t</w:t>
-      </w:r>
-      <w:r>
-        <w:t xml:space="preserve">he IEEE </w:t>
-      </w:r>
-      <w:r>
-        <w:t>style manual</w:t>
-      </w:r>
-      <w:r>
-        <w:t xml:space="preserve"> </w:t>
-      </w:r>
-      <w:r>
-        <w:t xml:space="preserve">at </w:t>
-      </w:r>
-      <w:hyperlink r:id="rId14" w:tgtFrame="_blank" w:history="1">
-        <w:r>
-          <w:rPr>
-            <w:rStyle w:val="Hyperlink"/>
-            <w:color w:val="1155CC"/>
-            <w:sz w:val="19"/>
-            <w:szCs w:val="19"/>
-            <w:shd w:val="clear" w:color="auto" w:fill="FFFFFF"/>
-          </w:rPr>
-          <w:t>www.ieee.org/authortools</w:t>
-        </w:r>
-      </w:hyperlink>
-      <w:r>
-        <w:t>.</w:t>
-      </w:r>
-    </w:p>
-    <w:p>
-      <w:pPr>
-        <w:pStyle w:val="Heading2"/>
-      </w:pPr>
-      <w:r>
-        <w:t>Footnotes</w:t>
-      </w:r>
-    </w:p>
-    <w:p>
-      <w:pPr>
-        <w:pStyle w:val="Text"/>
-      </w:pPr>
-      <w:r>
-        <w:t>Number footnotes separately in superscripts (Insert | Footnote).</w:t>
-      </w:r>
-      <w:r>
-        <w:rPr>
-          <w:rStyle w:val="FootnoteReference"/>
-        </w:rPr>
-        <w:footnoteReference w:id="2"/>
-      </w:r>
-      <w:r>
-        <w:t xml:space="preserve"> Place the actual footnote at the bottom of the column in which it is cited; do not put footnotes in the reference list (endnotes). Use letters for table footnotes (see Table I). </w:t>
-      </w:r>
-    </w:p>
-    <w:p>
-      <w:pPr>
-        <w:pStyle w:val="Text"/>
-        <w:ind w:firstLine="144"/>
-      </w:pPr>
-    </w:p>
-    <w:p>
-      <w:pPr>
-        <w:pStyle w:val="Heading1"/>
-      </w:pPr>
-      <w:r>
-        <w:t>Submitting Your P</w:t>
-      </w:r>
-      <w:r>
-        <w:t>aper for Review</w:t>
-      </w:r>
-    </w:p>
-    <w:p>
-      <w:pPr>
-        <w:pStyle w:val="Heading2"/>
-      </w:pPr>
-      <w:r>
-        <w:t xml:space="preserve">Review Stage </w:t>
-      </w:r>
-      <w:r>
-        <w:t>Using Word 6.</w:t>
-      </w:r>
-      <w:r>
-        <w:t>0</w:t>
-      </w:r>
-      <w:r>
-        <w:t xml:space="preserve"> or Higher</w:t>
-      </w:r>
-    </w:p>
-    <w:p>
-      <w:pPr>
-        <w:pStyle w:val="Text"/>
-      </w:pPr>
-      <w:r>
-        <w:t>If you want to submit your file with one column electronically, please do the following:</w:t>
-      </w:r>
-    </w:p>
-    <w:p>
-      <w:pPr>
-        <w:pStyle w:val="Text"/>
-      </w:pPr>
-      <w:r>
-        <w:tab/>
-        <w:t>--First, click on the View menu and choose Print Layout.</w:t>
-      </w:r>
-    </w:p>
-    <w:p>
-      <w:pPr>
-        <w:pStyle w:val="Text"/>
-      </w:pPr>
-      <w:r>
-        <w:tab/>
-        <w:t>--Second, place your cursor in the first paragraph. Go to the Format menu, choose Columns, choose one column Layout, and choose “apply to whole document” from the dropdown menu.</w:t>
-      </w:r>
-    </w:p>
-    <w:p>
-      <w:pPr>
-        <w:pStyle w:val="Text"/>
-      </w:pPr>
-      <w:r>
-        <w:tab/>
-        <w:t>--Third, click and drag the right margin bar to just over 4 inches in width.</w:t>
-      </w:r>
-    </w:p>
-    <w:p>
-      <w:pPr>
-        <w:pStyle w:val="Text"/>
-      </w:pPr>
-      <w:r>
-        <w:t>The graphics will stay in the “second” column, but you can drag them to the first column. Make the graphic wider to push out any text that may try to fill in next to the graphic.</w:t>
-      </w:r>
-    </w:p>
-    <w:p>
-      <w:pPr>
-        <w:pStyle w:val="Heading2"/>
-      </w:pPr>
-      <w:r>
-        <w:t xml:space="preserve">Final Stage </w:t>
-      </w:r>
-      <w:r>
-        <w:t>Using Word 6.0</w:t>
-      </w:r>
-    </w:p>
-    <w:p>
-      <w:pPr>
-        <w:pStyle w:val="Text"/>
-      </w:pPr>
-      <w:r>
-        <w:t xml:space="preserve">When you submit your final version (after your paper has been accepted), print it in two-column format, including figures and tables. You must also send your final manuscript on a disk, via e-mail, or through a Web manuscript submission system as directed by the society contact. You may use </w:t>
-      </w:r>
-      <w:r>
-        <w:rPr>
-          <w:i/>
-          <w:iCs/>
-        </w:rPr>
-        <w:t>Zip</w:t>
-      </w:r>
-      <w:r>
-        <w:t xml:space="preserve"> </w:t>
-      </w:r>
-      <w:r>
-        <w:t xml:space="preserve">for large files, or compress files using </w:t>
-      </w:r>
-      <w:r>
-        <w:rPr>
-          <w:i/>
-          <w:iCs/>
-        </w:rPr>
-        <w:t>Compress, Pkzip, Stuffit,</w:t>
-      </w:r>
-      <w:r>
-        <w:t xml:space="preserve"> or </w:t>
-      </w:r>
-      <w:r>
-        <w:rPr>
-          <w:i/>
-          <w:iCs/>
-        </w:rPr>
-        <w:t>Gzip.</w:t>
-      </w:r>
-      <w:r>
-        <w:t xml:space="preserve"> </w:t>
-      </w:r>
-    </w:p>
-    <w:p>
-      <w:pPr>
-        <w:pStyle w:val="Text"/>
-      </w:pPr>
-      <w:r>
-        <w:t>Also, send a sheet of paper or PDF with complete contact information for all authors. Include full mailing addresses, telephone numbers, fax numbers, and e-mail addresses. This information will be used to send each author a complimentary copy of the journal in which the paper appears. In addition, designate one author as the “corresponding author.” This is the author to whom proofs of the paper will be sent. Proofs are sent to the corresponding author only.</w:t>
-      </w:r>
-    </w:p>
-    <w:p>
-      <w:pPr>
-        <w:pStyle w:val="Heading2"/>
-      </w:pPr>
-      <w:r>
-        <w:t xml:space="preserve">Review Stage </w:t>
-      </w:r>
-      <w:r>
-        <w:t xml:space="preserve">Using </w:t>
-      </w:r>
-      <w:r>
-        <w:t>ScholarOne</w:t>
-      </w:r>
-      <w:r>
-        <w:rPr>
-          <w:color w:val="000000"/>
-          <w:vertAlign w:val="superscript"/>
-        </w:rPr>
-        <w:t>®</w:t>
-      </w:r>
-      <w:r>
-        <w:t xml:space="preserve"> </w:t>
-      </w:r>
-      <w:r>
-        <w:t>Manuscripts</w:t>
-      </w:r>
-    </w:p>
-    <w:p>
-      <w:pPr>
-        <w:tabs>
-          <w:tab w:val="left" w:pos="360"/>
-        </w:tabs>
-        <w:autoSpaceDE w:val="0"/>
-        <w:autoSpaceDN w:val="0"/>
-        <w:adjustRightInd w:val="0"/>
-        <w:ind w:firstLine="360"/>
-        <w:jc w:val="both"/>
-        <w:rPr>
-          <w:color w:val="000000"/>
-        </w:rPr>
-      </w:pPr>
-      <w:r>
-        <w:rPr>
-          <w:color w:val="000000"/>
-        </w:rPr>
-        <w:t xml:space="preserve">Contributions to the </w:t>
-      </w:r>
-      <w:r>
-        <w:rPr>
-          <w:color w:val="000000"/>
-        </w:rPr>
-        <w:t>Transactions</w:t>
-      </w:r>
-      <w:r>
-        <w:rPr>
-          <w:color w:val="000000"/>
-        </w:rPr>
-        <w:t>,</w:t>
-      </w:r>
-      <w:r>
-        <w:rPr>
-          <w:color w:val="000000"/>
-        </w:rPr>
-        <w:t xml:space="preserve"> </w:t>
-      </w:r>
-      <w:r>
-        <w:rPr>
-          <w:color w:val="000000"/>
-        </w:rPr>
-        <w:t>Journals</w:t>
-      </w:r>
-      <w:r>
-        <w:rPr>
-          <w:color w:val="000000"/>
-        </w:rPr>
-        <w:t xml:space="preserve">, and </w:t>
-      </w:r>
-      <w:r>
-        <w:rPr>
-          <w:color w:val="000000"/>
-        </w:rPr>
-        <w:t>Letters</w:t>
-      </w:r>
-      <w:r>
-        <w:rPr>
-          <w:color w:val="000000"/>
-        </w:rPr>
-        <w:t xml:space="preserve"> may be submitted electronically on IEEE’s on-line manuscript submission and peer-review system, ScholarOne</w:t>
-      </w:r>
-      <w:r>
-        <w:rPr>
-          <w:color w:val="000000"/>
-          <w:vertAlign w:val="superscript"/>
-        </w:rPr>
-        <w:t>®</w:t>
-      </w:r>
-      <w:r>
-        <w:rPr>
-          <w:color w:val="000000"/>
-        </w:rPr>
-        <w:t xml:space="preserve"> Manuscripts. </w:t>
-      </w:r>
-      <w:r>
-        <w:rPr>
-          <w:color w:val="000000"/>
-        </w:rPr>
-        <w:t xml:space="preserve"> You can get a listing of the publications that participate in </w:t>
-      </w:r>
-      <w:r>
-        <w:rPr>
-          <w:color w:val="000000"/>
-        </w:rPr>
-        <w:t>ScholarOne</w:t>
-      </w:r>
-      <w:r>
-        <w:rPr>
-          <w:color w:val="000000"/>
-          <w:vertAlign w:val="superscript"/>
-        </w:rPr>
-        <w:t xml:space="preserve"> </w:t>
-      </w:r>
-      <w:r>
-        <w:rPr>
-          <w:color w:val="000000"/>
-        </w:rPr>
-        <w:t>at</w:t>
-      </w:r>
-    </w:p>
-    <w:p>
-      <w:pPr>
-        <w:tabs>
-          <w:tab w:val="left" w:pos="360"/>
-        </w:tabs>
-        <w:autoSpaceDE w:val="0"/>
-        <w:autoSpaceDN w:val="0"/>
-        <w:adjustRightInd w:val="0"/>
-        <w:jc w:val="both"/>
-        <w:rPr>
-          <w:color w:val="000000"/>
-        </w:rPr>
-      </w:pPr>
-      <w:hyperlink r:id="rId15" w:history="1">
-        <w:r>
-          <w:rPr>
-            <w:rStyle w:val="Hyperlink"/>
-          </w:rPr>
-          <w:t>http://www.ieee.org/publications_standards/publications/authors/authors_submission.html</w:t>
-        </w:r>
-      </w:hyperlink>
-      <w:r>
-        <w:rPr>
-          <w:color w:val="000000"/>
-        </w:rPr>
-        <w:t xml:space="preserve"> </w:t>
-      </w:r>
-      <w:r>
-        <w:rPr>
-          <w:color w:val="000000"/>
-        </w:rPr>
-        <w:t xml:space="preserve">First check if you have an existing account. If there is none, please create a new account. After logging in, go to your Author Center and click “Submit First Draft of a New Manuscript.” </w:t>
-      </w:r>
-    </w:p>
-    <w:p>
-      <w:pPr>
-        <w:tabs>
-          <w:tab w:val="left" w:pos="360"/>
-        </w:tabs>
-        <w:autoSpaceDE w:val="0"/>
-        <w:autoSpaceDN w:val="0"/>
-        <w:adjustRightInd w:val="0"/>
-        <w:ind w:firstLine="360"/>
-        <w:jc w:val="both"/>
-        <w:rPr>
-          <w:color w:val="000000"/>
-        </w:rPr>
-      </w:pPr>
-      <w:r>
-        <w:rPr>
-          <w:color w:val="000000"/>
-        </w:rPr>
-        <w:t>Along with other information, you will be asked to select the subject from a pull-down list. Depending on the journal, there are various steps to the submission process; you must complete all steps for a complete submission. At the end of each step you must click “Save and Continue”; just uploading the paper is not sufficient. After the last step, you should see a confirmation that the submission is complete. You should also receive an e-mail confirmation. For inquiries regarding the submission of your paper on ScholarOne Manuscripts, please contact oprs-support@ieee.org or call +1 732 465 5861.</w:t>
-      </w:r>
-    </w:p>
-    <w:p>
-      <w:pPr>
-        <w:tabs>
-          <w:tab w:val="left" w:pos="360"/>
-        </w:tabs>
-        <w:autoSpaceDE w:val="0"/>
-        <w:autoSpaceDN w:val="0"/>
-        <w:adjustRightInd w:val="0"/>
-        <w:ind w:firstLine="360"/>
-        <w:jc w:val="both"/>
-      </w:pPr>
-      <w:r>
-        <w:t xml:space="preserve">ScholarOne Manuscripts will accept files for review in various formats.  Please check the guidelines of the specific journal for which you plan to submit.  </w:t>
-      </w:r>
-    </w:p>
-    <w:p>
-      <w:pPr>
-        <w:tabs>
-          <w:tab w:val="left" w:pos="360"/>
-        </w:tabs>
-        <w:autoSpaceDE w:val="0"/>
-        <w:autoSpaceDN w:val="0"/>
-        <w:adjustRightInd w:val="0"/>
-        <w:ind w:firstLine="360"/>
-        <w:jc w:val="both"/>
-      </w:pPr>
-      <w:r>
-        <w:t xml:space="preserve">You will be asked to file an electronic copyright form immediately upon completing the submission process (authors are responsible for obtaining any security clearances). Failure to submit the electronic copyright could result in publishing delays later.  You will also have the opportunity to designate your article as “open access” if you agree to pay the IEEE open access fee. </w:t>
-      </w:r>
-    </w:p>
-    <w:p/>
-    <w:p>
-      <w:pPr>
-        <w:pStyle w:val="Heading2"/>
-      </w:pPr>
-      <w:r>
-        <w:t xml:space="preserve">Final Stage Using ScholarOne </w:t>
-      </w:r>
-      <w:r>
-        <w:t xml:space="preserve"> </w:t>
-      </w:r>
-      <w:r>
-        <w:t>Manuscripts</w:t>
-      </w:r>
-    </w:p>
-    <w:p>
-      <w:pPr>
-        <w:tabs>
-          <w:tab w:val="left" w:pos="360"/>
-        </w:tabs>
-        <w:autoSpaceDE w:val="0"/>
-        <w:autoSpaceDN w:val="0"/>
-        <w:adjustRightInd w:val="0"/>
-        <w:ind w:firstLine="360"/>
-        <w:jc w:val="both"/>
-      </w:pPr>
-      <w:r>
-        <w:t xml:space="preserve">Upon acceptance, you will receive an email with specific instructions regarding the submission of your final files.  To avoid any delays in publication, please be sure to follow these instructions.  Most journals require that final submissions be uploaded through ScholarOne Manuscripts, although some may still accept final submissions via email.  Final submissions </w:t>
-      </w:r>
-      <w:r>
-        <w:lastRenderedPageBreak/>
-        <w:t xml:space="preserve">should include source files of your accepted manuscript, high quality graphic files, and a formatted pdf file.  If you have any questions regarding the final submission process, please contact the administrative contact for the journal. </w:t>
-      </w:r>
-    </w:p>
-    <w:p>
-      <w:pPr>
-        <w:tabs>
-          <w:tab w:val="left" w:pos="360"/>
-        </w:tabs>
-        <w:autoSpaceDE w:val="0"/>
-        <w:autoSpaceDN w:val="0"/>
-        <w:adjustRightInd w:val="0"/>
-        <w:ind w:firstLine="360"/>
-        <w:jc w:val="both"/>
-        <w:rPr>
-          <w:color w:val="000000"/>
-        </w:rPr>
-      </w:pPr>
-      <w:r>
-        <w:rPr>
-          <w:color w:val="FF0000"/>
-        </w:rPr>
-        <w:t xml:space="preserve"> </w:t>
-      </w:r>
-      <w:r>
-        <w:rPr>
-          <w:color w:val="000000"/>
-        </w:rPr>
-        <w:t xml:space="preserve">In addition to this, upload a file with complete contact information for all authors. Include full mailing addresses, telephone numbers, fax numbers, and e-mail addresses. Designate the author who submitted the manuscript on ScholarOne Manuscripts as the “corresponding author.” This is the only author to whom proofs of the paper will be sent. </w:t>
-      </w:r>
-    </w:p>
-    <w:p>
-      <w:pPr>
         <w:pStyle w:val="Text"/>
       </w:pPr>
       <w:r>
@@ -3835,120 +1257,6 @@
           <w:color w:val="000000"/>
         </w:rPr>
         <w:br/>
-      </w:r>
-    </w:p>
-    <w:p>
-      <w:pPr>
-        <w:pStyle w:val="Heading2"/>
-      </w:pPr>
-      <w:r>
-        <w:t>Copyright Form</w:t>
-      </w:r>
-    </w:p>
-    <w:p>
-      <w:pPr>
-        <w:pStyle w:val="Text"/>
-        <w:rPr>
-          <w:color w:val="222222"/>
-          <w:shd w:val="clear" w:color="auto" w:fill="FFFFFF"/>
-        </w:rPr>
-      </w:pPr>
-      <w:r>
-        <w:rPr>
-          <w:color w:val="222222"/>
-          <w:shd w:val="clear" w:color="auto" w:fill="FFFFFF"/>
-        </w:rPr>
-        <w:t xml:space="preserve">Authors must submit an electronic IEEE Copyright Form (eCF) upon submitting their final manuscript files.  </w:t>
-      </w:r>
-      <w:r>
-        <w:rPr>
-          <w:color w:val="222222"/>
-          <w:shd w:val="clear" w:color="auto" w:fill="FFFFFF"/>
-        </w:rPr>
-        <w:t>You</w:t>
-      </w:r>
-      <w:r>
-        <w:rPr>
-          <w:color w:val="222222"/>
-          <w:shd w:val="clear" w:color="auto" w:fill="FFFFFF"/>
-        </w:rPr>
-        <w:t xml:space="preserve"> can a</w:t>
-      </w:r>
-      <w:r>
-        <w:rPr>
-          <w:color w:val="222222"/>
-          <w:shd w:val="clear" w:color="auto" w:fill="FFFFFF"/>
-        </w:rPr>
-        <w:t>ccess the eCF system through your</w:t>
-      </w:r>
-      <w:r>
-        <w:rPr>
-          <w:color w:val="222222"/>
-          <w:shd w:val="clear" w:color="auto" w:fill="FFFFFF"/>
-        </w:rPr>
-        <w:t xml:space="preserve"> manuscript submission system or through the Author Gateway.</w:t>
-      </w:r>
-      <w:r>
-        <w:rPr>
-          <w:color w:val="222222"/>
-          <w:shd w:val="clear" w:color="auto" w:fill="FFFFFF"/>
-        </w:rPr>
-        <w:t xml:space="preserve"> </w:t>
-      </w:r>
-      <w:r>
-        <w:rPr>
-          <w:color w:val="222222"/>
-          <w:shd w:val="clear" w:color="auto" w:fill="FFFFFF"/>
-        </w:rPr>
-        <w:t>You</w:t>
-      </w:r>
-      <w:r>
-        <w:rPr>
-          <w:color w:val="222222"/>
-          <w:shd w:val="clear" w:color="auto" w:fill="FFFFFF"/>
-        </w:rPr>
-        <w:t xml:space="preserve"> are responsible for obtaining any necessary approvals and/or security clearances.</w:t>
-      </w:r>
-      <w:r>
-        <w:rPr>
-          <w:color w:val="222222"/>
-          <w:shd w:val="clear" w:color="auto" w:fill="FFFFFF"/>
-        </w:rPr>
-        <w:t xml:space="preserve"> For additional information on intellectual property rights, visit the IEEE Intellectual Property Rights department web page at </w:t>
-      </w:r>
-    </w:p>
-    <w:p>
-      <w:pPr>
-        <w:pStyle w:val="Text"/>
-        <w:ind w:firstLine="0"/>
-      </w:pPr>
-      <w:hyperlink r:id="rId16" w:history="1">
-        <w:r>
-          <w:rPr>
-            <w:rStyle w:val="Hyperlink"/>
-            <w:shd w:val="clear" w:color="auto" w:fill="FFFFFF"/>
-          </w:rPr>
-          <w:t>http://www.ieee.org/publications_standards/publications/rights/index.html</w:t>
-        </w:r>
-      </w:hyperlink>
-      <w:r>
-        <w:rPr>
-          <w:color w:val="222222"/>
-          <w:shd w:val="clear" w:color="auto" w:fill="FFFFFF"/>
-        </w:rPr>
-        <w:t xml:space="preserve">. </w:t>
-      </w:r>
-    </w:p>
-    <w:p>
-      <w:pPr>
-        <w:pStyle w:val="Text"/>
-      </w:pPr>
-      <w:r>
-        <w:rPr>
-          <w:color w:val="222222"/>
-          <w:shd w:val="clear" w:color="auto" w:fill="FFFFFF"/>
-        </w:rPr>
-        <w:t>are required for every article submitted for peer review.</w:t>
       </w:r>
     </w:p>
     <w:p>
@@ -4037,7 +1345,31 @@
         <w:pStyle w:val="References"/>
       </w:pPr>
       <w:r>
-        <w:t>M. BinJubier, M. A. Ismail, E. H. Tusher, and M. Aljanabi, “A GPU Accelerated Parallel Genetic Algorithm for the Traveling Salesman Problem,” Journal of Soft Computing and Data Mining, vol. 5, no. 2, pp. 137–150, 2024, doi: 10.30880/jscdm.2024.05.02.010.</w:t>
+        <w:t xml:space="preserve">M. </w:t>
+      </w:r>
+      <w:proofErr w:type="spellStart"/>
+      <w:r>
+        <w:t>BinJubier</w:t>
+      </w:r>
+      <w:proofErr w:type="spellEnd"/>
+      <w:r>
+        <w:t xml:space="preserve">, M. A. Ismail, E. H. </w:t>
+      </w:r>
+      <w:proofErr w:type="spellStart"/>
+      <w:r>
+        <w:t>Tusher</w:t>
+      </w:r>
+      <w:proofErr w:type="spellEnd"/>
+      <w:r>
+        <w:t xml:space="preserve">, and M. Aljanabi, “A GPU Accelerated Parallel Genetic Algorithm for the Traveling Salesman Problem,” Journal of Soft Computing and Data Mining, vol. 5, no. 2, pp. 137–150, 2024, </w:t>
+      </w:r>
+      <w:proofErr w:type="spellStart"/>
+      <w:r>
+        <w:t>doi</w:t>
+      </w:r>
+      <w:proofErr w:type="spellEnd"/>
+      <w:r>
+        <w:t>: 10.30880/jscdm.2024.05.02.010.</w:t>
       </w:r>
     </w:p>
     <w:p>
@@ -4045,7 +1377,31 @@
         <w:pStyle w:val="References"/>
       </w:pPr>
       <w:r>
-        <w:t>W.-B. Qiao, J.-C. Créput, N. Wang, K. Meng, and A. Mansouri, “Breaking TSP Local Search Barriers: Scalable Multi-GPU Parallelisation of 4-opt, 5-opt, 6-opt and Hybrid Variable λ-opt,” Expert Systems With Applications, vol. 296, Art. no. 129110, 2026, doi: 10.1016/j.eswa.2025.129110.</w:t>
+        <w:t xml:space="preserve">W.-B. Qiao, J.-C. </w:t>
+      </w:r>
+      <w:proofErr w:type="spellStart"/>
+      <w:r>
+        <w:t>Créput</w:t>
+      </w:r>
+      <w:proofErr w:type="spellEnd"/>
+      <w:r>
+        <w:t xml:space="preserve">, N. Wang, K. Meng, and A. Mansouri, “Breaking TSP Local Search Barriers: Scalable Multi-GPU </w:t>
+      </w:r>
+      <w:proofErr w:type="spellStart"/>
+      <w:r>
+        <w:t>Parallelisation</w:t>
+      </w:r>
+      <w:proofErr w:type="spellEnd"/>
+      <w:r>
+        <w:t xml:space="preserve"> of 4-opt, 5-opt, 6-opt and Hybrid Variable λ-opt,” Expert Systems With Applications, vol. 296, Art. no. 129110, 2026, </w:t>
+      </w:r>
+      <w:proofErr w:type="spellStart"/>
+      <w:r>
+        <w:t>doi</w:t>
+      </w:r>
+      <w:proofErr w:type="spellEnd"/>
+      <w:r>
+        <w:t>: 10.1016/j.eswa.2025.129110.</w:t>
       </w:r>
       <w:r>
         <w:t>G.</w:t>
@@ -4454,7 +1810,7 @@
           <w:szCs w:val="20"/>
         </w:rPr>
         <w:sectPr>
-          <w:headerReference w:type="default" r:id="rId17"/>
+          <w:headerReference w:type="default" r:id="rId8"/>
           <w:type w:val="continuous"/>
           <w:pgSz w:w="12240" w:h="15840" w:code="1"/>
           <w:pgMar w:top="1008" w:right="936" w:bottom="1008" w:left="936" w:header="432" w:footer="432" w:gutter="0"/>
@@ -4527,13 +1883,13 @@
         <w:pStyle w:val="FootnoteText"/>
       </w:pPr>
       <w:r>
-        <w:t xml:space="preserve">The </w:t>
-      </w:r>
-      <w:r>
-        <w:t>paragraph here</w:t>
-      </w:r>
-      <w:r>
-        <w:t xml:space="preserve"> should contain the authors’ current affiliations, including current address and e-mail. For example, F. A. Author is with the National Institute of Standards and Technology, Boulder, CO 80305 USA (e-mail: author@ boulder.nist.gov). </w:t>
+        <w:t xml:space="preserve">Christopher Rumsey is a graduate student with the Department of Electrical and Computer Engineering, University of Arizona </w:t>
+      </w:r>
+      <w:r>
+        <w:t>1013 E University Blvd, Tucson, AZ 85721</w:t>
+      </w:r>
+      <w:r>
+        <w:t xml:space="preserve"> (email: Rumsey@arizona.edu)</w:t>
       </w:r>
     </w:p>
     <w:p>
@@ -4541,32 +1897,25 @@
         <w:pStyle w:val="FootnoteText"/>
       </w:pPr>
       <w:r>
-        <w:t>S. B. Author, Jr., was with Rice University, Houston, TX 77005 USA. He is now with the Department of Physics, Colorado State University, Fort Collins, CO 80523 USA (e-mail: author@lamar.colostate.edu).</w:t>
+        <w:t xml:space="preserve">Christopher Rumsey is a graduate student with the Department of Electrical and Computer Engineering, University of Arizona </w:t>
+      </w:r>
+      <w:r>
+        <w:t>1013 E University Blvd, Tucson, AZ 85721</w:t>
+      </w:r>
+      <w:r>
+        <w:t xml:space="preserve"> (email:</w:t>
+      </w:r>
+      <w:r>
+        <w:t xml:space="preserve"> JoelMaldonado</w:t>
+      </w:r>
+      <w:r>
+        <w:t>@arizona.edu)</w:t>
       </w:r>
     </w:p>
     <w:p>
       <w:pPr>
         <w:pStyle w:val="FootnoteText"/>
       </w:pPr>
-      <w:r>
-        <w:t>T. C. Author is with the Electrical Engineering Department, University of Colorado, Boulder, CO 80309 USA, on leave from the National Research Institute for Metals, Tsukuba, Japan (e-mail: author@nrim.go.jp).</w:t>
-      </w:r>
-    </w:p>
-  </w:footnote>
-  <w:footnote w:id="2">
-    <w:p>
-      <w:pPr>
-        <w:pStyle w:val="FootnoteText"/>
-      </w:pPr>
-      <w:r>
-        <w:rPr>
-          <w:rStyle w:val="FootnoteReference"/>
-        </w:rPr>
-        <w:footnoteRef/>
-      </w:r>
-      <w:r>
-        <w:t>It is recommended that footnotes be avoided (except for the unnumbered footnote with the receipt date on the first page). Instead, try to integrate the footnote information into the text.</w:t>
-      </w:r>
     </w:p>
   </w:footnote>
 </w:footnotes>

</xml_diff>